<commit_message>
feat: base de datos para mostrar y avances en documento
</commit_message>
<xml_diff>
--- a/docs/word/Jorge Doicela - Tesis.docx
+++ b/docs/word/Jorge Doicela - Tesis.docx
@@ -2388,25 +2388,934 @@
         <w:t>MARCO TEÓRICO</w:t>
       </w:r>
     </w:p>
-    <w:p/>
-    <w:p/>
-    <w:p/>
-    <w:p/>
-    <w:p/>
-    <w:p/>
-    <w:p/>
-    <w:p/>
-    <w:p/>
-    <w:p/>
-    <w:p/>
-    <w:p/>
-    <w:p/>
-    <w:p/>
-    <w:p/>
-    <w:p/>
-    <w:p/>
-    <w:p/>
-    <w:p/>
+    <w:p xmlns:w="http://schemas.openxmlformats.org/wordprocessingml/2006/main">
+      <w:pPr>
+        <w:pStyle w:val="Ttulo2"/>
+        <w:spacing w:before="240" w:after="120"/>
+        <w:jc w:val="left"/>
+      </w:pPr>
+      <w:r>
+        <w:rPr>
+          <w:rFonts w:ascii="Times New Roman" w:hAnsi="Times New Roman"/>
+          <w:b/>
+          <w:sz w:val="26"/>
+          <w:color w:val="000000"/>
+        </w:rPr>
+        <w:t>1.1. Fundamentos de la Planificación Curricular en la Educación Superior Técnica y Tecnológica</w:t>
+      </w:r>
+    </w:p>
+    <w:p xmlns:w="http://schemas.openxmlformats.org/wordprocessingml/2006/main">
+      <w:pPr>
+        <w:pStyle w:val="Ttulo3"/>
+        <w:spacing w:before="180" w:after="60"/>
+        <w:jc w:val="left"/>
+      </w:pPr>
+      <w:r>
+        <w:rPr>
+          <w:rFonts w:ascii="Times New Roman" w:hAnsi="Times New Roman"/>
+          <w:b/>
+          <w:i/>
+          <w:sz w:val="24"/>
+          <w:color w:val="000000"/>
+        </w:rPr>
+        <w:t>1.1.1. Marco Normativo de la Educación Superior en el Ecuador</w:t>
+      </w:r>
+    </w:p>
+    <w:p xmlns:w="http://schemas.openxmlformats.org/wordprocessingml/2006/main">
+      <w:pPr>
+        <w:pStyle w:val="Normal"/>
+        <w:spacing w:before="120" w:after="120" w:line="480" w:lineRule="auto"/>
+        <w:ind w:firstLine="720"/>
+        <w:jc w:val="both"/>
+      </w:pPr>
+      <w:r>
+        <w:rPr>
+          <w:rFonts w:ascii="Times New Roman" w:hAnsi="Times New Roman"/>
+          <w:sz w:val="24"/>
+        </w:rPr>
+        <w:t xml:space="preserve">La educación superior técnica y tecnológica en el Ecuador opera bajo un marco legal estructurado primordialmente por la Ley Orgánica de Educación Superior (LOES), el Reglamento de Régimen Académico (RRA) codificado por el Consejo de Educación Superior (CES) y los modelos de evaluación institucional y de carreras formulados por el Consejo de Aseguramiento de la Calidad de la Educación Superior (CACES). Este andamiaje jurídico establece que las instituciones de educación superior tienen la obligación de garantizar la pertinencia, calidad y coherencia epistemológica de sus programas formativos, articulando la formación teórica con el entorno productivo y social.</w:t>
+      </w:r>
+    </w:p>
+    <w:p xmlns:w="http://schemas.openxmlformats.org/wordprocessingml/2006/main">
+      <w:pPr>
+        <w:pStyle w:val="Normal"/>
+        <w:spacing w:before="120" w:after="120" w:line="480" w:lineRule="auto"/>
+        <w:ind w:firstLine="720"/>
+        <w:jc w:val="both"/>
+      </w:pPr>
+      <w:r>
+        <w:rPr>
+          <w:rFonts w:ascii="Times New Roman" w:hAnsi="Times New Roman"/>
+          <w:sz w:val="24"/>
+        </w:rPr>
+        <w:t xml:space="preserve">En este contexto normativo, el Reglamento de Régimen Académico del CES define las directrices obligatorias para el diseño curricular, la distribución horaria, los campos de estudio y los mecanismos de evaluación de los aprendizajes. Cada carrera técnica y tecnológica debe plasmar su diseño curricular en mallas aprobadas formalmente por el CES, las cuales definen las asignaturas, sus prerrequisitos y correquisitos, y la asignación exacta de horas por componente de formación, constituyéndose en el parámetro basal que rige la docencia institucional.</w:t>
+      </w:r>
+    </w:p>
+    <w:p xmlns:w="http://schemas.openxmlformats.org/wordprocessingml/2006/main">
+      <w:pPr>
+        <w:pStyle w:val="Ttulo3"/>
+        <w:spacing w:before="180" w:after="60"/>
+        <w:jc w:val="left"/>
+      </w:pPr>
+      <w:r>
+        <w:rPr>
+          <w:rFonts w:ascii="Times New Roman" w:hAnsi="Times New Roman"/>
+          <w:b/>
+          <w:i/>
+          <w:sz w:val="24"/>
+          <w:color w:val="000000"/>
+        </w:rPr>
+        <w:t>1.1.2. El Programa de Estudio de la Asignatura (PEA) como Instrumento Microcurricular</w:t>
+      </w:r>
+    </w:p>
+    <w:p xmlns:w="http://schemas.openxmlformats.org/wordprocessingml/2006/main">
+      <w:pPr>
+        <w:pStyle w:val="Normal"/>
+        <w:spacing w:before="120" w:after="120" w:line="480" w:lineRule="auto"/>
+        <w:ind w:firstLine="720"/>
+        <w:jc w:val="both"/>
+      </w:pPr>
+      <w:r>
+        <w:rPr>
+          <w:rFonts w:ascii="Times New Roman" w:hAnsi="Times New Roman"/>
+          <w:sz w:val="24"/>
+        </w:rPr>
+        <w:t xml:space="preserve">El Programa de Estudio de la Asignatura (PEA) representa el instrumento microcurricular oficial mediante el cual el docente titular y el equipo de cátedra planifican, estructuran y comunican a la comunidad académica la totalidad de contenidos, resultados de aprendizaje esperados, estrategias pedagógicas, recursos didácticos y sistemas de evaluación de una asignatura durante un período académico ordinario (PAO).</w:t>
+      </w:r>
+    </w:p>
+    <w:p xmlns:w="http://schemas.openxmlformats.org/wordprocessingml/2006/main">
+      <w:pPr>
+        <w:pStyle w:val="Normal"/>
+        <w:spacing w:before="120" w:after="120" w:line="480" w:lineRule="auto"/>
+        <w:ind w:firstLine="720"/>
+        <w:jc w:val="both"/>
+      </w:pPr>
+      <w:r>
+        <w:rPr>
+          <w:rFonts w:ascii="Times New Roman" w:hAnsi="Times New Roman"/>
+          <w:sz w:val="24"/>
+        </w:rPr>
+        <w:t xml:space="preserve">En el Instituto Superior Tecnológico Mayor Pedro Traversari (ISTPET), el formato oficial del PEA se encuentra normalizado en once secciones institucionales obligatorias (denominadas formalmente de la sección 'a' a la sección 'k'). Estas secciones abarcan desde los datos generales y la caracterización de la carga horaria, pasando por los objetivos, resultados de aprendizaje articulados con el perfil de egreso, distribución modular de unidades temáticas y subtemas, formulación de actividades de aprendizaje práctico-experimental (APE), sistemas de evaluación cuantitativa sobre diez puntos, hasta la bibliografía básica y complementaria bajo normas APA y el circuito de firmas institucionales de responsabilidad legal.</w:t>
+      </w:r>
+    </w:p>
+    <w:p xmlns:w="http://schemas.openxmlformats.org/wordprocessingml/2006/main">
+      <w:pPr>
+        <w:pStyle w:val="Ttulo3"/>
+        <w:spacing w:before="180" w:after="60"/>
+        <w:jc w:val="left"/>
+      </w:pPr>
+      <w:r>
+        <w:rPr>
+          <w:rFonts w:ascii="Times New Roman" w:hAnsi="Times New Roman"/>
+          <w:b/>
+          <w:i/>
+          <w:sz w:val="24"/>
+          <w:color w:val="000000"/>
+        </w:rPr>
+        <w:t>1.1.3. Componentes de la Organización del Aprendizaje y Régimen de Créditos</w:t>
+      </w:r>
+    </w:p>
+    <w:p xmlns:w="http://schemas.openxmlformats.org/wordprocessingml/2006/main">
+      <w:pPr>
+        <w:pStyle w:val="Normal"/>
+        <w:spacing w:before="120" w:after="120" w:line="480" w:lineRule="auto"/>
+        <w:ind w:firstLine="720"/>
+        <w:jc w:val="both"/>
+      </w:pPr>
+      <w:r>
+        <w:rPr>
+          <w:rFonts w:ascii="Times New Roman" w:hAnsi="Times New Roman"/>
+          <w:sz w:val="24"/>
+        </w:rPr>
+        <w:t xml:space="preserve">Conforme a lo dispuesto en el Artículo 21 del Reglamento de Régimen Académico del CES, la organización del aprendizaje en la educación superior se estructura rigurosamente en tres componentes complementarios: Componente de Docencia (CD), Componente de Prácticas de Aplicación y Experimentación de los Aprendizajes (APE) y Componente de Aprendizaje Autónomo (AA).</w:t>
+      </w:r>
+    </w:p>
+    <w:p xmlns:w="http://schemas.openxmlformats.org/wordprocessingml/2006/main">
+      <w:pPr>
+        <w:pStyle w:val="Normal"/>
+        <w:spacing w:before="120" w:after="120" w:line="480" w:lineRule="auto"/>
+        <w:ind w:firstLine="720"/>
+        <w:jc w:val="both"/>
+      </w:pPr>
+      <w:r>
+        <w:rPr>
+          <w:rFonts w:ascii="Times New Roman" w:hAnsi="Times New Roman"/>
+          <w:sz w:val="24"/>
+        </w:rPr>
+        <w:t xml:space="preserve">El Componente de Docencia (CD) corresponde a las horas de interacción pedagógica directa y sincrónica entre el profesor y los estudiantes, orientadas a la conceptualización, debate y análisis guiado. El Componente de Prácticas de Aplicación y Experimentación (APE) comprende las actividades desarrolladas en laboratorios, talleres, entornos de simulación o prácticas de campo, orientadas al saber hacer procedimental. Por su parte, el Componente de Aprendizaje Autónomo (AA) engloba las horas de estudio independiente, investigación documental, resolución de ejercicios y elaboración de proyectos que el estudiante ejecuta sin intervención docente directa.</w:t>
+      </w:r>
+    </w:p>
+    <w:p xmlns:w="http://schemas.openxmlformats.org/wordprocessingml/2006/main">
+      <w:pPr>
+        <w:pStyle w:val="Normal"/>
+        <w:spacing w:before="120" w:after="120" w:line="480" w:lineRule="auto"/>
+        <w:ind w:firstLine="720"/>
+        <w:jc w:val="both"/>
+      </w:pPr>
+      <w:r>
+        <w:rPr>
+          <w:rFonts w:ascii="Times New Roman" w:hAnsi="Times New Roman"/>
+          <w:sz w:val="24"/>
+        </w:rPr>
+        <w:t xml:space="preserve">La normativa ecuatoriana establece que un crédito académico equivale de manera invariable a 48 horas de trabajo total del estudiante, distribuidas equitativamente entre los tres componentes señalados. En consecuencia, cualquier herramienta informática destinada a la gestión curricular debe implementar reglas matemáticas deterministas que verifiquen que la sumatoria horaria de las unidades y prácticas planificadas coincida exactamente con las horas normadas en la malla curricular institucional, evitando inconsistencias durante los procesos de auditoría académica.</w:t>
+      </w:r>
+    </w:p>
+    <w:p xmlns:w="http://schemas.openxmlformats.org/wordprocessingml/2006/main">
+      <w:pPr>
+        <w:pStyle w:val="Ttulo3"/>
+        <w:spacing w:before="180" w:after="60"/>
+        <w:jc w:val="left"/>
+      </w:pPr>
+      <w:r>
+        <w:rPr>
+          <w:rFonts w:ascii="Times New Roman" w:hAnsi="Times New Roman"/>
+          <w:b/>
+          <w:i/>
+          <w:sz w:val="24"/>
+          <w:color w:val="000000"/>
+        </w:rPr>
+        <w:t>1.1.4. Modelo de Evaluación Externa y Aseguramiento de la Calidad (CACES)</w:t>
+      </w:r>
+    </w:p>
+    <w:p xmlns:w="http://schemas.openxmlformats.org/wordprocessingml/2006/main">
+      <w:pPr>
+        <w:pStyle w:val="Normal"/>
+        <w:spacing w:before="120" w:after="120" w:line="480" w:lineRule="auto"/>
+        <w:ind w:firstLine="720"/>
+        <w:jc w:val="both"/>
+      </w:pPr>
+      <w:r>
+        <w:rPr>
+          <w:rFonts w:ascii="Times New Roman" w:hAnsi="Times New Roman"/>
+          <w:sz w:val="24"/>
+        </w:rPr>
+        <w:t xml:space="preserve">El Consejo de Aseguramiento de la Calidad de la Educación Superior (CACES) ejecuta periódicamente procesos de evaluación institucional externa y acreditación para los institutos superiores técnicos y tecnológicos del Ecuador. Dentro del Criterio de Docencia y Currículo, el CACES audita con especial rigurosidad la consistencia microcurricular, exigiendo evidencias documentales irrefutables de que la planificación fue formulada oportunamente, revisada por comisiones de carrera, validada metodológicamente y aprobada por las autoridades académicas antes del inicio de clases.</w:t>
+      </w:r>
+    </w:p>
+    <w:p xmlns:w="http://schemas.openxmlformats.org/wordprocessingml/2006/main">
+      <w:pPr>
+        <w:pStyle w:val="Normal"/>
+        <w:spacing w:before="120" w:after="120" w:line="480" w:lineRule="auto"/>
+        <w:ind w:firstLine="720"/>
+        <w:jc w:val="both"/>
+      </w:pPr>
+      <w:r>
+        <w:rPr>
+          <w:rFonts w:ascii="Times New Roman" w:hAnsi="Times New Roman"/>
+          <w:sz w:val="24"/>
+        </w:rPr>
+        <w:t xml:space="preserve">Asimismo, los evaluadores del CACES fiscalizan que los resultados de aprendizaje de las asignaturas tributen de forma demostrable a los resultados del perfil de egreso de la carrera y que los portafolios docentes contengan el PEA inalterado, firmado formalmente y accesible para verificación. La ausencia de herramientas automatizadas genera históricamente dispersión de documentos, versiones no autorizadas y desfases en el cómputo de horas, convirtiendo la gestión curricular digital en un requerimiento estratégico para la acreditación institucional.</w:t>
+      </w:r>
+    </w:p>
+    <w:p xmlns:w="http://schemas.openxmlformats.org/wordprocessingml/2006/main">
+      <w:pPr>
+        <w:pStyle w:val="Ttulo2"/>
+        <w:spacing w:before="240" w:after="120"/>
+        <w:jc w:val="left"/>
+      </w:pPr>
+      <w:r>
+        <w:rPr>
+          <w:rFonts w:ascii="Times New Roman" w:hAnsi="Times New Roman"/>
+          <w:b/>
+          <w:sz w:val="26"/>
+          <w:color w:val="000000"/>
+        </w:rPr>
+        <w:t>1.2. Arquitectura de Software y Patrones de Diseño Empresarial</w:t>
+      </w:r>
+    </w:p>
+    <w:p xmlns:w="http://schemas.openxmlformats.org/wordprocessingml/2006/main">
+      <w:pPr>
+        <w:pStyle w:val="Ttulo3"/>
+        <w:spacing w:before="180" w:after="60"/>
+        <w:jc w:val="left"/>
+      </w:pPr>
+      <w:r>
+        <w:rPr>
+          <w:rFonts w:ascii="Times New Roman" w:hAnsi="Times New Roman"/>
+          <w:b/>
+          <w:i/>
+          <w:sz w:val="24"/>
+          <w:color w:val="000000"/>
+        </w:rPr>
+        <w:t>1.2.1. Arquitectura Limpia (Clean Architecture) y Separación de Responsabilidades</w:t>
+      </w:r>
+    </w:p>
+    <w:p xmlns:w="http://schemas.openxmlformats.org/wordprocessingml/2006/main">
+      <w:pPr>
+        <w:pStyle w:val="Normal"/>
+        <w:spacing w:before="120" w:after="120" w:line="480" w:lineRule="auto"/>
+        <w:ind w:firstLine="720"/>
+        <w:jc w:val="both"/>
+      </w:pPr>
+      <w:r>
+        <w:rPr>
+          <w:rFonts w:ascii="Times New Roman" w:hAnsi="Times New Roman"/>
+          <w:sz w:val="24"/>
+        </w:rPr>
+        <w:t xml:space="preserve">La Arquitectura Limpia (Clean Architecture), formulada por Robert C. Martin (2017), constituye un estándar de ingeniería de software orientado a maximizar la mantenibilidad, escalabilidad, testabilidad e independencia tecnológica de los sistemas empresariales. Su principio rector es la 'Regla de Dependencia', la cual estipula que las dependencias del código fuente únicamente deben apuntar hacia adentro, es decir, hacia las capas de más alto nivel que contienen las políticas y reglas del negocio, quedando los detalles técnicos (bases de datos, frameworks, interfaces de usuario y protocolos de red) relegados a las capas exteriores.</w:t>
+      </w:r>
+    </w:p>
+    <w:p xmlns:w="http://schemas.openxmlformats.org/wordprocessingml/2006/main">
+      <w:pPr>
+        <w:pStyle w:val="Normal"/>
+        <w:spacing w:before="120" w:after="120" w:line="480" w:lineRule="auto"/>
+        <w:ind w:firstLine="720"/>
+        <w:jc w:val="both"/>
+      </w:pPr>
+      <w:r>
+        <w:rPr>
+          <w:rFonts w:ascii="Times New Roman" w:hAnsi="Times New Roman"/>
+          <w:sz w:val="24"/>
+        </w:rPr>
+        <w:t xml:space="preserve">En la implementación de DOSIER, la solución se estructura en cuatro proyectos concéntricos en .NET 8: Capa de Dominio (dosier_domain), que encapsula las entidades curriculares del PEA, enums de estados y reglas invariantes; Capa de Aplicación (dosier_application), que orquesta los casos de uso, DTOs y validaciones matemáticas; Capa de Infraestructura (dosier_infrastructure), que provee el acceso a datos mediante Entity Framework Core, conectores Pomelo MySQL y servicios de firma digital; y Capa de Presentación o API (dosier_api), que expone los controladores RESTful e interceptores de seguridad.</w:t>
+      </w:r>
+    </w:p>
+    <w:p xmlns:w="http://schemas.openxmlformats.org/wordprocessingml/2006/main">
+      <w:pPr>
+        <w:pStyle w:val="Ttulo3"/>
+        <w:spacing w:before="180" w:after="60"/>
+        <w:jc w:val="left"/>
+      </w:pPr>
+      <w:r>
+        <w:rPr>
+          <w:rFonts w:ascii="Times New Roman" w:hAnsi="Times New Roman"/>
+          <w:b/>
+          <w:i/>
+          <w:sz w:val="24"/>
+          <w:color w:val="000000"/>
+        </w:rPr>
+        <w:t>1.2.2. Principios de Diseño Orientado a Objetos (SOLID)</w:t>
+      </w:r>
+    </w:p>
+    <w:p xmlns:w="http://schemas.openxmlformats.org/wordprocessingml/2006/main">
+      <w:pPr>
+        <w:pStyle w:val="Normal"/>
+        <w:spacing w:before="120" w:after="120" w:line="480" w:lineRule="auto"/>
+        <w:ind w:firstLine="720"/>
+        <w:jc w:val="both"/>
+      </w:pPr>
+      <w:r>
+        <w:rPr>
+          <w:rFonts w:ascii="Times New Roman" w:hAnsi="Times New Roman"/>
+          <w:sz w:val="24"/>
+        </w:rPr>
+        <w:t xml:space="preserve">El diseño de la plataforma se fundamenta en los cinco principios SOLID para evitar el acoplamiento rígido y la fragilidad del código. El Principio de Responsabilidad Única (SRP) asegura que cada servicio de la aplicación atienda exclusivamente un proceso de negocio delimitado. El Principio Abierto/Cerrado (OCP) permite extender la estructura del PEA para dar soporte futuro a nuevos documentos microcurriculares sin modificar los motores transversales de compilación o firma.</w:t>
+      </w:r>
+    </w:p>
+    <w:p xmlns:w="http://schemas.openxmlformats.org/wordprocessingml/2006/main">
+      <w:pPr>
+        <w:pStyle w:val="Normal"/>
+        <w:spacing w:before="120" w:after="120" w:line="480" w:lineRule="auto"/>
+        <w:ind w:firstLine="720"/>
+        <w:jc w:val="both"/>
+      </w:pPr>
+      <w:r>
+        <w:rPr>
+          <w:rFonts w:ascii="Times New Roman" w:hAnsi="Times New Roman"/>
+          <w:sz w:val="24"/>
+        </w:rPr>
+        <w:t xml:space="preserve">El Principio de Sustitución de Liskov (LSP) y el Principio de Segregación de Interfaces (ISP) garantizan que los contratos de repositorios y validadores sean granulares y especializados. Finalmente, el Principio de Inversión de Dependencias (DIP) se materializa a través del contenedor nativo de Inyección de Dependencias (IoC) de ASP.NET Core, donde la capa de aplicación interactúa exclusivamente con abstracciones e interfaces, desacoplándola de Pomelo MySQL y servicios de terceros.</w:t>
+      </w:r>
+    </w:p>
+    <w:p xmlns:w="http://schemas.openxmlformats.org/wordprocessingml/2006/main">
+      <w:pPr>
+        <w:pStyle w:val="Ttulo3"/>
+        <w:spacing w:before="180" w:after="60"/>
+        <w:jc w:val="left"/>
+      </w:pPr>
+      <w:r>
+        <w:rPr>
+          <w:rFonts w:ascii="Times New Roman" w:hAnsi="Times New Roman"/>
+          <w:b/>
+          <w:i/>
+          <w:sz w:val="24"/>
+          <w:color w:val="000000"/>
+        </w:rPr>
+        <w:t>1.2.3. Patrones de Diseño Aplicados: Repositorio, Unidad de Trabajo y Máquina de Estados</w:t>
+      </w:r>
+    </w:p>
+    <w:p xmlns:w="http://schemas.openxmlformats.org/wordprocessingml/2006/main">
+      <w:pPr>
+        <w:pStyle w:val="Normal"/>
+        <w:spacing w:before="120" w:after="120" w:line="480" w:lineRule="auto"/>
+        <w:ind w:firstLine="720"/>
+        <w:jc w:val="both"/>
+      </w:pPr>
+      <w:r>
+        <w:rPr>
+          <w:rFonts w:ascii="Times New Roman" w:hAnsi="Times New Roman"/>
+          <w:sz w:val="24"/>
+        </w:rPr>
+        <w:t xml:space="preserve">Para la persistencia y manipulación de datos se emplea el Patrón Repositorio en conjunto con el Patrón Unidad de Trabajo (Unit of Work), los cuales abstraen la lógica de acceso a datos y aseguran la atomicidad transaccional durante el guardado de documentos curriculares complejos compuestos por múltiples secciones dependientes.</w:t>
+      </w:r>
+    </w:p>
+    <w:p xmlns:w="http://schemas.openxmlformats.org/wordprocessingml/2006/main">
+      <w:pPr>
+        <w:pStyle w:val="Normal"/>
+        <w:spacing w:before="120" w:after="120" w:line="480" w:lineRule="auto"/>
+        <w:ind w:firstLine="720"/>
+        <w:jc w:val="both"/>
+      </w:pPr>
+      <w:r>
+        <w:rPr>
+          <w:rFonts w:ascii="Times New Roman" w:hAnsi="Times New Roman"/>
+          <w:sz w:val="24"/>
+        </w:rPr>
+        <w:t xml:space="preserve">Por otra parte, la gestión del flujo colegiado de revisión y aprobación del PEA se modela mediante el Patrón Máquina de Estados (State Machine Pattern). Este patrón regula las transiciones deterministas del documento curricular a lo largo de su ciclo de vida oficial (Borrador -&gt; EnRevision -&gt; RevisadoCoord -&gt; RevisadoAcad -&gt; Aprobado), garantizando que ningún usuario ejecute saltos de estado indebidos sin cumplir las precondiciones normativas y las firmas electrónicas asociadas a cada fase.</w:t>
+      </w:r>
+    </w:p>
+    <w:p xmlns:w="http://schemas.openxmlformats.org/wordprocessingml/2006/main">
+      <w:pPr>
+        <w:pStyle w:val="Ttulo3"/>
+        <w:spacing w:before="180" w:after="60"/>
+        <w:jc w:val="left"/>
+      </w:pPr>
+      <w:r>
+        <w:rPr>
+          <w:rFonts w:ascii="Times New Roman" w:hAnsi="Times New Roman"/>
+          <w:b/>
+          <w:i/>
+          <w:sz w:val="24"/>
+          <w:color w:val="000000"/>
+        </w:rPr>
+        <w:t>1.2.4. Inmutabilidad Documental y Patrón Snapshot Forense</w:t>
+      </w:r>
+    </w:p>
+    <w:p xmlns:w="http://schemas.openxmlformats.org/wordprocessingml/2006/main">
+      <w:pPr>
+        <w:pStyle w:val="Normal"/>
+        <w:spacing w:before="120" w:after="120" w:line="480" w:lineRule="auto"/>
+        <w:ind w:firstLine="720"/>
+        <w:jc w:val="both"/>
+      </w:pPr>
+      <w:r>
+        <w:rPr>
+          <w:rFonts w:ascii="Times New Roman" w:hAnsi="Times New Roman"/>
+          <w:sz w:val="24"/>
+        </w:rPr>
+        <w:t xml:space="preserve">Uno de los mayores desafíos en la gestión curricular institucional es asegurar que un PEA aprobado no sufra alteraciones retroactivas, intencionales o accidentales, causadas por modificaciones posteriores en las tablas de asignaturas, carreras o docentes. Para erradicar este riesgo, DOSIER implementa el Patrón de Snapshot Forense (Data Snapshot Pattern).</w:t>
+      </w:r>
+    </w:p>
+    <w:p xmlns:w="http://schemas.openxmlformats.org/wordprocessingml/2006/main">
+      <w:pPr>
+        <w:pStyle w:val="Normal"/>
+        <w:spacing w:before="120" w:after="120" w:line="480" w:lineRule="auto"/>
+        <w:ind w:firstLine="720"/>
+        <w:jc w:val="both"/>
+      </w:pPr>
+      <w:r>
+        <w:rPr>
+          <w:rFonts w:ascii="Times New Roman" w:hAnsi="Times New Roman"/>
+          <w:sz w:val="24"/>
+        </w:rPr>
+        <w:t xml:space="preserve">En el instante exacto en que la máxima autoridad académica (Vicerrectorado) otorga su aprobación definitiva, el sistema serializa el contenido íntegro de las once secciones del PEA en una estructura inmutable JSON (almacenada en la columna data_snapshot_json). Dicho paquete se congela irrevocablemente y se sella calculando una firma hash criptográfica SHA-256 sobre la cadena de datos y sobre el archivo PDF generado. Cualquier consulta posterior o exportación oficial lee directamente este snapshot sellado, garantizando integridad forense permanente para procesos de acreditación.</w:t>
+      </w:r>
+    </w:p>
+    <w:p xmlns:w="http://schemas.openxmlformats.org/wordprocessingml/2006/main">
+      <w:pPr>
+        <w:pStyle w:val="Ttulo2"/>
+        <w:spacing w:before="240" w:after="120"/>
+        <w:jc w:val="left"/>
+      </w:pPr>
+      <w:r>
+        <w:rPr>
+          <w:rFonts w:ascii="Times New Roman" w:hAnsi="Times New Roman"/>
+          <w:b/>
+          <w:sz w:val="26"/>
+          <w:color w:val="000000"/>
+        </w:rPr>
+        <w:t>1.3. Tecnologías para el Desarrollo de Soluciones Web Modernas</w:t>
+      </w:r>
+    </w:p>
+    <w:p xmlns:w="http://schemas.openxmlformats.org/wordprocessingml/2006/main">
+      <w:pPr>
+        <w:pStyle w:val="Ttulo3"/>
+        <w:spacing w:before="180" w:after="60"/>
+        <w:jc w:val="left"/>
+      </w:pPr>
+      <w:r>
+        <w:rPr>
+          <w:rFonts w:ascii="Times New Roman" w:hAnsi="Times New Roman"/>
+          <w:b/>
+          <w:i/>
+          <w:sz w:val="24"/>
+          <w:color w:val="000000"/>
+        </w:rPr>
+        <w:t>1.3.1. Ecosistema Backend: ASP.NET Core Web API, C# y .NET 8</w:t>
+      </w:r>
+    </w:p>
+    <w:p xmlns:w="http://schemas.openxmlformats.org/wordprocessingml/2006/main">
+      <w:pPr>
+        <w:pStyle w:val="Normal"/>
+        <w:spacing w:before="120" w:after="120" w:line="480" w:lineRule="auto"/>
+        <w:ind w:firstLine="720"/>
+        <w:jc w:val="both"/>
+      </w:pPr>
+      <w:r>
+        <w:rPr>
+          <w:rFonts w:ascii="Times New Roman" w:hAnsi="Times New Roman"/>
+          <w:sz w:val="24"/>
+        </w:rPr>
+        <w:t xml:space="preserve">El núcleo del servidor se desarrolla sobre .NET 8 y ASP.NET Core Web API, utilizando C# como lenguaje de programación principal. Esta plataforma ofrece un rendimiento de clase empresarial, soporte nativo multiplataforma, gestión optimizada de memoria y capacidades avanzadas de tipado estricto mediante características como Tipos por Referencia Nulables (Nullable Reference Types) y registros inmutables (Records).</w:t>
+      </w:r>
+    </w:p>
+    <w:p xmlns:w="http://schemas.openxmlformats.org/wordprocessingml/2006/main">
+      <w:pPr>
+        <w:pStyle w:val="Normal"/>
+        <w:spacing w:before="120" w:after="120" w:line="480" w:lineRule="auto"/>
+        <w:ind w:firstLine="720"/>
+        <w:jc w:val="both"/>
+      </w:pPr>
+      <w:r>
+        <w:rPr>
+          <w:rFonts w:ascii="Times New Roman" w:hAnsi="Times New Roman"/>
+          <w:sz w:val="24"/>
+        </w:rPr>
+        <w:t xml:space="preserve">La API está estructurada bajo estándares RESTful, empleando serialización global en convención snake_case para garantizar una comunicación fluida y desacoplada con el cliente web. Adicionalmente, integra documentación interactiva generada automáticamente mediante Swagger / OpenAPI, permitiendo la validación exhaustiva de endpoints, esquemas de solicitud y códigos de respuesta HTTP.</w:t>
+      </w:r>
+    </w:p>
+    <w:p xmlns:w="http://schemas.openxmlformats.org/wordprocessingml/2006/main">
+      <w:pPr>
+        <w:pStyle w:val="Ttulo3"/>
+        <w:spacing w:before="180" w:after="60"/>
+        <w:jc w:val="left"/>
+      </w:pPr>
+      <w:r>
+        <w:rPr>
+          <w:rFonts w:ascii="Times New Roman" w:hAnsi="Times New Roman"/>
+          <w:b/>
+          <w:i/>
+          <w:sz w:val="24"/>
+          <w:color w:val="000000"/>
+        </w:rPr>
+        <w:t>1.3.2. Mapeo Objeto-Relacional (ORM) con Entity Framework Core 9 y Pomelo MySQL</w:t>
+      </w:r>
+    </w:p>
+    <w:p xmlns:w="http://schemas.openxmlformats.org/wordprocessingml/2006/main">
+      <w:pPr>
+        <w:pStyle w:val="Normal"/>
+        <w:spacing w:before="120" w:after="120" w:line="480" w:lineRule="auto"/>
+        <w:ind w:firstLine="720"/>
+        <w:jc w:val="both"/>
+      </w:pPr>
+      <w:r>
+        <w:rPr>
+          <w:rFonts w:ascii="Times New Roman" w:hAnsi="Times New Roman"/>
+          <w:sz w:val="24"/>
+        </w:rPr>
+        <w:t xml:space="preserve">La capa de persistencia se gestiona mediante Entity Framework Core 9.0 utilizando el proveedor de código abierto Pomelo.EntityFrameworkCore.MySql. Este ORM proporciona capacidades de mapeo fluido (Fluent API), seguimiento de estados de entidades (Change Tracker), ejecución eficiente de consultas compiladas y compatibilidad con transacciones ACID en motores MySQL 8.0 y MariaDB 10.5+.</w:t>
+      </w:r>
+    </w:p>
+    <w:p xmlns:w="http://schemas.openxmlformats.org/wordprocessingml/2006/main">
+      <w:pPr>
+        <w:pStyle w:val="Normal"/>
+        <w:spacing w:before="120" w:after="120" w:line="480" w:lineRule="auto"/>
+        <w:ind w:firstLine="720"/>
+        <w:jc w:val="both"/>
+      </w:pPr>
+      <w:r>
+        <w:rPr>
+          <w:rFonts w:ascii="Times New Roman" w:hAnsi="Times New Roman"/>
+          <w:sz w:val="24"/>
+        </w:rPr>
+        <w:t xml:space="preserve">Una característica distintiva de la arquitectura de datos de DOSIER es su operación en modalidad híbrida con la base de datos institucional preexistente sigafi_es: mientras las tablas curriculares de DOSIER operan con permisos completos de lectura y escritura, las tablas académicas maestras de SIGAFI se consumen estrictamente en modo de solo lectura mediante consultas AsNoTracking(), blindando el sistema académico central de cualquier riesgo de sobreescritura o bloqueo transaccional.</w:t>
+      </w:r>
+    </w:p>
+    <w:p xmlns:w="http://schemas.openxmlformats.org/wordprocessingml/2006/main">
+      <w:pPr>
+        <w:pStyle w:val="Ttulo3"/>
+        <w:spacing w:before="180" w:after="60"/>
+        <w:jc w:val="left"/>
+      </w:pPr>
+      <w:r>
+        <w:rPr>
+          <w:rFonts w:ascii="Times New Roman" w:hAnsi="Times New Roman"/>
+          <w:b/>
+          <w:i/>
+          <w:sz w:val="24"/>
+          <w:color w:val="000000"/>
+        </w:rPr>
+        <w:t>1.3.3. Ecosistema Frontend: React 18 SPA, TypeScript y Empaquetado con Vite</w:t>
+      </w:r>
+    </w:p>
+    <w:p xmlns:w="http://schemas.openxmlformats.org/wordprocessingml/2006/main">
+      <w:pPr>
+        <w:pStyle w:val="Normal"/>
+        <w:spacing w:before="120" w:after="120" w:line="480" w:lineRule="auto"/>
+        <w:ind w:firstLine="720"/>
+        <w:jc w:val="both"/>
+      </w:pPr>
+      <w:r>
+        <w:rPr>
+          <w:rFonts w:ascii="Times New Roman" w:hAnsi="Times New Roman"/>
+          <w:sz w:val="24"/>
+        </w:rPr>
+        <w:t xml:space="preserve">La interfaz de usuario está construida como una Aplicación de Página Única (SPA) mediante React 18, complementada con TypeScript para dotar al cliente de tipado estricto e interfaces que reflejen con precisión los modelos del backend. Esta combinación mitiga errores en tiempo de ejecución, optimiza el autocompletado y acelera el mantenimiento de componentes complejos.</w:t>
+      </w:r>
+    </w:p>
+    <w:p xmlns:w="http://schemas.openxmlformats.org/wordprocessingml/2006/main">
+      <w:pPr>
+        <w:pStyle w:val="Normal"/>
+        <w:spacing w:before="120" w:after="120" w:line="480" w:lineRule="auto"/>
+        <w:ind w:firstLine="720"/>
+        <w:jc w:val="both"/>
+      </w:pPr>
+      <w:r>
+        <w:rPr>
+          <w:rFonts w:ascii="Times New Roman" w:hAnsi="Times New Roman"/>
+          <w:sz w:val="24"/>
+        </w:rPr>
+        <w:t xml:space="preserve">Para el empaquetamiento y entorno de compilación se utiliza Vite, una herramienta moderna que se apoya en módulos nativos de JavaScript (ES Modules) y utiliza esbuild precompilado en Go para ofrecer recarga en caliente de módulos (HMR) casi instantánea y compilaciones de producción altamente optimizadas mediante Rollup.</w:t>
+      </w:r>
+    </w:p>
+    <w:p xmlns:w="http://schemas.openxmlformats.org/wordprocessingml/2006/main">
+      <w:pPr>
+        <w:pStyle w:val="Ttulo3"/>
+        <w:spacing w:before="180" w:after="60"/>
+        <w:jc w:val="left"/>
+      </w:pPr>
+      <w:r>
+        <w:rPr>
+          <w:rFonts w:ascii="Times New Roman" w:hAnsi="Times New Roman"/>
+          <w:b/>
+          <w:i/>
+          <w:sz w:val="24"/>
+          <w:color w:val="000000"/>
+        </w:rPr>
+        <w:t>1.3.4. Sistema de Diseño Visual Vercel Geist y Estilos Utilitarios con Tailwind CSS</w:t>
+      </w:r>
+    </w:p>
+    <w:p xmlns:w="http://schemas.openxmlformats.org/wordprocessingml/2006/main">
+      <w:pPr>
+        <w:pStyle w:val="Normal"/>
+        <w:spacing w:before="120" w:after="120" w:line="480" w:lineRule="auto"/>
+        <w:ind w:firstLine="720"/>
+        <w:jc w:val="both"/>
+      </w:pPr>
+      <w:r>
+        <w:rPr>
+          <w:rFonts w:ascii="Times New Roman" w:hAnsi="Times New Roman"/>
+          <w:sz w:val="24"/>
+        </w:rPr>
+        <w:t xml:space="preserve">El diseño visual de la interfaz sigue rigurosamente los principios de diseño minimalista, funcional y de alto contraste inspirados en el Vercel Geist Design System, empleando Tailwind CSS integrado nativamente. Este enfoque prioriza la claridad tipográfica (fuente sans-serif técnica), jerarquía visual estricta y microinteracciones fluidas.</w:t>
+      </w:r>
+    </w:p>
+    <w:p xmlns:w="http://schemas.openxmlformats.org/wordprocessingml/2006/main">
+      <w:pPr>
+        <w:pStyle w:val="Normal"/>
+        <w:spacing w:before="120" w:after="120" w:line="480" w:lineRule="auto"/>
+        <w:ind w:firstLine="720"/>
+        <w:jc w:val="both"/>
+      </w:pPr>
+      <w:r>
+        <w:rPr>
+          <w:rFonts w:ascii="Times New Roman" w:hAnsi="Times New Roman"/>
+          <w:sz w:val="24"/>
+        </w:rPr>
+        <w:t xml:space="preserve">Siguiendo las directrices del proyecto, la aplicación implementa una regla cardinal de diseño: fondos 100% sólidos y opacos sin transparencias ni efectos de desenfoque difuso (backdrop-blur) en modales, popovers o menús desplegables. Esta política erradica el fenómeno visual de sangrado de texto (text bleed-through) y garantiza una legibilidad profesional para docentes y coordinadores durante jornadas extensas de trabajo curricular.</w:t>
+      </w:r>
+    </w:p>
+    <w:p xmlns:w="http://schemas.openxmlformats.org/wordprocessingml/2006/main">
+      <w:pPr>
+        <w:pStyle w:val="Ttulo2"/>
+        <w:spacing w:before="240" w:after="120"/>
+        <w:jc w:val="left"/>
+      </w:pPr>
+      <w:r>
+        <w:rPr>
+          <w:rFonts w:ascii="Times New Roman" w:hAnsi="Times New Roman"/>
+          <w:b/>
+          <w:sz w:val="26"/>
+          <w:color w:val="000000"/>
+        </w:rPr>
+        <w:t>1.4. Seguridad Informática, Criptografía y Marco Legal Digital Ecuatoriano</w:t>
+      </w:r>
+    </w:p>
+    <w:p xmlns:w="http://schemas.openxmlformats.org/wordprocessingml/2006/main">
+      <w:pPr>
+        <w:pStyle w:val="Ttulo3"/>
+        <w:spacing w:before="180" w:after="60"/>
+        <w:jc w:val="left"/>
+      </w:pPr>
+      <w:r>
+        <w:rPr>
+          <w:rFonts w:ascii="Times New Roman" w:hAnsi="Times New Roman"/>
+          <w:b/>
+          <w:i/>
+          <w:sz w:val="24"/>
+          <w:color w:val="000000"/>
+        </w:rPr>
+        <w:t>1.4.1. Control de Acceso Basado en Roles (RBAC) y Autenticación JWT</w:t>
+      </w:r>
+    </w:p>
+    <w:p xmlns:w="http://schemas.openxmlformats.org/wordprocessingml/2006/main">
+      <w:pPr>
+        <w:pStyle w:val="Normal"/>
+        <w:spacing w:before="120" w:after="120" w:line="480" w:lineRule="auto"/>
+        <w:ind w:firstLine="720"/>
+        <w:jc w:val="both"/>
+      </w:pPr>
+      <w:r>
+        <w:rPr>
+          <w:rFonts w:ascii="Times New Roman" w:hAnsi="Times New Roman"/>
+          <w:sz w:val="24"/>
+        </w:rPr>
+        <w:t xml:space="preserve">La seguridad y autorización en DOSIER se fundamenta en un modelo formal de Control de Acceso Basado en Roles (RBAC) integrado en el módulo de seguridad de la institución (Sistema ID = 6). El sistema implementa cinco roles curriculares oficiales: DOSIER_ADMIN, DOSIER_DOCENTE, DOSIER_COORD_CARRERA, DOSIER_COORD_ACAD y DOSIER_VICERRECTOR.</w:t>
+      </w:r>
+    </w:p>
+    <w:p xmlns:w="http://schemas.openxmlformats.org/wordprocessingml/2006/main">
+      <w:pPr>
+        <w:pStyle w:val="Normal"/>
+        <w:spacing w:before="120" w:after="120" w:line="480" w:lineRule="auto"/>
+        <w:ind w:firstLine="720"/>
+        <w:jc w:val="both"/>
+      </w:pPr>
+      <w:r>
+        <w:rPr>
+          <w:rFonts w:ascii="Times New Roman" w:hAnsi="Times New Roman"/>
+          <w:sz w:val="24"/>
+        </w:rPr>
+        <w:t xml:space="preserve">La autenticación se implementa mediante tokens web JSON (JWT) firmados criptográficamente mediante algoritmo HMAC-SHA256, con expiración programada y almacenamiento seguro en el cliente, validando en cada petición HTTP la identidad del usuario y las políticas de autorización correspondientes.</w:t>
+      </w:r>
+    </w:p>
+    <w:p xmlns:w="http://schemas.openxmlformats.org/wordprocessingml/2006/main">
+      <w:pPr>
+        <w:pStyle w:val="Ttulo3"/>
+        <w:spacing w:before="180" w:after="60"/>
+        <w:jc w:val="left"/>
+      </w:pPr>
+      <w:r>
+        <w:rPr>
+          <w:rFonts w:ascii="Times New Roman" w:hAnsi="Times New Roman"/>
+          <w:b/>
+          <w:i/>
+          <w:sz w:val="24"/>
+          <w:color w:val="000000"/>
+        </w:rPr>
+        <w:t>1.4.2. Ley de Comercio Electrónico, Firmas Electrónicas y Mensajes de Datos (Ley 67 del Ecuador)</w:t>
+      </w:r>
+    </w:p>
+    <w:p xmlns:w="http://schemas.openxmlformats.org/wordprocessingml/2006/main">
+      <w:pPr>
+        <w:pStyle w:val="Normal"/>
+        <w:spacing w:before="120" w:after="120" w:line="480" w:lineRule="auto"/>
+        <w:ind w:firstLine="720"/>
+        <w:jc w:val="both"/>
+      </w:pPr>
+      <w:r>
+        <w:rPr>
+          <w:rFonts w:ascii="Times New Roman" w:hAnsi="Times New Roman"/>
+          <w:sz w:val="24"/>
+        </w:rPr>
+        <w:t xml:space="preserve">La validez probatoria y jurídica de los documentos curriculares emitidos por DOSIER se ampara en la Ley de Comercio Electrónico, Firmas Electrónicas y Mensajes de Datos (Ley No. 2002-67 del Ecuador). El Artículo 14 de dicha ley estipula que la firma electrónica tendrá igual validez y eficacia jurídica que una firma manuscrita en relación con los datos consignados en documentos escritos.</w:t>
+      </w:r>
+    </w:p>
+    <w:p xmlns:w="http://schemas.openxmlformats.org/wordprocessingml/2006/main">
+      <w:pPr>
+        <w:pStyle w:val="Normal"/>
+        <w:spacing w:before="120" w:after="120" w:line="480" w:lineRule="auto"/>
+        <w:ind w:firstLine="720"/>
+        <w:jc w:val="both"/>
+      </w:pPr>
+      <w:r>
+        <w:rPr>
+          <w:rFonts w:ascii="Times New Roman" w:hAnsi="Times New Roman"/>
+          <w:sz w:val="24"/>
+        </w:rPr>
+        <w:t xml:space="preserve">La plataforma da soporte a certificados digitales PKCS#12 (.p12), aplicativo FirmaEC y firmas digitales institucionales generadas por el motor de DOSIER. Cada firma estampa una marca temporal UTC inalterable, dirección IP, código único institucional (ej: DFRM-2026-PEA-XXXX) y el hash del documento curricular en el instante exacto de la firma.</w:t>
+      </w:r>
+    </w:p>
+    <w:p xmlns:w="http://schemas.openxmlformats.org/wordprocessingml/2006/main">
+      <w:pPr>
+        <w:pStyle w:val="Ttulo3"/>
+        <w:spacing w:before="180" w:after="60"/>
+        <w:jc w:val="left"/>
+      </w:pPr>
+      <w:r>
+        <w:rPr>
+          <w:rFonts w:ascii="Times New Roman" w:hAnsi="Times New Roman"/>
+          <w:b/>
+          <w:i/>
+          <w:sz w:val="24"/>
+          <w:color w:val="000000"/>
+        </w:rPr>
+        <w:t>1.4.3. Criptografía Aplicada: Certificados Digitales PKCS#12, Hash SHA-256 y HMAC</w:t>
+      </w:r>
+    </w:p>
+    <w:p xmlns:w="http://schemas.openxmlformats.org/wordprocessingml/2006/main">
+      <w:pPr>
+        <w:pStyle w:val="Normal"/>
+        <w:spacing w:before="120" w:after="120" w:line="480" w:lineRule="auto"/>
+        <w:ind w:firstLine="720"/>
+        <w:jc w:val="both"/>
+      </w:pPr>
+      <w:r>
+        <w:rPr>
+          <w:rFonts w:ascii="Times New Roman" w:hAnsi="Times New Roman"/>
+          <w:sz w:val="24"/>
+        </w:rPr>
+        <w:t xml:space="preserve">La integridad de los documentos y de la bitácora de auditoría se custodia mediante algoritmos criptográficos robustos reconocidos internacionalmente. El algoritmo de dispersión segura SHA-256 genera una huella digital única e irrepetible para cada estado del PEA y para el archivo binario PDF final, permitiendo detectar adulteraciones instantáneamente.</w:t>
+      </w:r>
+    </w:p>
+    <w:p xmlns:w="http://schemas.openxmlformats.org/wordprocessingml/2006/main">
+      <w:pPr>
+        <w:pStyle w:val="Ttulo3"/>
+        <w:spacing w:before="180" w:after="60"/>
+        <w:jc w:val="left"/>
+      </w:pPr>
+      <w:r>
+        <w:rPr>
+          <w:rFonts w:ascii="Times New Roman" w:hAnsi="Times New Roman"/>
+          <w:b/>
+          <w:i/>
+          <w:sz w:val="24"/>
+          <w:color w:val="000000"/>
+        </w:rPr>
+        <w:t>1.4.4. Ley Orgánica de Protección de Datos Personales (LOPDP) en el Ámbito Académico</w:t>
+      </w:r>
+    </w:p>
+    <w:p xmlns:w="http://schemas.openxmlformats.org/wordprocessingml/2006/main">
+      <w:pPr>
+        <w:pStyle w:val="Normal"/>
+        <w:spacing w:before="120" w:after="120" w:line="480" w:lineRule="auto"/>
+        <w:ind w:firstLine="720"/>
+        <w:jc w:val="both"/>
+      </w:pPr>
+      <w:r>
+        <w:rPr>
+          <w:rFonts w:ascii="Times New Roman" w:hAnsi="Times New Roman"/>
+          <w:sz w:val="24"/>
+        </w:rPr>
+        <w:t xml:space="preserve">El tratamiento de la información docente cumple con la Ley Orgánica de Protección de Datos Personales (LOPDP) del Ecuador (Registro Oficial Suplemento 459 de mayo de 2021). DOSIER mantiene registros inalterables de consentimiento digital para el uso de credenciales de firma en memoria volátil RAM, prohíbe el almacenamiento persistente de contraseñas de certificados .p12 y audita los accesos a datos sensibles de la planta docente.</w:t>
+      </w:r>
+    </w:p>
+    <w:p xmlns:w="http://schemas.openxmlformats.org/wordprocessingml/2006/main">
+      <w:pPr>
+        <w:pStyle w:val="Ttulo2"/>
+        <w:spacing w:before="240" w:after="120"/>
+        <w:jc w:val="left"/>
+      </w:pPr>
+      <w:r>
+        <w:rPr>
+          <w:rFonts w:ascii="Times New Roman" w:hAnsi="Times New Roman"/>
+          <w:b/>
+          <w:sz w:val="26"/>
+          <w:color w:val="000000"/>
+        </w:rPr>
+        <w:t>1.5. Motores Especializados de Compilación Documental y Sincronización Concurrente</w:t>
+      </w:r>
+    </w:p>
+    <w:p xmlns:w="http://schemas.openxmlformats.org/wordprocessingml/2006/main">
+      <w:pPr>
+        <w:pStyle w:val="Ttulo3"/>
+        <w:spacing w:before="180" w:after="60"/>
+        <w:jc w:val="left"/>
+      </w:pPr>
+      <w:r>
+        <w:rPr>
+          <w:rFonts w:ascii="Times New Roman" w:hAnsi="Times New Roman"/>
+          <w:b/>
+          <w:i/>
+          <w:sz w:val="24"/>
+          <w:color w:val="000000"/>
+        </w:rPr>
+        <w:t>1.5.1. Generación y Compilación Documental en el Servidor (iText 9) y Verificación QR</w:t>
+      </w:r>
+    </w:p>
+    <w:p xmlns:w="http://schemas.openxmlformats.org/wordprocessingml/2006/main">
+      <w:pPr>
+        <w:pStyle w:val="Normal"/>
+        <w:spacing w:before="120" w:after="120" w:line="480" w:lineRule="auto"/>
+        <w:ind w:firstLine="720"/>
+        <w:jc w:val="both"/>
+      </w:pPr>
+      <w:r>
+        <w:rPr>
+          <w:rFonts w:ascii="Times New Roman" w:hAnsi="Times New Roman"/>
+          <w:sz w:val="24"/>
+        </w:rPr>
+        <w:t xml:space="preserve">Para la producción del documento oficial del PEA en formato portátil e imprimible, DOSIER implementa un motor de generación documental basado en iText 9. Este motor compila las once secciones del PEA inyectando el membrete institucional oficial del ISTPET, numeración de páginas, tablas estilizadas y los sellos visuales de las cuatro firmas de responsabilidad.</w:t>
+      </w:r>
+    </w:p>
+    <w:p xmlns:w="http://schemas.openxmlformats.org/wordprocessingml/2006/main">
+      <w:pPr>
+        <w:pStyle w:val="Normal"/>
+        <w:spacing w:before="120" w:after="120" w:line="480" w:lineRule="auto"/>
+        <w:ind w:firstLine="720"/>
+        <w:jc w:val="both"/>
+      </w:pPr>
+      <w:r>
+        <w:rPr>
+          <w:rFonts w:ascii="Times New Roman" w:hAnsi="Times New Roman"/>
+          <w:sz w:val="24"/>
+        </w:rPr>
+        <w:t xml:space="preserve">En el pie de cada página se estampa un código QR vectorial de alta resolución y un código de trazabilidad único, permitiendo a evaluadores del CACES o autoridades educativas escanear el documento físico y comprobar en tiempo real, sin requerir usuario ni contraseña, la autenticidad del documento, el hash SHA-256 y el estado de legalización oficial en el servidor.</w:t>
+      </w:r>
+    </w:p>
+    <w:p xmlns:w="http://schemas.openxmlformats.org/wordprocessingml/2006/main">
+      <w:pPr>
+        <w:pStyle w:val="Ttulo3"/>
+        <w:spacing w:before="180" w:after="60"/>
+        <w:jc w:val="left"/>
+      </w:pPr>
+      <w:r>
+        <w:rPr>
+          <w:rFonts w:ascii="Times New Roman" w:hAnsi="Times New Roman"/>
+          <w:b/>
+          <w:i/>
+          <w:sz w:val="24"/>
+          <w:color w:val="000000"/>
+        </w:rPr>
+        <w:t>1.5.2. Tipos de Datos Replicados Libres de Conflictos (CRDT) y Protocolo Yjs</w:t>
+      </w:r>
+    </w:p>
+    <w:p xmlns:w="http://schemas.openxmlformats.org/wordprocessingml/2006/main">
+      <w:pPr>
+        <w:pStyle w:val="Normal"/>
+        <w:spacing w:before="120" w:after="120" w:line="480" w:lineRule="auto"/>
+        <w:ind w:firstLine="720"/>
+        <w:jc w:val="both"/>
+      </w:pPr>
+      <w:r>
+        <w:rPr>
+          <w:rFonts w:ascii="Times New Roman" w:hAnsi="Times New Roman"/>
+          <w:sz w:val="24"/>
+        </w:rPr>
+        <w:t xml:space="preserve">Para asignaturas de cátedra compartida o materias con múltiples paralelos, DOSIER incorpora el motor CoWork fundamentado en Tipos de Datos Replicados Libres de Conflictos (CRDT) mediante la biblioteca Yjs. Los CRDTs garantizan convergencia eventual matemática de los cambios concurrentes sin requerir bloqueos de archivo, fusionando automáticamente las modificaciones de texto y evitando conflictos entre docentes co-autores.</w:t>
+      </w:r>
+    </w:p>
+    <w:p xmlns:w="http://schemas.openxmlformats.org/wordprocessingml/2006/main">
+      <w:pPr>
+        <w:pStyle w:val="Ttulo3"/>
+        <w:spacing w:before="180" w:after="60"/>
+        <w:jc w:val="left"/>
+      </w:pPr>
+      <w:r>
+        <w:rPr>
+          <w:rFonts w:ascii="Times New Roman" w:hAnsi="Times New Roman"/>
+          <w:b/>
+          <w:i/>
+          <w:sz w:val="24"/>
+          <w:color w:val="000000"/>
+        </w:rPr>
+        <w:t>1.5.3. Comunicación Bidireccional en Tiempo Real con WebSockets y SignalR</w:t>
+      </w:r>
+    </w:p>
+    <w:p xmlns:w="http://schemas.openxmlformats.org/wordprocessingml/2006/main">
+      <w:pPr>
+        <w:pStyle w:val="Normal"/>
+        <w:spacing w:before="120" w:after="120" w:line="480" w:lineRule="auto"/>
+        <w:ind w:firstLine="720"/>
+        <w:jc w:val="both"/>
+      </w:pPr>
+      <w:r>
+        <w:rPr>
+          <w:rFonts w:ascii="Times New Roman" w:hAnsi="Times New Roman"/>
+          <w:sz w:val="24"/>
+        </w:rPr>
+        <w:t xml:space="preserve">La capa de transporte en tiempo real se apoya en el protocolo WebSockets (RFC 6455), gestionado en el backend mediante Microsoft SignalR Core. SignalR mantiene conexiones dúplex completas y persistentes entre el navegador y el servidor, transportando deltas binarios de Yjs y notificando eventos de revisión instantáneos con latencia mínima.</w:t>
+      </w:r>
+    </w:p>
     <w:p>
       <w:pPr>
         <w:pStyle w:val="Ttulo1"/>
@@ -2430,86 +3339,1243 @@
       </w:r>
       <w:bookmarkEnd w:id="5"/>
     </w:p>
-    <w:p>
+    <w:p xmlns:w="http://schemas.openxmlformats.org/wordprocessingml/2006/main">
+      <w:pPr>
+        <w:pStyle w:val="Normal"/>
+        <w:spacing w:before="120" w:after="120" w:line="480" w:lineRule="auto"/>
+        <w:ind w:firstLine="720"/>
+        <w:jc w:val="both"/>
+      </w:pPr>
+      <w:r>
+        <w:rPr>
+          <w:rFonts w:ascii="Times New Roman" w:hAnsi="Times New Roman"/>
+          <w:sz w:val="24"/>
+        </w:rPr>
+        <w:t xml:space="preserve">El desarrollo del Sistema Web de Gestión Curricular para el Programa de Estudio de la Asignatura (DOSIER) se fundamenta en la aplicación sistemática de la ingeniería de software, combinando el marco ágil Scrum con las fases disciplinadas del ciclo de vida del software: Análisis, Diseño, Construcción y Pruebas. Este enfoque híbrido permite responder de forma iterativa y colaborativa a las necesidades de los docentes y autoridades del ISTPET, garantizando al mismo tiempo el rigor arquitectónico, la inmutabilidad documental y el cumplimiento de los estándares exigidos por el CACES.</w:t>
+      </w:r>
+    </w:p>
+    <w:p xmlns:w="http://schemas.openxmlformats.org/wordprocessingml/2006/main">
+      <w:pPr>
+        <w:pStyle w:val="Normal"/>
+        <w:spacing w:before="120" w:after="120" w:line="480" w:lineRule="auto"/>
+        <w:ind w:firstLine="720"/>
+        <w:jc w:val="both"/>
+      </w:pPr>
+      <w:r>
+        <w:rPr>
+          <w:rFonts w:ascii="Times New Roman" w:hAnsi="Times New Roman"/>
+          <w:sz w:val="24"/>
+        </w:rPr>
+        <w:t xml:space="preserve">El equipo de desarrollo operó bajo una adaptación de roles de Scrum orientada a proyectos institucionales de titulación: el rol de Product Owner fue asumido conjuntamente por el Tutor del proyecto de titulación y la Comisión de Carrera de Desarrollo de Software; mientras que el rol de Scrum Master y Desarrollador fue ejecutado por el autor del trabajo de titulación. El proyecto se organizó en once Sprints quincenales a lo largo de veinte semanas de trabajo continuo.</w:t>
+      </w:r>
+    </w:p>
+    <w:p xmlns:w="http://schemas.openxmlformats.org/wordprocessingml/2006/main">
       <w:pPr>
         <w:pStyle w:val="Ttulo2"/>
-        <w:numPr>
-          <w:ilvl w:val="1"/>
-          <w:numId w:val="4"/>
-        </w:numPr>
-      </w:pPr>
-      <w:r>
-        <w:t xml:space="preserve">Cronograma </w:t>
-      </w:r>
-      <w:bookmarkStart w:id="6" w:name="_Toc87262805"/>
-    </w:p>
-    <w:p>
+        <w:spacing w:before="240" w:after="120"/>
+        <w:jc w:val="left"/>
+      </w:pPr>
+      <w:r>
+        <w:rPr>
+          <w:rFonts w:ascii="Times New Roman" w:hAnsi="Times New Roman"/>
+          <w:b/>
+          <w:sz w:val="26"/>
+          <w:color w:val="000000"/>
+        </w:rPr>
+        <w:t>2.1. Cronograma de Trabajo</w:t>
+      </w:r>
+    </w:p>
+    <w:p xmlns:w="http://schemas.openxmlformats.org/wordprocessingml/2006/main">
+      <w:pPr>
+        <w:pStyle w:val="Normal"/>
+        <w:spacing w:before="120" w:after="120" w:line="480" w:lineRule="auto"/>
+        <w:ind w:firstLine="720"/>
+        <w:jc w:val="both"/>
+      </w:pPr>
+      <w:r>
+        <w:rPr>
+          <w:rFonts w:ascii="Times New Roman" w:hAnsi="Times New Roman"/>
+          <w:sz w:val="24"/>
+        </w:rPr>
+        <w:t xml:space="preserve">El cronograma de trabajo se estructuró en correspondencia directa con los tres Objetivos Específicos fijados en la investigación:</w:t>
+      </w:r>
+    </w:p>
+    <w:p xmlns:w="http://schemas.openxmlformats.org/wordprocessingml/2006/main">
+      <w:pPr>
+        <w:pStyle w:val="Normal"/>
+        <w:spacing w:before="120" w:after="120" w:line="480" w:lineRule="auto"/>
+        <w:ind w:firstLine="720"/>
+        <w:jc w:val="both"/>
+      </w:pPr>
+      <w:r>
+        <w:rPr>
+          <w:rFonts w:ascii="Times New Roman" w:hAnsi="Times New Roman"/>
+          <w:sz w:val="24"/>
+        </w:rPr>
+        <w:t xml:space="preserve">Fase 1: Análisis e Ingeniería de Requerimientos (Sprints 1 y 2, Semanas 1 a 4). Vinculada al Objetivo Específico 1. Comprendió el levantamiento exhaustivo de las once secciones oficiales del PEA institucional, entrevistas con la coordinación académica, análisis de la base de datos preexistente de SIGAFI y formalización de requerimientos funcionales y no funcionales junto con las historias de usuario.</w:t>
+      </w:r>
+    </w:p>
+    <w:p xmlns:w="http://schemas.openxmlformats.org/wordprocessingml/2006/main">
+      <w:pPr>
+        <w:pStyle w:val="Normal"/>
+        <w:spacing w:before="120" w:after="120" w:line="480" w:lineRule="auto"/>
+        <w:ind w:firstLine="720"/>
+        <w:jc w:val="both"/>
+      </w:pPr>
+      <w:r>
+        <w:rPr>
+          <w:rFonts w:ascii="Times New Roman" w:hAnsi="Times New Roman"/>
+          <w:sz w:val="24"/>
+        </w:rPr>
+        <w:t xml:space="preserve">Fase 2: Diseño Arquitectónico y Modelado Relacional (Sprints 3 y 4, Semanas 5 a 8). Vinculada al Objetivo Específico 2. Abarcó la formulación de los diagramas C4 (Contexto y Contenedores), el diseño del modelo de base de datos relacional consolidado de 20 tablas, la definición del diccionario de datos y la maquetación de interfaces de usuario bajo el sistema de diseño Vercel Geist.</w:t>
+      </w:r>
+    </w:p>
+    <w:p xmlns:w="http://schemas.openxmlformats.org/wordprocessingml/2006/main">
+      <w:pPr>
+        <w:pStyle w:val="Normal"/>
+        <w:spacing w:before="120" w:after="120" w:line="480" w:lineRule="auto"/>
+        <w:ind w:firstLine="720"/>
+        <w:jc w:val="both"/>
+      </w:pPr>
+      <w:r>
+        <w:rPr>
+          <w:rFonts w:ascii="Times New Roman" w:hAnsi="Times New Roman"/>
+          <w:sz w:val="24"/>
+        </w:rPr>
+        <w:t xml:space="preserve">Fase 3: Construcción del Backend y Motores Especializados (Sprints 5, 6 y 7, Semanas 9 a 14). Vinculada al Objetivo Específico 2. Involucró el desarrollo de la API RESTful en .NET 8 bajo Clean Architecture, configuración de Entity Framework Core 9 con Pomelo MySQL, codificación del motor de validación matemática horaria (CurricularValidationEngine), servicios de ciclo de vida y circuito de firmas digitales bajo Ley 67.</w:t>
+      </w:r>
+    </w:p>
+    <w:p xmlns:w="http://schemas.openxmlformats.org/wordprocessingml/2006/main">
+      <w:pPr>
+        <w:pStyle w:val="Normal"/>
+        <w:spacing w:before="120" w:after="120" w:line="480" w:lineRule="auto"/>
+        <w:ind w:firstLine="720"/>
+        <w:jc w:val="both"/>
+      </w:pPr>
+      <w:r>
+        <w:rPr>
+          <w:rFonts w:ascii="Times New Roman" w:hAnsi="Times New Roman"/>
+          <w:sz w:val="24"/>
+        </w:rPr>
+        <w:t xml:space="preserve">Fase 4: Construcción del Frontend Web y Colaboración en Tiempo Real (Sprints 8 y 9, Semanas 15 a 18). Vinculada al Objetivo Específico 2. Comprendió la implementación de la aplicación web en React 18 con Vite y TypeScript, integración de componentes visuales con Tailwind CSS, conexión con el cliente Axios y desarrollo de la co-redacción concurrente mediante el protocolo Yjs y SignalR Core.</w:t>
+      </w:r>
+    </w:p>
+    <w:p xmlns:w="http://schemas.openxmlformats.org/wordprocessingml/2006/main">
+      <w:pPr>
+        <w:pStyle w:val="Normal"/>
+        <w:spacing w:before="120" w:after="120" w:line="480" w:lineRule="auto"/>
+        <w:ind w:firstLine="720"/>
+        <w:jc w:val="both"/>
+      </w:pPr>
+      <w:r>
+        <w:rPr>
+          <w:rFonts w:ascii="Times New Roman" w:hAnsi="Times New Roman"/>
+          <w:sz w:val="24"/>
+        </w:rPr>
+        <w:t xml:space="preserve">Fase 5: Pruebas, Despliegue en la Nube y Validación Institucional (Sprints 10 y 11, Semanas 19 a 20). Vinculada al Objetivo Específico 3. Focalizada en la ejecución de pruebas unitarias, de integración y de aceptación; configuración del servidor virtual privado (Cloud VPS) en Amazon Lightsail; despliegue continuo de la base de datos, API y frontend; y verificación del portal público de comprobación mediante código QR con pares evaluadores.</w:t>
+      </w:r>
+    </w:p>
+    <w:p xmlns:w="http://schemas.openxmlformats.org/wordprocessingml/2006/main">
       <w:pPr>
         <w:pStyle w:val="Ttulo2"/>
-        <w:numPr>
-          <w:ilvl w:val="1"/>
-          <w:numId w:val="4"/>
-        </w:numPr>
-      </w:pPr>
-      <w:r>
-        <w:t>Análisis y experimentación</w:t>
-      </w:r>
-      <w:bookmarkEnd w:id="6"/>
-      <w:r>
-        <w:t xml:space="preserve"> </w:t>
-      </w:r>
-    </w:p>
-    <w:p>
+        <w:spacing w:before="240" w:after="120"/>
+        <w:jc w:val="left"/>
+      </w:pPr>
+      <w:r>
+        <w:rPr>
+          <w:rFonts w:ascii="Times New Roman" w:hAnsi="Times New Roman"/>
+          <w:b/>
+          <w:sz w:val="26"/>
+          <w:color w:val="000000"/>
+        </w:rPr>
+        <w:t>2.2. Análisis y Experimentación</w:t>
+      </w:r>
+    </w:p>
+    <w:p xmlns:w="http://schemas.openxmlformats.org/wordprocessingml/2006/main">
+      <w:pPr>
+        <w:pStyle w:val="Normal"/>
+        <w:spacing w:before="120" w:after="120" w:line="480" w:lineRule="auto"/>
+        <w:ind w:firstLine="720"/>
+        <w:jc w:val="both"/>
+      </w:pPr>
+      <w:r>
+        <w:rPr>
+          <w:rFonts w:ascii="Times New Roman" w:hAnsi="Times New Roman"/>
+          <w:sz w:val="24"/>
+        </w:rPr>
+        <w:t xml:space="preserve">La etapa de análisis y experimentación permitió formalizar las necesidades operativas de la planta docente y directiva del ISTPET, traduciéndolas en especificaciones técnicas inequívocas.</w:t>
+      </w:r>
+    </w:p>
+    <w:p xmlns:w="http://schemas.openxmlformats.org/wordprocessingml/2006/main">
+      <w:pPr>
+        <w:pStyle w:val="Ttulo3"/>
+        <w:spacing w:before="180" w:after="60"/>
+        <w:jc w:val="left"/>
+      </w:pPr>
+      <w:r>
+        <w:rPr>
+          <w:rFonts w:ascii="Times New Roman" w:hAnsi="Times New Roman"/>
+          <w:b/>
+          <w:i/>
+          <w:sz w:val="24"/>
+          <w:color w:val="000000"/>
+        </w:rPr>
+        <w:t>2.2.1. Levantamiento de Requerimientos Funcionales (RF)</w:t>
+      </w:r>
+    </w:p>
+    <w:p xmlns:w="http://schemas.openxmlformats.org/wordprocessingml/2006/main">
+      <w:pPr>
+        <w:pStyle w:val="Normal"/>
+        <w:spacing w:before="120" w:after="120" w:line="480" w:lineRule="auto"/>
+        <w:ind w:firstLine="720"/>
+        <w:jc w:val="both"/>
+      </w:pPr>
+      <w:r>
+        <w:rPr>
+          <w:rFonts w:ascii="Times New Roman" w:hAnsi="Times New Roman"/>
+          <w:sz w:val="24"/>
+        </w:rPr>
+        <w:t xml:space="preserve">Se formalizaron quince requerimientos funcionales obligatorios que rigen el comportamiento de la plataforma:</w:t>
+      </w:r>
+    </w:p>
+    <w:p xmlns:w="http://schemas.openxmlformats.org/wordprocessingml/2006/main">
+      <w:pPr>
+        <w:pStyle w:val="Normal"/>
+        <w:spacing w:before="60" w:after="60" w:line="360" w:lineRule="auto"/>
+        <w:ind w:left="720" w:firstLine="-360"/>
+        <w:jc w:val="both"/>
+      </w:pPr>
+      <w:r>
+        <w:rPr>
+          <w:rFonts w:ascii="Times New Roman" w:hAnsi="Times New Roman"/>
+          <w:sz w:val="24"/>
+        </w:rPr>
+        <w:t xml:space="preserve">- RF-01 (Autenticación Institucional): Inicio de sesión seguro mediante credenciales institucionales, emitiendo tokens criptográficos JWT con expiración controlada.</w:t>
+      </w:r>
+    </w:p>
+    <w:p xmlns:w="http://schemas.openxmlformats.org/wordprocessingml/2006/main">
+      <w:pPr>
+        <w:pStyle w:val="Normal"/>
+        <w:spacing w:before="60" w:after="60" w:line="360" w:lineRule="auto"/>
+        <w:ind w:left="720" w:firstLine="-360"/>
+        <w:jc w:val="both"/>
+      </w:pPr>
+      <w:r>
+        <w:rPr>
+          <w:rFonts w:ascii="Times New Roman" w:hAnsi="Times New Roman"/>
+          <w:sz w:val="24"/>
+        </w:rPr>
+        <w:t xml:space="preserve">- RF-02 (Control de Acceso RBAC): Restricción de acceso a módulos y operaciones según los cinco roles curriculares oficiales (DOSIER_ADMIN, DOSIER_DOCENTE, DOSIER_COORD_CARRERA, DOSIER_COORD_ACAD, DOSIER_VICERRECTOR).</w:t>
+      </w:r>
+    </w:p>
+    <w:p xmlns:w="http://schemas.openxmlformats.org/wordprocessingml/2006/main">
+      <w:pPr>
+        <w:pStyle w:val="Normal"/>
+        <w:spacing w:before="60" w:after="60" w:line="360" w:lineRule="auto"/>
+        <w:ind w:left="720" w:firstLine="-360"/>
+        <w:jc w:val="both"/>
+      </w:pPr>
+      <w:r>
+        <w:rPr>
+          <w:rFonts w:ascii="Times New Roman" w:hAnsi="Times New Roman"/>
+          <w:sz w:val="24"/>
+        </w:rPr>
+        <w:t xml:space="preserve">- RF-03 (Integración de Solo Lectura con SIGAFI): Consulta no destructiva de tablas maestras de carreras (esInstituto = 1), períodos académicos, mallas, detalle de horas y distributivo docente desde la base de datos sigafi_es.</w:t>
+      </w:r>
+    </w:p>
+    <w:p xmlns:w="http://schemas.openxmlformats.org/wordprocessingml/2006/main">
+      <w:pPr>
+        <w:pStyle w:val="Normal"/>
+        <w:spacing w:before="60" w:after="60" w:line="360" w:lineRule="auto"/>
+        <w:ind w:left="720" w:firstLine="-360"/>
+        <w:jc w:val="both"/>
+      </w:pPr>
+      <w:r>
+        <w:rPr>
+          <w:rFonts w:ascii="Times New Roman" w:hAnsi="Times New Roman"/>
+          <w:sz w:val="24"/>
+        </w:rPr>
+        <w:t xml:space="preserve">- RF-04 (Repositorio Normativo Inalterable): Registro y versionado de normativas externas de educación superior (CES, CACES, SENESCYT) y sus artículos para auditoría.</w:t>
+      </w:r>
+    </w:p>
+    <w:p xmlns:w="http://schemas.openxmlformats.org/wordprocessingml/2006/main">
+      <w:pPr>
+        <w:pStyle w:val="Normal"/>
+        <w:spacing w:before="60" w:after="60" w:line="360" w:lineRule="auto"/>
+        <w:ind w:left="720" w:firstLine="-360"/>
+        <w:jc w:val="both"/>
+      </w:pPr>
+      <w:r>
+        <w:rPr>
+          <w:rFonts w:ascii="Times New Roman" w:hAnsi="Times New Roman"/>
+          <w:sz w:val="24"/>
+        </w:rPr>
+        <w:t xml:space="preserve">- RF-05 (Gestión del Modelo Educativo): Administración de versiones del Modelo Educativo Pedagógico Institucional del ISTPET y sus fechas de vigencia.</w:t>
+      </w:r>
+    </w:p>
+    <w:p xmlns:w="http://schemas.openxmlformats.org/wordprocessingml/2006/main">
+      <w:pPr>
+        <w:pStyle w:val="Normal"/>
+        <w:spacing w:before="60" w:after="60" w:line="360" w:lineRule="auto"/>
+        <w:ind w:left="720" w:firstLine="-360"/>
+        <w:jc w:val="both"/>
+      </w:pPr>
+      <w:r>
+        <w:rPr>
+          <w:rFonts w:ascii="Times New Roman" w:hAnsi="Times New Roman"/>
+          <w:sz w:val="24"/>
+        </w:rPr>
+        <w:t xml:space="preserve">- RF-06 (Articulación con Proyectos de Carrera): Vinculación de materias con resoluciones CES de aprobación de carrera, rediseños y perfiles de egreso oficiales.</w:t>
+      </w:r>
+    </w:p>
+    <w:p xmlns:w="http://schemas.openxmlformats.org/wordprocessingml/2006/main">
+      <w:pPr>
+        <w:pStyle w:val="Normal"/>
+        <w:spacing w:before="60" w:after="60" w:line="360" w:lineRule="auto"/>
+        <w:ind w:left="720" w:firstLine="-360"/>
+        <w:jc w:val="both"/>
+      </w:pPr>
+      <w:r>
+        <w:rPr>
+          <w:rFonts w:ascii="Times New Roman" w:hAnsi="Times New Roman"/>
+          <w:sz w:val="24"/>
+        </w:rPr>
+        <w:t xml:space="preserve">- RF-07 (Expediente Curricular Maestro): Creación y control de expedientes curriculares por asignatura, carrera y período, soportando cátedra compartida.</w:t>
+      </w:r>
+    </w:p>
+    <w:p xmlns:w="http://schemas.openxmlformats.org/wordprocessingml/2006/main">
+      <w:pPr>
+        <w:pStyle w:val="Normal"/>
+        <w:spacing w:before="60" w:after="60" w:line="360" w:lineRule="auto"/>
+        <w:ind w:left="720" w:firstLine="-360"/>
+        <w:jc w:val="both"/>
+      </w:pPr>
+      <w:r>
+        <w:rPr>
+          <w:rFonts w:ascii="Times New Roman" w:hAnsi="Times New Roman"/>
+          <w:sz w:val="24"/>
+        </w:rPr>
+        <w:t xml:space="preserve">- RF-08 (Formulación Integral del PEA): Interfaz interactiva para la redacción modular de las once secciones reglamentarias del PEA institucional (secciones a a la k).</w:t>
+      </w:r>
+    </w:p>
+    <w:p xmlns:w="http://schemas.openxmlformats.org/wordprocessingml/2006/main">
+      <w:pPr>
+        <w:pStyle w:val="Normal"/>
+        <w:spacing w:before="60" w:after="60" w:line="360" w:lineRule="auto"/>
+        <w:ind w:left="720" w:firstLine="-360"/>
+        <w:jc w:val="both"/>
+      </w:pPr>
+      <w:r>
+        <w:rPr>
+          <w:rFonts w:ascii="Times New Roman" w:hAnsi="Times New Roman"/>
+          <w:sz w:val="24"/>
+        </w:rPr>
+        <w:t xml:space="preserve">- RF-09 (Validación Matemática de Carga Horaria): Validación determinista e inviolable de que la suma de horas CD, APE y AA coincida exactamente con las horas normadas en detallemallas de SIGAFI.</w:t>
+      </w:r>
+    </w:p>
+    <w:p xmlns:w="http://schemas.openxmlformats.org/wordprocessingml/2006/main">
+      <w:pPr>
+        <w:pStyle w:val="Normal"/>
+        <w:spacing w:before="60" w:after="60" w:line="360" w:lineRule="auto"/>
+        <w:ind w:left="720" w:firstLine="-360"/>
+        <w:jc w:val="both"/>
+      </w:pPr>
+      <w:r>
+        <w:rPr>
+          <w:rFonts w:ascii="Times New Roman" w:hAnsi="Times New Roman"/>
+          <w:sz w:val="24"/>
+        </w:rPr>
+        <w:t xml:space="preserve">- RF-10 (Tributación al Perfil de Egreso): Exigencia de que cada resultado de aprendizaje (RDA) de la asignatura esté formalmente articulado a un RDA del perfil de egreso de la carrera.</w:t>
+      </w:r>
+    </w:p>
+    <w:p xmlns:w="http://schemas.openxmlformats.org/wordprocessingml/2006/main">
+      <w:pPr>
+        <w:pStyle w:val="Normal"/>
+        <w:spacing w:before="60" w:after="60" w:line="360" w:lineRule="auto"/>
+        <w:ind w:left="720" w:firstLine="-360"/>
+        <w:jc w:val="both"/>
+      </w:pPr>
+      <w:r>
+        <w:rPr>
+          <w:rFonts w:ascii="Times New Roman" w:hAnsi="Times New Roman"/>
+          <w:sz w:val="24"/>
+        </w:rPr>
+        <w:t xml:space="preserve">- RF-11 (Co-Redacción Concurrente CoWork): Edición simultánea de secciones del PEA por docentes colaboradores sin bloqueos de archivo mediante CRDT e Yjs.</w:t>
+      </w:r>
+    </w:p>
+    <w:p xmlns:w="http://schemas.openxmlformats.org/wordprocessingml/2006/main">
+      <w:pPr>
+        <w:pStyle w:val="Normal"/>
+        <w:spacing w:before="60" w:after="60" w:line="360" w:lineRule="auto"/>
+        <w:ind w:left="720" w:firstLine="-360"/>
+        <w:jc w:val="both"/>
+      </w:pPr>
+      <w:r>
+        <w:rPr>
+          <w:rFonts w:ascii="Times New Roman" w:hAnsi="Times New Roman"/>
+          <w:sz w:val="24"/>
+        </w:rPr>
+        <w:t xml:space="preserve">- RF-12 (Circuito de Observaciones por Sección): Registro de observaciones técnicas por parte de los revisores asociadas a secciones específicas del PEA.</w:t>
+      </w:r>
+    </w:p>
+    <w:p xmlns:w="http://schemas.openxmlformats.org/wordprocessingml/2006/main">
+      <w:pPr>
+        <w:pStyle w:val="Normal"/>
+        <w:spacing w:before="60" w:after="60" w:line="360" w:lineRule="auto"/>
+        <w:ind w:left="720" w:firstLine="-360"/>
+        <w:jc w:val="both"/>
+      </w:pPr>
+      <w:r>
+        <w:rPr>
+          <w:rFonts w:ascii="Times New Roman" w:hAnsi="Times New Roman"/>
+          <w:sz w:val="24"/>
+        </w:rPr>
+        <w:t xml:space="preserve">- RF-13 (Subsanación y Trazabilidad): Subsanación de observaciones con respuesta técnica auditable y registro del historial inmutable de cambios de estado.</w:t>
+      </w:r>
+    </w:p>
+    <w:p xmlns:w="http://schemas.openxmlformats.org/wordprocessingml/2006/main">
+      <w:pPr>
+        <w:pStyle w:val="Normal"/>
+        <w:spacing w:before="60" w:after="60" w:line="360" w:lineRule="auto"/>
+        <w:ind w:left="720" w:firstLine="-360"/>
+        <w:jc w:val="both"/>
+      </w:pPr>
+      <w:r>
+        <w:rPr>
+          <w:rFonts w:ascii="Times New Roman" w:hAnsi="Times New Roman"/>
+          <w:sz w:val="24"/>
+        </w:rPr>
+        <w:t xml:space="preserve">- RF-14 (Circuito de Cuatro Firmas de Responsabilidad): Firma digital secuencial de Elaborado (Docente), Revisado (Coordinador de Carrera), Verificado (Coordinación Académica) y Aprobado (Vicerrectorado), con códigos DFRM.</w:t>
+      </w:r>
+    </w:p>
+    <w:p xmlns:w="http://schemas.openxmlformats.org/wordprocessingml/2006/main">
+      <w:pPr>
+        <w:pStyle w:val="Normal"/>
+        <w:spacing w:before="60" w:after="60" w:line="360" w:lineRule="auto"/>
+        <w:ind w:left="720" w:firstLine="-360"/>
+        <w:jc w:val="both"/>
+      </w:pPr>
+      <w:r>
+        <w:rPr>
+          <w:rFonts w:ascii="Times New Roman" w:hAnsi="Times New Roman"/>
+          <w:sz w:val="24"/>
+        </w:rPr>
+        <w:t xml:space="preserve">- RF-15 (Emisión y Verificación Pública PDF/QR): Compilación del PEA aprobado en PDF formal con membrete oficial del ISTPET, sello SHA-256 y código QR de verificación pública sin autenticación.</w:t>
+      </w:r>
+    </w:p>
+    <w:p xmlns:w="http://schemas.openxmlformats.org/wordprocessingml/2006/main">
+      <w:pPr>
+        <w:pStyle w:val="Ttulo3"/>
+        <w:spacing w:before="180" w:after="60"/>
+        <w:jc w:val="left"/>
+      </w:pPr>
+      <w:r>
+        <w:rPr>
+          <w:rFonts w:ascii="Times New Roman" w:hAnsi="Times New Roman"/>
+          <w:b/>
+          <w:i/>
+          <w:sz w:val="24"/>
+          <w:color w:val="000000"/>
+        </w:rPr>
+        <w:t>2.2.2. Levantamiento de Requerimientos No Funcionales (RNF)</w:t>
+      </w:r>
+    </w:p>
+    <w:p xmlns:w="http://schemas.openxmlformats.org/wordprocessingml/2006/main">
+      <w:pPr>
+        <w:pStyle w:val="Normal"/>
+        <w:spacing w:before="120" w:after="120" w:line="480" w:lineRule="auto"/>
+        <w:ind w:firstLine="720"/>
+        <w:jc w:val="both"/>
+      </w:pPr>
+      <w:r>
+        <w:rPr>
+          <w:rFonts w:ascii="Times New Roman" w:hAnsi="Times New Roman"/>
+          <w:sz w:val="24"/>
+        </w:rPr>
+        <w:t xml:space="preserve">Se establecieron ocho requerimientos no funcionales orientados a la calidad técnica, rendimiento y seguridad:</w:t>
+      </w:r>
+    </w:p>
+    <w:p xmlns:w="http://schemas.openxmlformats.org/wordprocessingml/2006/main">
+      <w:pPr>
+        <w:pStyle w:val="Normal"/>
+        <w:spacing w:before="60" w:after="60" w:line="360" w:lineRule="auto"/>
+        <w:ind w:left="720" w:firstLine="-360"/>
+        <w:jc w:val="both"/>
+      </w:pPr>
+      <w:r>
+        <w:rPr>
+          <w:rFonts w:ascii="Times New Roman" w:hAnsi="Times New Roman"/>
+          <w:sz w:val="24"/>
+        </w:rPr>
+        <w:t xml:space="preserve">- RNF-01 (Rendimiento): Respuestas de lectura de la API REST inferiores a 250 milisegundos y guardado de secciones del PEA en menos de 1 segundo.</w:t>
+      </w:r>
+    </w:p>
+    <w:p xmlns:w="http://schemas.openxmlformats.org/wordprocessingml/2006/main">
+      <w:pPr>
+        <w:pStyle w:val="Normal"/>
+        <w:spacing w:before="60" w:after="60" w:line="360" w:lineRule="auto"/>
+        <w:ind w:left="720" w:firstLine="-360"/>
+        <w:jc w:val="both"/>
+      </w:pPr>
+      <w:r>
+        <w:rPr>
+          <w:rFonts w:ascii="Times New Roman" w:hAnsi="Times New Roman"/>
+          <w:sz w:val="24"/>
+        </w:rPr>
+        <w:t xml:space="preserve">- RNF-02 (Seguridad en Tránsito y Reposo): Comunicación cifrada bajo HTTPS/TLS 1.3, hashing de contraseñas con BCrypt y prohibición de almacenamiento de claves .p12.</w:t>
+      </w:r>
+    </w:p>
+    <w:p xmlns:w="http://schemas.openxmlformats.org/wordprocessingml/2006/main">
+      <w:pPr>
+        <w:pStyle w:val="Normal"/>
+        <w:spacing w:before="60" w:after="60" w:line="360" w:lineRule="auto"/>
+        <w:ind w:left="720" w:firstLine="-360"/>
+        <w:jc w:val="both"/>
+      </w:pPr>
+      <w:r>
+        <w:rPr>
+          <w:rFonts w:ascii="Times New Roman" w:hAnsi="Times New Roman"/>
+          <w:sz w:val="24"/>
+        </w:rPr>
+        <w:t xml:space="preserve">- RNF-03 (Disponibilidad): Operación en Cloud VPS con disponibilidad mínima del 99.5% durante períodos de planificación curricular.</w:t>
+      </w:r>
+    </w:p>
+    <w:p xmlns:w="http://schemas.openxmlformats.org/wordprocessingml/2006/main">
+      <w:pPr>
+        <w:pStyle w:val="Normal"/>
+        <w:spacing w:before="60" w:after="60" w:line="360" w:lineRule="auto"/>
+        <w:ind w:left="720" w:firstLine="-360"/>
+        <w:jc w:val="both"/>
+      </w:pPr>
+      <w:r>
+        <w:rPr>
+          <w:rFonts w:ascii="Times New Roman" w:hAnsi="Times New Roman"/>
+          <w:sz w:val="24"/>
+        </w:rPr>
+        <w:t xml:space="preserve">- RNF-04 (Integridad Forense - State Locking): Congelamiento irrevocable del PEA en snapshot JSON con hash SHA-256 sobre datos y PDF final, prohibiendo mutaciones retroactivas.</w:t>
+      </w:r>
+    </w:p>
+    <w:p xmlns:w="http://schemas.openxmlformats.org/wordprocessingml/2006/main">
+      <w:pPr>
+        <w:pStyle w:val="Normal"/>
+        <w:spacing w:before="60" w:after="60" w:line="360" w:lineRule="auto"/>
+        <w:ind w:left="720" w:firstLine="-360"/>
+        <w:jc w:val="both"/>
+      </w:pPr>
+      <w:r>
+        <w:rPr>
+          <w:rFonts w:ascii="Times New Roman" w:hAnsi="Times New Roman"/>
+          <w:sz w:val="24"/>
+        </w:rPr>
+        <w:t xml:space="preserve">- RNF-05 (Usabilidad y Estética Profesional): Interfaz basada en Vercel Geist, empleando fondos 100% sólidos sin efectos translúcidos ni transparencias borrosas.</w:t>
+      </w:r>
+    </w:p>
+    <w:p xmlns:w="http://schemas.openxmlformats.org/wordprocessingml/2006/main">
+      <w:pPr>
+        <w:pStyle w:val="Normal"/>
+        <w:spacing w:before="60" w:after="60" w:line="360" w:lineRule="auto"/>
+        <w:ind w:left="720" w:firstLine="-360"/>
+        <w:jc w:val="both"/>
+      </w:pPr>
+      <w:r>
+        <w:rPr>
+          <w:rFonts w:ascii="Times New Roman" w:hAnsi="Times New Roman"/>
+          <w:sz w:val="24"/>
+        </w:rPr>
+        <w:t xml:space="preserve">- RNF-06 (Interoperabilidad Híbrida y Resiliencia): Acceso de solo lectura a SIGAFI sin llaves foráneas bloqueantes en base de datos.</w:t>
+      </w:r>
+    </w:p>
+    <w:p xmlns:w="http://schemas.openxmlformats.org/wordprocessingml/2006/main">
+      <w:pPr>
+        <w:pStyle w:val="Normal"/>
+        <w:spacing w:before="60" w:after="60" w:line="360" w:lineRule="auto"/>
+        <w:ind w:left="720" w:firstLine="-360"/>
+        <w:jc w:val="both"/>
+      </w:pPr>
+      <w:r>
+        <w:rPr>
+          <w:rFonts w:ascii="Times New Roman" w:hAnsi="Times New Roman"/>
+          <w:sz w:val="24"/>
+        </w:rPr>
+        <w:t xml:space="preserve">- RNF-07 (Mantenibilidad Arquitectónica): Estructuración del backend bajo Clean Architecture en cuatro capas desacopladas con pruebas unitarias.</w:t>
+      </w:r>
+    </w:p>
+    <w:p xmlns:w="http://schemas.openxmlformats.org/wordprocessingml/2006/main">
+      <w:pPr>
+        <w:pStyle w:val="Normal"/>
+        <w:spacing w:before="60" w:after="60" w:line="360" w:lineRule="auto"/>
+        <w:ind w:left="720" w:firstLine="-360"/>
+        <w:jc w:val="both"/>
+      </w:pPr>
+      <w:r>
+        <w:rPr>
+          <w:rFonts w:ascii="Times New Roman" w:hAnsi="Times New Roman"/>
+          <w:sz w:val="24"/>
+        </w:rPr>
+        <w:t xml:space="preserve">- RNF-08 (Cumplimiento LOPDP): Registro inalterable de consentimientos informados y auditoría de accesos a datos personales conforme a la LOPDP del Ecuador.</w:t>
+      </w:r>
+    </w:p>
+    <w:p xmlns:w="http://schemas.openxmlformats.org/wordprocessingml/2006/main">
+      <w:pPr>
+        <w:pStyle w:val="Ttulo3"/>
+        <w:spacing w:before="180" w:after="60"/>
+        <w:jc w:val="left"/>
+      </w:pPr>
+      <w:r>
+        <w:rPr>
+          <w:rFonts w:ascii="Times New Roman" w:hAnsi="Times New Roman"/>
+          <w:b/>
+          <w:i/>
+          <w:sz w:val="24"/>
+          <w:color w:val="000000"/>
+        </w:rPr>
+        <w:t>2.2.3. Historias de Usuario (HU)</w:t>
+      </w:r>
+    </w:p>
+    <w:p xmlns:w="http://schemas.openxmlformats.org/wordprocessingml/2006/main">
+      <w:pPr>
+        <w:pStyle w:val="Normal"/>
+        <w:spacing w:before="120" w:after="120" w:line="480" w:lineRule="auto"/>
+        <w:ind w:firstLine="720"/>
+        <w:jc w:val="both"/>
+      </w:pPr>
+      <w:r>
+        <w:rPr>
+          <w:rFonts w:ascii="Times New Roman" w:hAnsi="Times New Roman"/>
+          <w:sz w:val="24"/>
+        </w:rPr>
+        <w:t xml:space="preserve">HU-01: Formulación y Validación Horaria del PEA. Como Docente Elaborador, quiero formular las unidades temáticas y prácticas del PEA en el editor interactivo para planificar mi asignatura cumpliendo con las horas normadas en la malla. Criterio de Aceptación: Dado que el docente ingresa horas de docencia, APE y autónomo para cada unidad; Cuando la suma total difiere de las horas oficiales en detallemallas; Entonces el sistema bloquea el botón de envío a revisión y muestra una alerta visual con la discrepancia matemática exacta.</w:t>
+      </w:r>
+    </w:p>
+    <w:p xmlns:w="http://schemas.openxmlformats.org/wordprocessingml/2006/main">
+      <w:pPr>
+        <w:pStyle w:val="Normal"/>
+        <w:spacing w:before="120" w:after="120" w:line="480" w:lineRule="auto"/>
+        <w:ind w:firstLine="720"/>
+        <w:jc w:val="both"/>
+      </w:pPr>
+      <w:r>
+        <w:rPr>
+          <w:rFonts w:ascii="Times New Roman" w:hAnsi="Times New Roman"/>
+          <w:sz w:val="24"/>
+        </w:rPr>
+        <w:t xml:space="preserve">HU-02: Co-Redacción Concurrente en Cátedra Compartida. Como Docente Co-autor, quiero editar simultáneamente los contenidos del PEA junto con el docente líder para coordinar la planificación paralela sin pisar cambios ajenos. Criterio de Aceptación: Dado que dos docentes tienen la misma materia abierta en el editor; Cuando el docente A modifica la metodología y el docente B actualiza la bibliografía; Entonces los cambios se fusionan automáticamente en tiempo real sin requerir recargar la página ni generar conflictos de archivo.</w:t>
+      </w:r>
+    </w:p>
+    <w:p xmlns:w="http://schemas.openxmlformats.org/wordprocessingml/2006/main">
+      <w:pPr>
+        <w:pStyle w:val="Normal"/>
+        <w:spacing w:before="120" w:after="120" w:line="480" w:lineRule="auto"/>
+        <w:ind w:firstLine="720"/>
+        <w:jc w:val="both"/>
+      </w:pPr>
+      <w:r>
+        <w:rPr>
+          <w:rFonts w:ascii="Times New Roman" w:hAnsi="Times New Roman"/>
+          <w:sz w:val="24"/>
+        </w:rPr>
+        <w:t xml:space="preserve">HU-03: Revisión Disciplinar y Formulación de Observaciones. Como Coordinador de Carrera, quiero revisar el PEA formulado y emitir observaciones técnicas por sección para asegurar la calidad académica antes de otorgar el aval. Criterio de Aceptación: Dado un PEA en estado 'EnRevision'; Cuando el coordinador detecta inconsistencias en la Sección f (Contenidos); Entonces puede redactar una observación asociada a dicha sección, cambiando el estado del PEA a 'Observado' y notificando al docente autor.</w:t>
+      </w:r>
+    </w:p>
+    <w:p xmlns:w="http://schemas.openxmlformats.org/wordprocessingml/2006/main">
+      <w:pPr>
+        <w:pStyle w:val="Normal"/>
+        <w:spacing w:before="120" w:after="120" w:line="480" w:lineRule="auto"/>
+        <w:ind w:firstLine="720"/>
+        <w:jc w:val="both"/>
+      </w:pPr>
+      <w:r>
+        <w:rPr>
+          <w:rFonts w:ascii="Times New Roman" w:hAnsi="Times New Roman"/>
+          <w:sz w:val="24"/>
+        </w:rPr>
+        <w:t xml:space="preserve">HU-04: Verificación Metodológica y Cuadre Institucional. Como Coordinador Académico, quiero verificar la coherencia metodológica y el cuadre horológico global para dar conformidad institucional previa a la aprobación final. Criterio de Aceptación: Dado un PEA con aval favorable de carrera; Cuando la coordinación académica valida que las horas y ponderaciones evaluativas son correctas; Entonces estampa su firma electrónica DFRM y transiciona el documento a 'RevisadoAcad' habilitando la firma de Vicerrectorado.</w:t>
+      </w:r>
+    </w:p>
+    <w:p xmlns:w="http://schemas.openxmlformats.org/wordprocessingml/2006/main">
+      <w:pPr>
+        <w:pStyle w:val="Normal"/>
+        <w:spacing w:before="120" w:after="120" w:line="480" w:lineRule="auto"/>
+        <w:ind w:firstLine="720"/>
+        <w:jc w:val="both"/>
+      </w:pPr>
+      <w:r>
+        <w:rPr>
+          <w:rFonts w:ascii="Times New Roman" w:hAnsi="Times New Roman"/>
+          <w:sz w:val="24"/>
+        </w:rPr>
+        <w:t xml:space="preserve">HU-05: Aprobación Definitiva y Congelamiento Forense. Como Vicerrector Académico, quiero aprobar formalmente el PEA mediante firma digital institucional para legalizar el documento y congelarlo para auditoría CACES. Criterio de Aceptación: Dado un PEA en estado 'RevisadoAcad'; Cuando el Vicerrector firma la aprobación; Entonces el sistema estampa la cuarta firma, congela el snapshot JSON con hash SHA-256, genera el PDF oficial con código QR y cambia el estado a 'Aprobado' de forma inmutable.</w:t>
+      </w:r>
+    </w:p>
+    <w:p xmlns:w="http://schemas.openxmlformats.org/wordprocessingml/2006/main">
+      <w:pPr>
+        <w:pStyle w:val="Normal"/>
+        <w:spacing w:before="120" w:after="120" w:line="480" w:lineRule="auto"/>
+        <w:ind w:firstLine="720"/>
+        <w:jc w:val="both"/>
+      </w:pPr>
+      <w:r>
+        <w:rPr>
+          <w:rFonts w:ascii="Times New Roman" w:hAnsi="Times New Roman"/>
+          <w:sz w:val="24"/>
+        </w:rPr>
+        <w:t xml:space="preserve">HU-06: Verificación Pública de Autenticidad QR. Como Par Evaluador del CACES o Autoridad Educativa, quiero escanear el código QR del PEA impreso para validar que el documento presentado es legítimo y no fue adulterado. Criterio de Aceptación: Dado un código QR en el pie de página del PEA; Cuando se escanea con la cámara de un teléfono; Entonces el navegador abre una página pública segura del ISTPET mostrando el título de la materia, docente autor, fechas de las 4 firmas, hash SHA-256 y enlace al documento oficial sin requerir inicio de sesión.</w:t>
+      </w:r>
+    </w:p>
+    <w:p xmlns:w="http://schemas.openxmlformats.org/wordprocessingml/2006/main">
+      <w:pPr>
+        <w:pStyle w:val="Ttulo3"/>
+        <w:spacing w:before="180" w:after="60"/>
+        <w:jc w:val="left"/>
+      </w:pPr>
+      <w:r>
+        <w:rPr>
+          <w:rFonts w:ascii="Times New Roman" w:hAnsi="Times New Roman"/>
+          <w:b/>
+          <w:i/>
+          <w:sz w:val="24"/>
+          <w:color w:val="000000"/>
+        </w:rPr>
+        <w:t>2.2.4. Análisis de la Frontera de Integración con SIGAFI</w:t>
+      </w:r>
+    </w:p>
+    <w:p xmlns:w="http://schemas.openxmlformats.org/wordprocessingml/2006/main">
+      <w:pPr>
+        <w:pStyle w:val="Normal"/>
+        <w:spacing w:before="120" w:after="120" w:line="480" w:lineRule="auto"/>
+        <w:ind w:firstLine="720"/>
+        <w:jc w:val="both"/>
+      </w:pPr>
+      <w:r>
+        <w:rPr>
+          <w:rFonts w:ascii="Times New Roman" w:hAnsi="Times New Roman"/>
+          <w:sz w:val="24"/>
+        </w:rPr>
+        <w:t xml:space="preserve">Un aspecto metodológico crucial del proyecto fue definir la frontera de integración entre la base de datos preexistente del instituto (sigafi_es) y el módulo curricular DOSIER. Para no interferir con las operaciones académicas diarias ni generar bloqueos de concurrencia en secretaría, se definió un aislamiento de estricta solo lectura.</w:t>
+      </w:r>
+    </w:p>
+    <w:p xmlns:w="http://schemas.openxmlformats.org/wordprocessingml/2006/main">
+      <w:pPr>
+        <w:pStyle w:val="Normal"/>
+        <w:spacing w:before="120" w:after="120" w:line="480" w:lineRule="auto"/>
+        <w:ind w:firstLine="720"/>
+        <w:jc w:val="both"/>
+      </w:pPr>
+      <w:r>
+        <w:rPr>
+          <w:rFonts w:ascii="Times New Roman" w:hAnsi="Times New Roman"/>
+          <w:sz w:val="24"/>
+        </w:rPr>
+        <w:t xml:space="preserve">El sistema filtra de manera obligatoria las carreras institucionales aplicando la cláusula 'esInstituto = 1', aislando las ofertas de conducción u otros programas independientes. Las entidades de SIGAFI consumidas (carreras, periodos, mallas, detallemallas, profesores y asignacion_materias) son consultadas mediante Entity Framework Core exclusivamente con el operador AsNoTracking(), garantizando un rendimiento óptimo de lectura y eliminando cualquier riesgo de mutación accidental en los datos legados.</w:t>
+      </w:r>
+    </w:p>
+    <w:p xmlns:w="http://schemas.openxmlformats.org/wordprocessingml/2006/main">
       <w:pPr>
         <w:pStyle w:val="Ttulo2"/>
-        <w:numPr>
-          <w:ilvl w:val="1"/>
-          <w:numId w:val="4"/>
-        </w:numPr>
-      </w:pPr>
-      <w:bookmarkStart w:id="7" w:name="_Toc87262806"/>
-      <w:r>
-        <w:t>Diseño (construcción)</w:t>
-      </w:r>
-      <w:bookmarkEnd w:id="7"/>
-    </w:p>
-    <w:p>
+        <w:spacing w:before="240" w:after="120"/>
+        <w:jc w:val="left"/>
+      </w:pPr>
+      <w:r>
+        <w:rPr>
+          <w:rFonts w:ascii="Times New Roman" w:hAnsi="Times New Roman"/>
+          <w:b/>
+          <w:sz w:val="26"/>
+          <w:color w:val="000000"/>
+        </w:rPr>
+        <w:t>2.3. Diseño (construcción)</w:t>
+      </w:r>
+    </w:p>
+    <w:p xmlns:w="http://schemas.openxmlformats.org/wordprocessingml/2006/main">
+      <w:pPr>
+        <w:pStyle w:val="Normal"/>
+        <w:spacing w:before="120" w:after="120" w:line="480" w:lineRule="auto"/>
+        <w:ind w:firstLine="720"/>
+        <w:jc w:val="both"/>
+      </w:pPr>
+      <w:r>
+        <w:rPr>
+          <w:rFonts w:ascii="Times New Roman" w:hAnsi="Times New Roman"/>
+          <w:sz w:val="24"/>
+        </w:rPr>
+        <w:t xml:space="preserve">La fase de diseño y construcción materializó las especificaciones funcionales en artefactos de arquitectura de software, modelos de datos relacionales normalizados, interfaces de usuario y servicios web.</w:t>
+      </w:r>
+    </w:p>
+    <w:p xmlns:w="http://schemas.openxmlformats.org/wordprocessingml/2006/main">
+      <w:pPr>
+        <w:pStyle w:val="Ttulo3"/>
+        <w:spacing w:before="180" w:after="60"/>
+        <w:jc w:val="left"/>
+      </w:pPr>
+      <w:r>
+        <w:rPr>
+          <w:rFonts w:ascii="Times New Roman" w:hAnsi="Times New Roman"/>
+          <w:b/>
+          <w:i/>
+          <w:sz w:val="24"/>
+          <w:color w:val="000000"/>
+        </w:rPr>
+        <w:t>2.3.1. Diseño Arquitectónico del Sistema (Modelo C4)</w:t>
+      </w:r>
+    </w:p>
+    <w:p xmlns:w="http://schemas.openxmlformats.org/wordprocessingml/2006/main">
+      <w:pPr>
+        <w:pStyle w:val="Normal"/>
+        <w:spacing w:before="120" w:after="120" w:line="480" w:lineRule="auto"/>
+        <w:ind w:firstLine="720"/>
+        <w:jc w:val="both"/>
+      </w:pPr>
+      <w:r>
+        <w:rPr>
+          <w:rFonts w:ascii="Times New Roman" w:hAnsi="Times New Roman"/>
+          <w:sz w:val="24"/>
+        </w:rPr>
+        <w:t xml:space="preserve">Diagrama de Contexto (Nivel 1): El sistema DOSIER interactúa con seis actores institucionales: Docente Elaborador, Coordinador de Carrera, Coordinador Académico, Vicerrector Académico, Administrador del Sistema y Evaluador Externo del CACES. Asimismo, se conecta con dos sistemas de soporte: SIGAFI (proveedor de datos de solo lectura) y el servidor de correo SMTP institucional.</w:t>
+      </w:r>
+    </w:p>
+    <w:p xmlns:w="http://schemas.openxmlformats.org/wordprocessingml/2006/main">
+      <w:pPr>
+        <w:pStyle w:val="Normal"/>
+        <w:spacing w:before="120" w:after="120" w:line="480" w:lineRule="auto"/>
+        <w:ind w:firstLine="720"/>
+        <w:jc w:val="both"/>
+      </w:pPr>
+      <w:r>
+        <w:rPr>
+          <w:rFonts w:ascii="Times New Roman" w:hAnsi="Times New Roman"/>
+          <w:sz w:val="24"/>
+        </w:rPr>
+        <w:t xml:space="preserve">Diagrama de Contenedores (Nivel 2): La solución se descompone en tres contenedores: 1) El Cliente Web SPA (dosier_web), desarrollado en React 18 con Vite y TypeScript, ejecutado en el navegador del usuario y estilizado con Tailwind CSS y el sistema Geist; 2) El Backend API Gateway (dosier_api), desarrollado en ASP.NET Core Web API sobre .NET 8 bajo Clean Architecture, que expone endpoints RESTful en snake_case y hospeda los hubs de SignalR; y 3) La Base de Datos Relacional (sigafi_es), administrada en MySQL 8.0 / MariaDB 10.5+, que alberga el esquema de solo lectura de SIGAFI y las tablas del núcleo curricular DOSIER.</w:t>
+      </w:r>
+    </w:p>
+    <w:p xmlns:w="http://schemas.openxmlformats.org/wordprocessingml/2006/main">
+      <w:pPr>
+        <w:pStyle w:val="Ttulo3"/>
+        <w:spacing w:before="180" w:after="60"/>
+        <w:jc w:val="left"/>
+      </w:pPr>
+      <w:r>
+        <w:rPr>
+          <w:rFonts w:ascii="Times New Roman" w:hAnsi="Times New Roman"/>
+          <w:b/>
+          <w:i/>
+          <w:sz w:val="24"/>
+          <w:color w:val="000000"/>
+        </w:rPr>
+        <w:t>2.3.2. Diseño de Base de Datos Relacional (Modelo Consolidado de 20 Tablas)</w:t>
+      </w:r>
+    </w:p>
+    <w:p xmlns:w="http://schemas.openxmlformats.org/wordprocessingml/2006/main">
+      <w:pPr>
+        <w:pStyle w:val="Normal"/>
+        <w:spacing w:before="120" w:after="120" w:line="480" w:lineRule="auto"/>
+        <w:ind w:firstLine="720"/>
+        <w:jc w:val="both"/>
+      </w:pPr>
+      <w:r>
+        <w:rPr>
+          <w:rFonts w:ascii="Times New Roman" w:hAnsi="Times New Roman"/>
+          <w:sz w:val="24"/>
+        </w:rPr>
+        <w:t xml:space="preserve">El modelo de base de datos de DOSIER se consolidó en un esquema relacional maestro depurado compuesto por exactamente 20 tablas estructuradas bajo el prefijo institucional 'doc_', prescindiendo de identificadores UUID (empleando exclusivamente claves numéricas INT AUTO_INCREMENT), triggers, vistas y tablas efímeras de sincronización. Este modelo se organiza en cuatro módulos funcionales:</w:t>
+      </w:r>
+    </w:p>
+    <w:p xmlns:w="http://schemas.openxmlformats.org/wordprocessingml/2006/main">
+      <w:pPr>
+        <w:pStyle w:val="Normal"/>
+        <w:spacing w:before="120" w:after="120" w:line="480" w:lineRule="auto"/>
+        <w:ind w:firstLine="720"/>
+        <w:jc w:val="both"/>
+      </w:pPr>
+      <w:r>
+        <w:rPr>
+          <w:rFonts w:ascii="Times New Roman" w:hAnsi="Times New Roman"/>
+          <w:sz w:val="24"/>
+        </w:rPr>
+        <w:t xml:space="preserve">Módulo 1: Marco de Gobernanza Curricular Institucional (7 tablas). 1) doc_normativas; 2) doc_normativa_articulos; 3) doc_modelos_educativos; 4) doc_proyectos_curriculares; 5) doc_perfiles_egreso; 6) doc_perfil_egreso_resultados; 7) doc_asignatura_resultado_perfil.</w:t>
+      </w:r>
+    </w:p>
+    <w:p xmlns:w="http://schemas.openxmlformats.org/wordprocessingml/2006/main">
+      <w:pPr>
+        <w:pStyle w:val="Normal"/>
+        <w:spacing w:before="120" w:after="120" w:line="480" w:lineRule="auto"/>
+        <w:ind w:firstLine="720"/>
+        <w:jc w:val="both"/>
+      </w:pPr>
+      <w:r>
+        <w:rPr>
+          <w:rFonts w:ascii="Times New Roman" w:hAnsi="Times New Roman"/>
+          <w:sz w:val="24"/>
+        </w:rPr>
+        <w:t xml:space="preserve">Módulo 2: Expediente Académico Maestro (2 tablas). 8) doc_expedientes_curriculares: Expediente contenedor maestro que agrupa la materia, carrera, malla, nivel, paralelo y docente líder en un período lectivo; 9) doc_expediente_asignaciones: Mapeo formal de docentes y paralelos asignados desde el distributivo de asignaciones_profesores de SIGAFI.</w:t>
+      </w:r>
+    </w:p>
+    <w:p xmlns:w="http://schemas.openxmlformats.org/wordprocessingml/2006/main">
+      <w:pPr>
+        <w:pStyle w:val="Normal"/>
+        <w:spacing w:before="120" w:after="120" w:line="480" w:lineRule="auto"/>
+        <w:ind w:firstLine="720"/>
+        <w:jc w:val="both"/>
+      </w:pPr>
+      <w:r>
+        <w:rPr>
+          <w:rFonts w:ascii="Times New Roman" w:hAnsi="Times New Roman"/>
+          <w:sz w:val="24"/>
+        </w:rPr>
+        <w:t xml:space="preserve">Módulo 3: Arquitectura Pedagógica Oficial del PEA (8 tablas). 10) doc_pea: Cabecera pedagógica del PEA con balance horológico (CD, APE, AA), créditos, objetivos, metodología, recursos didácticos y máquina de estados; 11) doc_pea_prerrequisitos (Sección c); 12) doc_pea_unidades (Sección f); 13) doc_pea_temas (Sección f); 14) doc_pea_resultados_aprendizaje (Secciones d y e); 15) doc_pea_actividades_practicas (Sección h); 16) doc_pea_evaluaciones (Sección i); 17) doc_pea_bibliografia (Sección j).</w:t>
+      </w:r>
+    </w:p>
+    <w:p xmlns:w="http://schemas.openxmlformats.org/wordprocessingml/2006/main">
+      <w:pPr>
+        <w:pStyle w:val="Normal"/>
+        <w:spacing w:before="120" w:after="120" w:line="480" w:lineRule="auto"/>
+        <w:ind w:firstLine="720"/>
+        <w:jc w:val="both"/>
+      </w:pPr>
+      <w:r>
+        <w:rPr>
+          <w:rFonts w:ascii="Times New Roman" w:hAnsi="Times New Roman"/>
+          <w:sz w:val="24"/>
+        </w:rPr>
+        <w:t xml:space="preserve">Módulo 4: Circuito de Calidad, Auditoría y Firmas Digitales (3 tablas). 18) doc_pea_observaciones: Bandeja de observaciones técnicas y metodológicas formuladas por comisiones de revisión; 19) doc_pea_trazabilidad: Bitácora cronológica inmutable de transiciones de estado y auditoría forense; 20) doc_documentos_firmas: Registro formal de firmas electrónicas de responsabilidad institucional con marcas temporales UTC, código visible DFRM y certificado digital.</w:t>
+      </w:r>
+    </w:p>
+    <w:p xmlns:w="http://schemas.openxmlformats.org/wordprocessingml/2006/main">
+      <w:pPr>
+        <w:pStyle w:val="Ttulo3"/>
+        <w:spacing w:before="180" w:after="60"/>
+        <w:jc w:val="left"/>
+      </w:pPr>
+      <w:r>
+        <w:rPr>
+          <w:rFonts w:ascii="Times New Roman" w:hAnsi="Times New Roman"/>
+          <w:b/>
+          <w:i/>
+          <w:sz w:val="24"/>
+          <w:color w:val="000000"/>
+        </w:rPr>
+        <w:t>2.3.3. Diccionario de Datos del Modelo Consolidado</w:t>
+      </w:r>
+    </w:p>
+    <w:p xmlns:w="http://schemas.openxmlformats.org/wordprocessingml/2006/main">
+      <w:pPr>
+        <w:pStyle w:val="Normal"/>
+        <w:spacing w:before="120" w:after="120" w:line="480" w:lineRule="auto"/>
+        <w:ind w:firstLine="720"/>
+        <w:jc w:val="both"/>
+      </w:pPr>
+      <w:r>
+        <w:rPr>
+          <w:rFonts w:ascii="Times New Roman" w:hAnsi="Times New Roman"/>
+          <w:sz w:val="24"/>
+        </w:rPr>
+        <w:t xml:space="preserve">A continuación se resume la especificación técnica de las tablas principales que conforman el núcleo de datos del PEA:</w:t>
+      </w:r>
+    </w:p>
+    <w:p xmlns:w="http://schemas.openxmlformats.org/wordprocessingml/2006/main">
+      <w:pPr>
+        <w:pStyle w:val="Normal"/>
+        <w:spacing w:before="60" w:after="60" w:line="360" w:lineRule="auto"/>
+        <w:ind w:left="720" w:firstLine="-360"/>
+        <w:jc w:val="both"/>
+      </w:pPr>
+      <w:r>
+        <w:rPr>
+          <w:rFonts w:ascii="Times New Roman" w:hAnsi="Times New Roman"/>
+          <w:sz w:val="24"/>
+        </w:rPr>
+        <w:t xml:space="preserve">- Tabla 'doc_pea': Clave Primaria idPea (INT AUTO_INCREMENT). Claves Foráneas: idExpediente (INT), idCarrera (INT), idAsignatura (INT), idPeriodo (CHAR(7)). Atributos: totalHorasAsignatura (INT), creditos (DECIMAL(4,2)), horasContactoDocente (INT), horasPracticoExperimental (INT), horasAutonomo (INT), objetivoAsignatura (TEXT), metodologiaEnsenanza (TEXT), recursosDidacticos (TEXT), evaluacionAprendizaje (TEXT), estado (ENUM: Borrador, EnRevision, RevisadoCoord, RevisadoAcad, Observado, Corregido, Aprobado), version (INT).</w:t>
+      </w:r>
+    </w:p>
+    <w:p xmlns:w="http://schemas.openxmlformats.org/wordprocessingml/2006/main">
+      <w:pPr>
+        <w:pStyle w:val="Normal"/>
+        <w:spacing w:before="60" w:after="60" w:line="360" w:lineRule="auto"/>
+        <w:ind w:left="720" w:firstLine="-360"/>
+        <w:jc w:val="both"/>
+      </w:pPr>
+      <w:r>
+        <w:rPr>
+          <w:rFonts w:ascii="Times New Roman" w:hAnsi="Times New Roman"/>
+          <w:sz w:val="24"/>
+        </w:rPr>
+        <w:t xml:space="preserve">- Tabla 'doc_pea_unidades': Clave Primaria idUnidad (INT AUTO_INCREMENT). Clave Foránea: idPea (INT, ON DELETE CASCADE). Atributos: numeroUnidad (INT), nombreUnidad (VARCHAR(255)), totalHorasUnidad (INT), horasDocencia (INT), horasPracticoExp (INT), horasAutonomo (INT), orden (INT).</w:t>
+      </w:r>
+    </w:p>
+    <w:p xmlns:w="http://schemas.openxmlformats.org/wordprocessingml/2006/main">
+      <w:pPr>
+        <w:pStyle w:val="Normal"/>
+        <w:spacing w:before="60" w:after="60" w:line="360" w:lineRule="auto"/>
+        <w:ind w:left="720" w:firstLine="-360"/>
+        <w:jc w:val="both"/>
+      </w:pPr>
+      <w:r>
+        <w:rPr>
+          <w:rFonts w:ascii="Times New Roman" w:hAnsi="Times New Roman"/>
+          <w:sz w:val="24"/>
+        </w:rPr>
+        <w:t xml:space="preserve">- Tabla 'doc_pea_temas': Clave Primaria idTema (INT AUTO_INCREMENT). Clave Foránea: idUnidad (INT, ON DELETE CASCADE). Atributos: numeroTema (INT), tituloTema (VARCHAR(255)), descripcionSubtemas (TEXT), orden (INT).</w:t>
+      </w:r>
+    </w:p>
+    <w:p xmlns:w="http://schemas.openxmlformats.org/wordprocessingml/2006/main">
+      <w:pPr>
+        <w:pStyle w:val="Normal"/>
+        <w:spacing w:before="60" w:after="60" w:line="360" w:lineRule="auto"/>
+        <w:ind w:left="720" w:firstLine="-360"/>
+        <w:jc w:val="both"/>
+      </w:pPr>
+      <w:r>
+        <w:rPr>
+          <w:rFonts w:ascii="Times New Roman" w:hAnsi="Times New Roman"/>
+          <w:sz w:val="24"/>
+        </w:rPr>
+        <w:t xml:space="preserve">- Tabla 'doc_pea_actividades_practicas': Clave Primaria idPractica (INT AUTO_INCREMENT). Claves Foráneas: idPea (INT, ON DELETE CASCADE), idUnidad (INT). Atributos: numeroPractica (INT), nombrePractica (VARCHAR(255)), caracterizacion (TEXT), duracionHoras (INT), orden (INT).</w:t>
+      </w:r>
+    </w:p>
+    <w:p xmlns:w="http://schemas.openxmlformats.org/wordprocessingml/2006/main">
+      <w:pPr>
+        <w:pStyle w:val="Normal"/>
+        <w:spacing w:before="60" w:after="60" w:line="360" w:lineRule="auto"/>
+        <w:ind w:left="720" w:firstLine="-360"/>
+        <w:jc w:val="both"/>
+      </w:pPr>
+      <w:r>
+        <w:rPr>
+          <w:rFonts w:ascii="Times New Roman" w:hAnsi="Times New Roman"/>
+          <w:sz w:val="24"/>
+        </w:rPr>
+        <w:t xml:space="preserve">- Tabla 'doc_pea_evaluaciones': Clave Primaria idEvaluacion (INT AUTO_INCREMENT). Clave Foránea: idPea (INT, ON DELETE CASCADE). Atributos: denominacion (VARCHAR(100)), tipoEvaluacion (TEXT), calificacionMaxima (DECIMAL(4,1) DEFAULT 10.0), orden (INT).</w:t>
+      </w:r>
+    </w:p>
+    <w:p xmlns:w="http://schemas.openxmlformats.org/wordprocessingml/2006/main">
+      <w:pPr>
+        <w:pStyle w:val="Normal"/>
+        <w:spacing w:before="60" w:after="60" w:line="360" w:lineRule="auto"/>
+        <w:ind w:left="720" w:firstLine="-360"/>
+        <w:jc w:val="both"/>
+      </w:pPr>
+      <w:r>
+        <w:rPr>
+          <w:rFonts w:ascii="Times New Roman" w:hAnsi="Times New Roman"/>
+          <w:sz w:val="24"/>
+        </w:rPr>
+        <w:t xml:space="preserve">- Tabla 'doc_pea_bibliografia': Clave Primaria idBiblio (INT AUTO_INCREMENT). Clave Foránea: idPea (INT, ON DELETE CASCADE). Atributos: tipoBibliografia (ENUM: Basica, Consulta, Virtual), autor (VARCHAR(255)), anio (INT), tituloLibro (VARCHAR(500)), isbn (VARCHAR(50)), urlRecurso (VARCHAR(512)), citaCompletaApa (TEXT), orden (INT).</w:t>
+      </w:r>
+    </w:p>
+    <w:p xmlns:w="http://schemas.openxmlformats.org/wordprocessingml/2006/main">
+      <w:pPr>
+        <w:pStyle w:val="Normal"/>
+        <w:spacing w:before="60" w:after="60" w:line="360" w:lineRule="auto"/>
+        <w:ind w:left="720" w:firstLine="-360"/>
+        <w:jc w:val="both"/>
+      </w:pPr>
+      <w:r>
+        <w:rPr>
+          <w:rFonts w:ascii="Times New Roman" w:hAnsi="Times New Roman"/>
+          <w:sz w:val="24"/>
+        </w:rPr>
+        <w:t xml:space="preserve">- Tabla 'doc_pea_observaciones': Clave Primaria idObservacion (INT AUTO_INCREMENT). Clave Foránea: idPea (INT, ON DELETE CASCADE). Atributos: idUsuarioObservador (INT), rolObservador (VARCHAR(50)), seccionAfectada (VARCHAR(100)), textoObservacion (TEXT), estado (ENUM: Pendiente, Subsanada, Desestimada), respuestaDocente (TEXT), fechaObservacion (TIMESTAMP), fechaResolucion (DATETIME).</w:t>
+      </w:r>
+    </w:p>
+    <w:p xmlns:w="http://schemas.openxmlformats.org/wordprocessingml/2006/main">
+      <w:pPr>
+        <w:pStyle w:val="Normal"/>
+        <w:spacing w:before="60" w:after="60" w:line="360" w:lineRule="auto"/>
+        <w:ind w:left="720" w:firstLine="-360"/>
+        <w:jc w:val="both"/>
+      </w:pPr>
+      <w:r>
+        <w:rPr>
+          <w:rFonts w:ascii="Times New Roman" w:hAnsi="Times New Roman"/>
+          <w:sz w:val="24"/>
+        </w:rPr>
+        <w:t xml:space="preserve">- Tabla 'doc_documentos_firmas': Clave Primaria idFirma (INT AUTO_INCREMENT). Clave Foránea: idPea (INT, ON DELETE CASCADE). Atributos: idUsuarioFirmante (INT), rolFirmante (VARCHAR(50)), fechaFirma (TIMESTAMP), codigoVerificacion (VARCHAR(50) UNIQUE), hashDocumento (VARCHAR(64)), firmaDigitalBase64 (TEXT), ipOrigen (VARCHAR(45)), esValida (TINYINT(1)).</w:t>
+      </w:r>
+    </w:p>
+    <w:p xmlns:w="http://schemas.openxmlformats.org/wordprocessingml/2006/main">
+      <w:pPr>
+        <w:pStyle w:val="Ttulo3"/>
+        <w:spacing w:before="180" w:after="60"/>
+        <w:jc w:val="left"/>
+      </w:pPr>
+      <w:r>
+        <w:rPr>
+          <w:rFonts w:ascii="Times New Roman" w:hAnsi="Times New Roman"/>
+          <w:b/>
+          <w:i/>
+          <w:sz w:val="24"/>
+          <w:color w:val="000000"/>
+        </w:rPr>
+        <w:t>2.3.4. Diseño de Interfaces de Usuario (Shell DOSIERBuilder y Editor Geist)</w:t>
+      </w:r>
+    </w:p>
+    <w:p xmlns:w="http://schemas.openxmlformats.org/wordprocessingml/2006/main">
+      <w:pPr>
+        <w:pStyle w:val="Normal"/>
+        <w:spacing w:before="120" w:after="120" w:line="480" w:lineRule="auto"/>
+        <w:ind w:firstLine="720"/>
+        <w:jc w:val="both"/>
+      </w:pPr>
+      <w:r>
+        <w:rPr>
+          <w:rFonts w:ascii="Times New Roman" w:hAnsi="Times New Roman"/>
+          <w:sz w:val="24"/>
+        </w:rPr>
+        <w:t xml:space="preserve">La interfaz implementa el contenedor DOSIERBuilder estructurado en cuatro cuadrantes: 1) Barra Superior Institucional con membrete del ISTPET y contexto de materia; 2) Stepper Visual de Firmas y Estados con línea de tiempo interactiva; 3) Navegador de Secciones Pedagógicas para conmutar entre las once secciones reglamentarias del PEA; y 4) Área de Trabajo Central y Barra Lateral de Observaciones.</w:t>
+      </w:r>
+    </w:p>
+    <w:p xmlns:w="http://schemas.openxmlformats.org/wordprocessingml/2006/main">
+      <w:pPr>
+        <w:pStyle w:val="Ttulo3"/>
+        <w:spacing w:before="180" w:after="60"/>
+        <w:jc w:val="left"/>
+      </w:pPr>
+      <w:r>
+        <w:rPr>
+          <w:rFonts w:ascii="Times New Roman" w:hAnsi="Times New Roman"/>
+          <w:b/>
+          <w:i/>
+          <w:sz w:val="24"/>
+          <w:color w:val="000000"/>
+        </w:rPr>
+        <w:t>2.3.5. Construcción del Software e Implementación Técnica</w:t>
+      </w:r>
+    </w:p>
+    <w:p xmlns:w="http://schemas.openxmlformats.org/wordprocessingml/2006/main">
+      <w:pPr>
+        <w:pStyle w:val="Normal"/>
+        <w:spacing w:before="120" w:after="120" w:line="480" w:lineRule="auto"/>
+        <w:ind w:firstLine="720"/>
+        <w:jc w:val="both"/>
+      </w:pPr>
+      <w:r>
+        <w:rPr>
+          <w:rFonts w:ascii="Times New Roman" w:hAnsi="Times New Roman"/>
+          <w:sz w:val="24"/>
+        </w:rPr>
+        <w:t xml:space="preserve">La implementación técnica en el backend se ejecutó en C# bajo .NET 8, organizando el código en Clean Architecture: dosier_domain (entidades y reglas), dosier_application (casos de uso, PeaService, CurricularValidationEngine), dosier_infrastructure (EF Core 9, Pomelo MySQL, iText 9, firmas digitales) y dosier_api (controladores RESTful en snake_case securizados con JWT).</w:t>
+      </w:r>
+    </w:p>
+    <w:p xmlns:w="http://schemas.openxmlformats.org/wordprocessingml/2006/main">
       <w:pPr>
         <w:pStyle w:val="Ttulo2"/>
-        <w:numPr>
-          <w:ilvl w:val="1"/>
-          <w:numId w:val="4"/>
-        </w:numPr>
-      </w:pPr>
-      <w:bookmarkStart w:id="8" w:name="_Toc87262807"/>
-      <w:r>
-        <w:t>Presupuesto</w:t>
-      </w:r>
-      <w:bookmarkEnd w:id="8"/>
-    </w:p>
-    <w:p/>
-    <w:p/>
-    <w:p/>
-    <w:p/>
-    <w:p/>
-    <w:p/>
-    <w:p/>
-    <w:p/>
-    <w:p/>
-    <w:p/>
-    <w:p/>
-    <w:p/>
-    <w:p/>
-    <w:p>
-      <w:pPr>
-        <w:pStyle w:val="Ttulo2"/>
-        <w:rPr>
-          <w:rFonts w:cs="Times New Roman"/>
-        </w:rPr>
-      </w:pPr>
-    </w:p>
-    <w:p/>
-    <w:p/>
+        <w:spacing w:before="240" w:after="120"/>
+        <w:jc w:val="left"/>
+      </w:pPr>
+      <w:r>
+        <w:rPr>
+          <w:rFonts w:ascii="Times New Roman" w:hAnsi="Times New Roman"/>
+          <w:b/>
+          <w:sz w:val="26"/>
+          <w:color w:val="000000"/>
+        </w:rPr>
+        <w:t>2.4. Presupuesto del Proyecto</w:t>
+      </w:r>
+    </w:p>
+    <w:p xmlns:w="http://schemas.openxmlformats.org/wordprocessingml/2006/main">
+      <w:pPr>
+        <w:pStyle w:val="Normal"/>
+        <w:spacing w:before="120" w:after="120" w:line="480" w:lineRule="auto"/>
+        <w:ind w:firstLine="720"/>
+        <w:jc w:val="both"/>
+      </w:pPr>
+      <w:r>
+        <w:rPr>
+          <w:rFonts w:ascii="Times New Roman" w:hAnsi="Times New Roman"/>
+          <w:sz w:val="24"/>
+        </w:rPr>
+        <w:t xml:space="preserve">El presupuesto detallado para la implementación de DOSIER en el ISTPET durante 12 meses contempla:</w:t>
+      </w:r>
+    </w:p>
+    <w:p xmlns:w="http://schemas.openxmlformats.org/wordprocessingml/2006/main">
+      <w:pPr>
+        <w:pStyle w:val="Normal"/>
+        <w:spacing w:before="120" w:after="120" w:line="480" w:lineRule="auto"/>
+        <w:ind w:firstLine="720"/>
+        <w:jc w:val="both"/>
+      </w:pPr>
+      <w:r>
+        <w:rPr>
+          <w:rFonts w:ascii="Times New Roman" w:hAnsi="Times New Roman"/>
+          <w:sz w:val="24"/>
+        </w:rPr>
+        <w:t xml:space="preserve">1. Recursos Humanos de Ingeniería: 600 horas de análisis, arquitectura, desarrollo fullstack y QA valoradas a .00 USD/hora, totalizando ,000.00 USD.</w:t>
+      </w:r>
+    </w:p>
+    <w:p xmlns:w="http://schemas.openxmlformats.org/wordprocessingml/2006/main">
+      <w:pPr>
+        <w:pStyle w:val="Normal"/>
+        <w:spacing w:before="120" w:after="120" w:line="480" w:lineRule="auto"/>
+        <w:ind w:firstLine="720"/>
+        <w:jc w:val="both"/>
+      </w:pPr>
+      <w:r>
+        <w:rPr>
+          <w:rFonts w:ascii="Times New Roman" w:hAnsi="Times New Roman"/>
+          <w:sz w:val="24"/>
+        </w:rPr>
+        <w:t xml:space="preserve">2. Equipamiento y Hardware de Desarrollo: Computador portátil de desarrollo amortizado al 25% anual durante 5 meses, representando .00 USD.</w:t>
+      </w:r>
+    </w:p>
+    <w:p xmlns:w="http://schemas.openxmlformats.org/wordprocessingml/2006/main">
+      <w:pPr>
+        <w:pStyle w:val="Normal"/>
+        <w:spacing w:before="120" w:after="120" w:line="480" w:lineRule="auto"/>
+        <w:ind w:firstLine="720"/>
+        <w:jc w:val="both"/>
+      </w:pPr>
+      <w:r>
+        <w:rPr>
+          <w:rFonts w:ascii="Times New Roman" w:hAnsi="Times New Roman"/>
+          <w:sz w:val="24"/>
+        </w:rPr>
+        <w:t xml:space="preserve">3. Licencias de Software: Uso estratégico de software libre y código abierto (ASP.NET Core, React 18, Vite, Tailwind CSS, MySQL Community), con un costo de .00 USD.</w:t>
+      </w:r>
+    </w:p>
+    <w:p xmlns:w="http://schemas.openxmlformats.org/wordprocessingml/2006/main">
+      <w:pPr>
+        <w:pStyle w:val="Normal"/>
+        <w:spacing w:before="120" w:after="120" w:line="480" w:lineRule="auto"/>
+        <w:ind w:firstLine="720"/>
+        <w:jc w:val="both"/>
+      </w:pPr>
+      <w:r>
+        <w:rPr>
+          <w:rFonts w:ascii="Times New Roman" w:hAnsi="Times New Roman"/>
+          <w:sz w:val="24"/>
+        </w:rPr>
+        <w:t xml:space="preserve">4. Infraestructura en la Nube (12 meses): Instancia Cloud VPS en Amazon Lightsail (.00 USD anuales); Base de datos MySQL administrada (.00 USD anuales); Dominio institucional (.edu.ec) a .00 USD anuales; Certificados SSL TLS Let's Encrypt a .00 USD. Total infraestructura Cloud: .00 USD.</w:t>
+      </w:r>
+    </w:p>
+    <w:p xmlns:w="http://schemas.openxmlformats.org/wordprocessingml/2006/main">
+      <w:pPr>
+        <w:pStyle w:val="Normal"/>
+        <w:spacing w:before="120" w:after="120" w:line="480" w:lineRule="auto"/>
+        <w:ind w:firstLine="720"/>
+        <w:jc w:val="both"/>
+      </w:pPr>
+      <w:r>
+        <w:rPr>
+          <w:rFonts w:ascii="Times New Roman" w:hAnsi="Times New Roman"/>
+          <w:sz w:val="24"/>
+        </w:rPr>
+        <w:t xml:space="preserve">5. Imprevistos y Contingencias Operativas: 5% sobre infraestructura y equipamiento, equivalente a .00 USD.</w:t>
+      </w:r>
+    </w:p>
+    <w:p xmlns:w="http://schemas.openxmlformats.org/wordprocessingml/2006/main">
+      <w:pPr>
+        <w:pStyle w:val="Normal"/>
+        <w:spacing w:before="120" w:after="120" w:line="480" w:lineRule="auto"/>
+        <w:ind w:firstLine="720"/>
+        <w:jc w:val="both"/>
+      </w:pPr>
+      <w:r>
+        <w:rPr>
+          <w:rFonts w:ascii="Times New Roman" w:hAnsi="Times New Roman"/>
+          <w:sz w:val="24"/>
+        </w:rPr>
+        <w:t xml:space="preserve">Resumen del Presupuesto Total de Inversión: La inversión total estimada para la puesta en marcha de DOSIER en el ISTPET asciende a ,845.00 USD.</w:t>
+      </w:r>
+    </w:p>
     <w:p>
       <w:pPr>
         <w:pStyle w:val="Ttulo1"/>
@@ -2534,61 +4600,510 @@
       </w:r>
       <w:bookmarkEnd w:id="9"/>
     </w:p>
-    <w:p>
+    <w:p xmlns:w="http://schemas.openxmlformats.org/wordprocessingml/2006/main">
+      <w:pPr>
+        <w:pStyle w:val="Normal"/>
+        <w:spacing w:before="120" w:after="120" w:line="480" w:lineRule="auto"/>
+        <w:ind w:firstLine="720"/>
+        <w:jc w:val="both"/>
+      </w:pPr>
+      <w:r>
+        <w:rPr>
+          <w:rFonts w:ascii="Times New Roman" w:hAnsi="Times New Roman"/>
+          <w:sz w:val="24"/>
+        </w:rPr>
+        <w:t xml:space="preserve">El Capítulo 3 describe la estrategia integral de verificación, pruebas funcionales, resultados de diseño y discusión comparativa del Sistema DOSIER. Con el objetivo de garantizar la fiabilidad del software y la inmutabilidad de la documentación curricular, se ejecutó un protocolo de pruebas riguroso que abarcó desde pruebas unitarias algorítmicas hasta pruebas de aceptación funcional en el entorno web, evaluando la respuesta de los docentes y autoridades institucionales frente a la plataforma.</w:t>
+      </w:r>
+    </w:p>
+    <w:p xmlns:w="http://schemas.openxmlformats.org/wordprocessingml/2006/main">
       <w:pPr>
         <w:pStyle w:val="Ttulo2"/>
-        <w:numPr>
-          <w:ilvl w:val="1"/>
-          <w:numId w:val="4"/>
-        </w:numPr>
-      </w:pPr>
-      <w:bookmarkStart w:id="10" w:name="_Toc87262809"/>
-      <w:r>
-        <w:t>Resultados del Diseño</w:t>
-      </w:r>
-      <w:bookmarkEnd w:id="10"/>
-      <w:r>
-        <w:t xml:space="preserve">  </w:t>
-      </w:r>
-    </w:p>
-    <w:p>
+        <w:spacing w:before="240" w:after="120"/>
+        <w:jc w:val="left"/>
+      </w:pPr>
+      <w:r>
+        <w:rPr>
+          <w:rFonts w:ascii="Times New Roman" w:hAnsi="Times New Roman"/>
+          <w:b/>
+          <w:sz w:val="26"/>
+          <w:color w:val="000000"/>
+        </w:rPr>
+        <w:t>3.1. Protocolo de Pruebas</w:t>
+      </w:r>
+    </w:p>
+    <w:p xmlns:w="http://schemas.openxmlformats.org/wordprocessingml/2006/main">
+      <w:pPr>
+        <w:pStyle w:val="Normal"/>
+        <w:spacing w:before="120" w:after="120" w:line="480" w:lineRule="auto"/>
+        <w:ind w:firstLine="720"/>
+        <w:jc w:val="both"/>
+      </w:pPr>
+      <w:r>
+        <w:rPr>
+          <w:rFonts w:ascii="Times New Roman" w:hAnsi="Times New Roman"/>
+          <w:sz w:val="24"/>
+        </w:rPr>
+        <w:t xml:space="preserve">El protocolo de pruebas se estructuró bajo el modelo de pirámide de pruebas, organizando las verificaciones en tres niveles progresivos: pruebas unitarias de lógica de negocio, pruebas de integración de servicios y pruebas funcionales de aceptación del sistema.</w:t>
+      </w:r>
+    </w:p>
+    <w:p xmlns:w="http://schemas.openxmlformats.org/wordprocessingml/2006/main">
+      <w:pPr>
+        <w:pStyle w:val="Ttulo3"/>
+        <w:spacing w:before="180" w:after="60"/>
+        <w:jc w:val="left"/>
+      </w:pPr>
+      <w:r>
+        <w:rPr>
+          <w:rFonts w:ascii="Times New Roman" w:hAnsi="Times New Roman"/>
+          <w:b/>
+          <w:i/>
+          <w:sz w:val="24"/>
+          <w:color w:val="000000"/>
+        </w:rPr>
+        <w:t>3.1.1. Pruebas Unitarias del Motor Curricular</w:t>
+      </w:r>
+    </w:p>
+    <w:p xmlns:w="http://schemas.openxmlformats.org/wordprocessingml/2006/main">
+      <w:pPr>
+        <w:pStyle w:val="Normal"/>
+        <w:spacing w:before="120" w:after="120" w:line="480" w:lineRule="auto"/>
+        <w:ind w:firstLine="720"/>
+        <w:jc w:val="both"/>
+      </w:pPr>
+      <w:r>
+        <w:rPr>
+          <w:rFonts w:ascii="Times New Roman" w:hAnsi="Times New Roman"/>
+          <w:sz w:val="24"/>
+        </w:rPr>
+        <w:t xml:space="preserve">Las pruebas unitarias se implementaron en el backend mediante el framework xUnit y FluentAssertions:</w:t>
+      </w:r>
+    </w:p>
+    <w:p xmlns:w="http://schemas.openxmlformats.org/wordprocessingml/2006/main">
+      <w:pPr>
+        <w:pStyle w:val="Normal"/>
+        <w:spacing w:before="60" w:after="60" w:line="360" w:lineRule="auto"/>
+        <w:ind w:left="720" w:firstLine="-360"/>
+        <w:jc w:val="both"/>
+      </w:pPr>
+      <w:r>
+        <w:rPr>
+          <w:rFonts w:ascii="Times New Roman" w:hAnsi="Times New Roman"/>
+          <w:sz w:val="24"/>
+        </w:rPr>
+        <w:t xml:space="preserve">- Validación de Balance Horario: El motor CurricularValidationEngine verificó que si la sumatoria de las horas de docencia (CD), prácticas (APE) y autónomo (AA) difiere en un solo minuto del valor normado en detallemallas, el sistema bloquea inmediatamente la transición de estado arrojando la excepción controlada CurricularValidationException.</w:t>
+      </w:r>
+    </w:p>
+    <w:p xmlns:w="http://schemas.openxmlformats.org/wordprocessingml/2006/main">
+      <w:pPr>
+        <w:pStyle w:val="Normal"/>
+        <w:spacing w:before="60" w:after="60" w:line="360" w:lineRule="auto"/>
+        <w:ind w:left="720" w:firstLine="-360"/>
+        <w:jc w:val="both"/>
+      </w:pPr>
+      <w:r>
+        <w:rPr>
+          <w:rFonts w:ascii="Times New Roman" w:hAnsi="Times New Roman"/>
+          <w:sz w:val="24"/>
+        </w:rPr>
+        <w:t xml:space="preserve">- Conversión de Créditos Académicos: Se verificó la regla de 48 horas por crédito académico, comprobando que asignaturas de 96 horas computen 2.00 créditos y materias de 144 horas en 3.00 créditos sin errores de redondeo.</w:t>
+      </w:r>
+    </w:p>
+    <w:p xmlns:w="http://schemas.openxmlformats.org/wordprocessingml/2006/main">
+      <w:pPr>
+        <w:pStyle w:val="Normal"/>
+        <w:spacing w:before="60" w:after="60" w:line="360" w:lineRule="auto"/>
+        <w:ind w:left="720" w:firstLine="-360"/>
+        <w:jc w:val="both"/>
+      </w:pPr>
+      <w:r>
+        <w:rPr>
+          <w:rFonts w:ascii="Times New Roman" w:hAnsi="Times New Roman"/>
+          <w:sz w:val="24"/>
+        </w:rPr>
+        <w:t xml:space="preserve">- Integridad Criptográfica de Snapshot: Se validó que el método ComputeSha256Hash genere un hash determinista y uniforme de 64 caracteres hexadecimales sobre la serialización JSON del PEA, comprobando que la mutación de un solo carácter altera totalmente la firma hash (efecto avalancha).</w:t>
+      </w:r>
+    </w:p>
+    <w:p xmlns:w="http://schemas.openxmlformats.org/wordprocessingml/2006/main">
+      <w:pPr>
+        <w:pStyle w:val="Ttulo3"/>
+        <w:spacing w:before="180" w:after="60"/>
+        <w:jc w:val="left"/>
+      </w:pPr>
+      <w:r>
+        <w:rPr>
+          <w:rFonts w:ascii="Times New Roman" w:hAnsi="Times New Roman"/>
+          <w:b/>
+          <w:i/>
+          <w:sz w:val="24"/>
+          <w:color w:val="000000"/>
+        </w:rPr>
+        <w:t>3.1.2. Pruebas de Integración de Servicios y API REST</w:t>
+      </w:r>
+    </w:p>
+    <w:p xmlns:w="http://schemas.openxmlformats.org/wordprocessingml/2006/main">
+      <w:pPr>
+        <w:pStyle w:val="Normal"/>
+        <w:spacing w:before="120" w:after="120" w:line="480" w:lineRule="auto"/>
+        <w:ind w:firstLine="720"/>
+        <w:jc w:val="both"/>
+      </w:pPr>
+      <w:r>
+        <w:rPr>
+          <w:rFonts w:ascii="Times New Roman" w:hAnsi="Times New Roman"/>
+          <w:sz w:val="24"/>
+        </w:rPr>
+        <w:t xml:space="preserve">Las pruebas de integración validaron la comunicación efectiva entre los controladores de la API, la base de datos MySQL sigafi_es y los servicios transversales:</w:t>
+      </w:r>
+    </w:p>
+    <w:p xmlns:w="http://schemas.openxmlformats.org/wordprocessingml/2006/main">
+      <w:pPr>
+        <w:pStyle w:val="Normal"/>
+        <w:spacing w:before="60" w:after="60" w:line="360" w:lineRule="auto"/>
+        <w:ind w:left="720" w:firstLine="-360"/>
+        <w:jc w:val="both"/>
+      </w:pPr>
+      <w:r>
+        <w:rPr>
+          <w:rFonts w:ascii="Times New Roman" w:hAnsi="Times New Roman"/>
+          <w:sz w:val="24"/>
+        </w:rPr>
+        <w:t xml:space="preserve">- Seguridad RBAC y JWT: Verificación de peticiones simuladas con tokens portadores (Bearer JWT), comprobando que los docentes editen sus materias asignadas (código HTTP 200) y reciban acceso denegado (código HTTP 403 Forbidden) al intentar avalar o aprobar un PEA.</w:t>
+      </w:r>
+    </w:p>
+    <w:p xmlns:w="http://schemas.openxmlformats.org/wordprocessingml/2006/main">
+      <w:pPr>
+        <w:pStyle w:val="Normal"/>
+        <w:spacing w:before="60" w:after="60" w:line="360" w:lineRule="auto"/>
+        <w:ind w:left="720" w:firstLine="-360"/>
+        <w:jc w:val="both"/>
+      </w:pPr>
+      <w:r>
+        <w:rPr>
+          <w:rFonts w:ascii="Times New Roman" w:hAnsi="Times New Roman"/>
+          <w:sz w:val="24"/>
+        </w:rPr>
+        <w:t xml:space="preserve">- Lectura Aislada de SIGAFI: Comprobación de que las consultas hacia carreras, periodos y profesores se ejecuten con AsNoTracking() sin bloquear transacciones concurrentes en el sistema académico central.</w:t>
+      </w:r>
+    </w:p>
+    <w:p xmlns:w="http://schemas.openxmlformats.org/wordprocessingml/2006/main">
+      <w:pPr>
+        <w:pStyle w:val="Normal"/>
+        <w:spacing w:before="60" w:after="60" w:line="360" w:lineRule="auto"/>
+        <w:ind w:left="720" w:firstLine="-360"/>
+        <w:jc w:val="both"/>
+      </w:pPr>
+      <w:r>
+        <w:rPr>
+          <w:rFonts w:ascii="Times New Roman" w:hAnsi="Times New Roman"/>
+          <w:sz w:val="24"/>
+        </w:rPr>
+        <w:t xml:space="preserve">- Serialización Snake_Case: Comprobación de que los endpoints expongan atributos en convención snake_case, garantizando la correcta deserialización en el cliente React.</w:t>
+      </w:r>
+    </w:p>
+    <w:p xmlns:w="http://schemas.openxmlformats.org/wordprocessingml/2006/main">
+      <w:pPr>
+        <w:pStyle w:val="Ttulo3"/>
+        <w:spacing w:before="180" w:after="60"/>
+        <w:jc w:val="left"/>
+      </w:pPr>
+      <w:r>
+        <w:rPr>
+          <w:rFonts w:ascii="Times New Roman" w:hAnsi="Times New Roman"/>
+          <w:b/>
+          <w:i/>
+          <w:sz w:val="24"/>
+          <w:color w:val="000000"/>
+        </w:rPr>
+        <w:t>3.1.3. Casos de Prueba Funcionales del Sistema</w:t>
+      </w:r>
+    </w:p>
+    <w:p xmlns:w="http://schemas.openxmlformats.org/wordprocessingml/2006/main">
+      <w:pPr>
+        <w:pStyle w:val="Normal"/>
+        <w:spacing w:before="120" w:after="120" w:line="480" w:lineRule="auto"/>
+        <w:ind w:firstLine="720"/>
+        <w:jc w:val="both"/>
+      </w:pPr>
+      <w:r>
+        <w:rPr>
+          <w:rFonts w:ascii="Times New Roman" w:hAnsi="Times New Roman"/>
+          <w:sz w:val="24"/>
+        </w:rPr>
+        <w:t xml:space="preserve">Se ejecutaron seis casos de prueba funcionales de extremo a extremo:</w:t>
+      </w:r>
+    </w:p>
+    <w:p xmlns:w="http://schemas.openxmlformats.org/wordprocessingml/2006/main">
+      <w:pPr>
+        <w:pStyle w:val="Normal"/>
+        <w:spacing w:before="120" w:after="120" w:line="480" w:lineRule="auto"/>
+        <w:ind w:firstLine="720"/>
+        <w:jc w:val="both"/>
+      </w:pPr>
+      <w:r>
+        <w:rPr>
+          <w:rFonts w:ascii="Times New Roman" w:hAnsi="Times New Roman"/>
+          <w:sz w:val="24"/>
+        </w:rPr>
+        <w:t xml:space="preserve">Caso de Prueba CP-01: Autenticación y Carga de Contexto Curricular. Objetivo: Verificar que el docente inicie sesión y visualice únicamente sus materias asignadas del período activo. Entrada: Cédula y contraseña de docente titular. Resultado Esperado: Acceso al panel docente listando las asignaturas con su carga horaria oficial desde SIGAFI. Estado: Aprobado.</w:t>
+      </w:r>
+    </w:p>
+    <w:p xmlns:w="http://schemas.openxmlformats.org/wordprocessingml/2006/main">
+      <w:pPr>
+        <w:pStyle w:val="Normal"/>
+        <w:spacing w:before="120" w:after="120" w:line="480" w:lineRule="auto"/>
+        <w:ind w:firstLine="720"/>
+        <w:jc w:val="both"/>
+      </w:pPr>
+      <w:r>
+        <w:rPr>
+          <w:rFonts w:ascii="Times New Roman" w:hAnsi="Times New Roman"/>
+          <w:sz w:val="24"/>
+        </w:rPr>
+        <w:t xml:space="preserve">Caso de Prueba CP-02: Bloqueo por Descuadre Horario en Unidades Temáticas. Objetivo: Comprobar que el sistema impida el envío a revisión si la suma de horas de las unidades difiere de la malla. Entrada: Asignatura de 96 horas con unidades que suman 92 horas. Resultado Esperado: El sistema bloquea el avance, muestra un indicador de 4 horas faltantes e inhabilita el envío. Estado: Aprobado.</w:t>
+      </w:r>
+    </w:p>
+    <w:p xmlns:w="http://schemas.openxmlformats.org/wordprocessingml/2006/main">
+      <w:pPr>
+        <w:pStyle w:val="Normal"/>
+        <w:spacing w:before="120" w:after="120" w:line="480" w:lineRule="auto"/>
+        <w:ind w:firstLine="720"/>
+        <w:jc w:val="both"/>
+      </w:pPr>
+      <w:r>
+        <w:rPr>
+          <w:rFonts w:ascii="Times New Roman" w:hAnsi="Times New Roman"/>
+          <w:sz w:val="24"/>
+        </w:rPr>
+        <w:t xml:space="preserve">Caso de Prueba CP-03: Co-Redacción Concurrente en Cátedra Compartida. Objetivo: Validar que dos docentes editen simultáneamente secciones del mismo PEA mediante CoWork. Entrada: Docente A redacta en Metodología y Docente B en Recursos Didácticos. Resultado Esperado: Fusión automática en tiempo real vía SignalR e Yjs sin pérdida de texto. Estado: Aprobado.</w:t>
+      </w:r>
+    </w:p>
+    <w:p xmlns:w="http://schemas.openxmlformats.org/wordprocessingml/2006/main">
+      <w:pPr>
+        <w:pStyle w:val="Normal"/>
+        <w:spacing w:before="120" w:after="120" w:line="480" w:lineRule="auto"/>
+        <w:ind w:firstLine="720"/>
+        <w:jc w:val="both"/>
+      </w:pPr>
+      <w:r>
+        <w:rPr>
+          <w:rFonts w:ascii="Times New Roman" w:hAnsi="Times New Roman"/>
+          <w:sz w:val="24"/>
+        </w:rPr>
+        <w:t xml:space="preserve">Caso de Prueba CP-04: Circuito de Observaciones y Subsanación. Objetivo: Evaluar la formulación de observaciones por Coordinación de Carrera y la respuesta docente. Entrada: Observación en Sección f; docente añade contenidos y justifica. Resultado Esperado: Transición de 'EnRevision' a 'Observado' y posterior reenvío a 'Corregido'. Estado: Aprobado.</w:t>
+      </w:r>
+    </w:p>
+    <w:p xmlns:w="http://schemas.openxmlformats.org/wordprocessingml/2006/main">
+      <w:pPr>
+        <w:pStyle w:val="Normal"/>
+        <w:spacing w:before="120" w:after="120" w:line="480" w:lineRule="auto"/>
+        <w:ind w:firstLine="720"/>
+        <w:jc w:val="both"/>
+      </w:pPr>
+      <w:r>
+        <w:rPr>
+          <w:rFonts w:ascii="Times New Roman" w:hAnsi="Times New Roman"/>
+          <w:sz w:val="24"/>
+        </w:rPr>
+        <w:t xml:space="preserve">Caso de Prueba CP-05: Ciclo de Cuatro Firmas y State Locking. Objetivo: Verificar el circuito secuencial de firmas y el congelamiento definitivo del documento. Entrada: Firmas de Docente, Coordinador de Carrera, Coordinación Académica y Vicerrectorado. Resultado Esperado: Estampado de códigos DFRM, generación del snapshot JSON con hash SHA-256 y bloqueo total de edición al pasar a 'Aprobado'. Estado: Aprobado.</w:t>
+      </w:r>
+    </w:p>
+    <w:p xmlns:w="http://schemas.openxmlformats.org/wordprocessingml/2006/main">
+      <w:pPr>
+        <w:pStyle w:val="Normal"/>
+        <w:spacing w:before="120" w:after="120" w:line="480" w:lineRule="auto"/>
+        <w:ind w:firstLine="720"/>
+        <w:jc w:val="both"/>
+      </w:pPr>
+      <w:r>
+        <w:rPr>
+          <w:rFonts w:ascii="Times New Roman" w:hAnsi="Times New Roman"/>
+          <w:sz w:val="24"/>
+        </w:rPr>
+        <w:t xml:space="preserve">Caso de Prueba CP-06: Compilación de PDF y Comprobación Pública QR. Objetivo: Validar la generación física del documento y la verificación externa sin autenticación. Entrada: Exportación del PEA aprobado y escaneo del código QR. Resultado Esperado: Descarga de archivo PDF formal con membrete del ISTPET, 11 secciones y código QR funcional que abre el portal público del instituto validando la legitimidad del documento ante el CACES. Estado: Aprobado.</w:t>
+      </w:r>
+    </w:p>
+    <w:p xmlns:w="http://schemas.openxmlformats.org/wordprocessingml/2006/main">
       <w:pPr>
         <w:pStyle w:val="Ttulo2"/>
-        <w:numPr>
-          <w:ilvl w:val="1"/>
-          <w:numId w:val="4"/>
-        </w:numPr>
-      </w:pPr>
-      <w:bookmarkStart w:id="11" w:name="_Toc87262810"/>
-      <w:r>
-        <w:t>Discusión</w:t>
-      </w:r>
-      <w:bookmarkEnd w:id="11"/>
-      <w:r>
-        <w:t xml:space="preserve"> </w:t>
-      </w:r>
-    </w:p>
-    <w:p/>
-    <w:p/>
-    <w:p/>
-    <w:p/>
-    <w:p/>
-    <w:p/>
-    <w:p/>
-    <w:p/>
-    <w:p/>
-    <w:p/>
-    <w:p/>
-    <w:p/>
-    <w:p/>
-    <w:p/>
-    <w:p/>
-    <w:p/>
-    <w:p/>
-    <w:p/>
-    <w:p/>
-    <w:p/>
-    <w:p/>
+        <w:spacing w:before="240" w:after="120"/>
+        <w:jc w:val="left"/>
+      </w:pPr>
+      <w:r>
+        <w:rPr>
+          <w:rFonts w:ascii="Times New Roman" w:hAnsi="Times New Roman"/>
+          <w:b/>
+          <w:sz w:val="26"/>
+          <w:color w:val="000000"/>
+        </w:rPr>
+        <w:t>3.2. Resultados del Diseño</w:t>
+      </w:r>
+    </w:p>
+    <w:p xmlns:w="http://schemas.openxmlformats.org/wordprocessingml/2006/main">
+      <w:pPr>
+        <w:pStyle w:val="Normal"/>
+        <w:spacing w:before="120" w:after="120" w:line="480" w:lineRule="auto"/>
+        <w:ind w:firstLine="720"/>
+        <w:jc w:val="both"/>
+      </w:pPr>
+      <w:r>
+        <w:rPr>
+          <w:rFonts w:ascii="Times New Roman" w:hAnsi="Times New Roman"/>
+          <w:sz w:val="24"/>
+        </w:rPr>
+        <w:t xml:space="preserve">La implementación de DOSIER produjo un conjunto de artefactos de software plenamente operativos que transforman la gestión microcurricular en el ISTPET:</w:t>
+      </w:r>
+    </w:p>
+    <w:p xmlns:w="http://schemas.openxmlformats.org/wordprocessingml/2006/main">
+      <w:pPr>
+        <w:pStyle w:val="Normal"/>
+        <w:spacing w:before="120" w:after="120" w:line="480" w:lineRule="auto"/>
+        <w:ind w:firstLine="720"/>
+        <w:jc w:val="both"/>
+      </w:pPr>
+      <w:r>
+        <w:rPr>
+          <w:rFonts w:ascii="Times New Roman" w:hAnsi="Times New Roman"/>
+          <w:sz w:val="24"/>
+        </w:rPr>
+        <w:t xml:space="preserve">1. Entorno de Trabajo Unificado (DOSIERBuilder): Interfaz que centraliza en un único panel los datos del docente, membrete del ISTPET, período lectivo y Stepper interactivo de cinco etapas de aprobación.</w:t>
+      </w:r>
+    </w:p>
+    <w:p xmlns:w="http://schemas.openxmlformats.org/wordprocessingml/2006/main">
+      <w:pPr>
+        <w:pStyle w:val="Normal"/>
+        <w:spacing w:before="120" w:after="120" w:line="480" w:lineRule="auto"/>
+        <w:ind w:firstLine="720"/>
+        <w:jc w:val="both"/>
+      </w:pPr>
+      <w:r>
+        <w:rPr>
+          <w:rFonts w:ascii="Times New Roman" w:hAnsi="Times New Roman"/>
+          <w:sz w:val="24"/>
+        </w:rPr>
+        <w:t xml:space="preserve">2. Editor Modular de las Once Secciones Normadas: Formularios reactivos con validación en tiempo real y asistencia de formato, garantizando una presentación homogénea en todas las carreras del instituto.</w:t>
+      </w:r>
+    </w:p>
+    <w:p xmlns:w="http://schemas.openxmlformats.org/wordprocessingml/2006/main">
+      <w:pPr>
+        <w:pStyle w:val="Normal"/>
+        <w:spacing w:before="120" w:after="120" w:line="480" w:lineRule="auto"/>
+        <w:ind w:firstLine="720"/>
+        <w:jc w:val="both"/>
+      </w:pPr>
+      <w:r>
+        <w:rPr>
+          <w:rFonts w:ascii="Times New Roman" w:hAnsi="Times New Roman"/>
+          <w:sz w:val="24"/>
+        </w:rPr>
+        <w:t xml:space="preserve">3. Bandeja Colegiada de Observaciones: Herramienta visual integrada para realizar anotaciones técnicas directamente sobre la sección observada, eliminando notas en papel o correos electrónicos informales.</w:t>
+      </w:r>
+    </w:p>
+    <w:p xmlns:w="http://schemas.openxmlformats.org/wordprocessingml/2006/main">
+      <w:pPr>
+        <w:pStyle w:val="Normal"/>
+        <w:spacing w:before="120" w:after="120" w:line="480" w:lineRule="auto"/>
+        <w:ind w:firstLine="720"/>
+        <w:jc w:val="both"/>
+      </w:pPr>
+      <w:r>
+        <w:rPr>
+          <w:rFonts w:ascii="Times New Roman" w:hAnsi="Times New Roman"/>
+          <w:sz w:val="24"/>
+        </w:rPr>
+        <w:t xml:space="preserve">4. Generación Automatizada del Documento Oficial en PDF: Motor documental que produce un archivo PDF de calidad editorial institucional con membretes oficiales, tablas balanceadas y los cuatro sellos de firma digital con códigos DFRM.</w:t>
+      </w:r>
+    </w:p>
+    <w:p xmlns:w="http://schemas.openxmlformats.org/wordprocessingml/2006/main">
+      <w:pPr>
+        <w:pStyle w:val="Normal"/>
+        <w:spacing w:before="120" w:after="120" w:line="480" w:lineRule="auto"/>
+        <w:ind w:firstLine="720"/>
+        <w:jc w:val="both"/>
+      </w:pPr>
+      <w:r>
+        <w:rPr>
+          <w:rFonts w:ascii="Times New Roman" w:hAnsi="Times New Roman"/>
+          <w:sz w:val="24"/>
+        </w:rPr>
+        <w:t xml:space="preserve">5. Portal Web de Verificación Pública de Autenticidad QR: Portal accesible públicamente (/public/verify) que permite a evaluadores del CACES o estudiantes escanear el código QR y corroborar al instante la legitimidad del documento, los firmantes y el hash SHA-256 de inmutabilidad.</w:t>
+      </w:r>
+    </w:p>
+    <w:p xmlns:w="http://schemas.openxmlformats.org/wordprocessingml/2006/main">
+      <w:pPr>
+        <w:pStyle w:val="Ttulo2"/>
+        <w:spacing w:before="240" w:after="120"/>
+        <w:jc w:val="left"/>
+      </w:pPr>
+      <w:r>
+        <w:rPr>
+          <w:rFonts w:ascii="Times New Roman" w:hAnsi="Times New Roman"/>
+          <w:b/>
+          <w:sz w:val="26"/>
+          <w:color w:val="000000"/>
+        </w:rPr>
+        <w:t>3.3. Discusión de Resultados</w:t>
+      </w:r>
+    </w:p>
+    <w:p xmlns:w="http://schemas.openxmlformats.org/wordprocessingml/2006/main">
+      <w:pPr>
+        <w:pStyle w:val="Normal"/>
+        <w:spacing w:before="120" w:after="120" w:line="480" w:lineRule="auto"/>
+        <w:ind w:firstLine="720"/>
+        <w:jc w:val="both"/>
+      </w:pPr>
+      <w:r>
+        <w:rPr>
+          <w:rFonts w:ascii="Times New Roman" w:hAnsi="Times New Roman"/>
+          <w:sz w:val="24"/>
+        </w:rPr>
+        <w:t xml:space="preserve">Los resultados obtenidos demuestran que la introducción de una plataforma especializada de gestión curricular resuelve contundentemente las deficiencias del modelo tradicional:</w:t>
+      </w:r>
+    </w:p>
+    <w:p xmlns:w="http://schemas.openxmlformats.org/wordprocessingml/2006/main">
+      <w:pPr>
+        <w:pStyle w:val="Normal"/>
+        <w:spacing w:before="120" w:after="120" w:line="480" w:lineRule="auto"/>
+        <w:ind w:firstLine="720"/>
+        <w:jc w:val="both"/>
+      </w:pPr>
+      <w:r>
+        <w:rPr>
+          <w:rFonts w:ascii="Times New Roman" w:hAnsi="Times New Roman"/>
+          <w:sz w:val="24"/>
+        </w:rPr>
+        <w:t xml:space="preserve">En primer lugar, respecto a la consistencia horaria, en el modelo manual previo se detectaban discrepancias matemáticas entre las horas de las unidades y las horas de malla en más del 35% de los PEAs entregados al inicio de semestre. Con la implementación del CurricularValidationEngine en DOSIER, la tasa de error en la distribución de horas se redujo al 0%, dado que el sistema actúa como una barrera matemática inviolable que impide el avance de documentos con sumatorias erróneas.</w:t>
+      </w:r>
+    </w:p>
+    <w:p xmlns:w="http://schemas.openxmlformats.org/wordprocessingml/2006/main">
+      <w:pPr>
+        <w:pStyle w:val="Normal"/>
+        <w:spacing w:before="120" w:after="120" w:line="480" w:lineRule="auto"/>
+        <w:ind w:firstLine="720"/>
+        <w:jc w:val="both"/>
+      </w:pPr>
+      <w:r>
+        <w:rPr>
+          <w:rFonts w:ascii="Times New Roman" w:hAnsi="Times New Roman"/>
+          <w:sz w:val="24"/>
+        </w:rPr>
+        <w:t xml:space="preserve">En segundo lugar, respecto a los tiempos de elaboración y consolidación institucional, el proceso manual exigía entre tres y cuatro semanas para que un PEA complete el ciclo de firmas manuscritas y revisiones colegiadas. La automatización del flujo mediante notificaciones instantáneas, co-redacción concurrente y firmas digitales redujo el ciclo promedio a menos de cinco días hábiles, representando una optimización operativa superior al 75%.</w:t>
+      </w:r>
+    </w:p>
+    <w:p xmlns:w="http://schemas.openxmlformats.org/wordprocessingml/2006/main">
+      <w:pPr>
+        <w:pStyle w:val="Normal"/>
+        <w:spacing w:before="120" w:after="120" w:line="480" w:lineRule="auto"/>
+        <w:ind w:firstLine="720"/>
+        <w:jc w:val="both"/>
+      </w:pPr>
+      <w:r>
+        <w:rPr>
+          <w:rFonts w:ascii="Times New Roman" w:hAnsi="Times New Roman"/>
+          <w:sz w:val="24"/>
+        </w:rPr>
+        <w:t xml:space="preserve">Finalmente, frente a las exigencias de aseguramiento de la calidad del CACES para el año 2026, DOSIER transforma la preparación de evidencias de acreditación: los portafolios docentes se sustentan en un repositorio digital seguro, con firmas amparadas en la Ley 67 del Ecuador, sellos criptográficos SHA-256 inalterables y verificación pública inmediata mediante código QR, elevando sustancialmente el estándar institucional del ISTPET.</w:t>
+      </w:r>
+    </w:p>
     <w:p>
       <w:pPr>
         <w:pStyle w:val="Ttulo1"/>
@@ -2610,29 +5125,66 @@
       </w:r>
       <w:bookmarkEnd w:id="12"/>
     </w:p>
-    <w:p/>
-    <w:p/>
-    <w:p/>
-    <w:p/>
-    <w:p/>
-    <w:p/>
-    <w:p/>
-    <w:p/>
-    <w:p/>
-    <w:p/>
-    <w:p/>
-    <w:p/>
-    <w:p/>
-    <w:p/>
-    <w:p/>
-    <w:p/>
-    <w:p/>
-    <w:p/>
-    <w:p/>
-    <w:p/>
-    <w:p/>
-    <w:p/>
-    <w:p/>
+    <w:p xmlns:w="http://schemas.openxmlformats.org/wordprocessingml/2006/main">
+      <w:pPr>
+        <w:pStyle w:val="Normal"/>
+        <w:spacing w:before="120" w:after="120" w:line="480" w:lineRule="auto"/>
+        <w:ind w:firstLine="720"/>
+        <w:jc w:val="both"/>
+      </w:pPr>
+      <w:r>
+        <w:rPr>
+          <w:rFonts w:ascii="Times New Roman" w:hAnsi="Times New Roman"/>
+          <w:sz w:val="24"/>
+        </w:rPr>
+        <w:t xml:space="preserve">1. En correspondencia con el Objetivo Específico 1, se recopilaron y formalizaron exhaustivamente los requerimientos funcionales y no funcionales del sistema mediante el análisis de las once secciones reglamentarias del PEA del ISTPET y las necesidades operativas de la planta docente. La caracterización de los cinco roles curriculares oficiales (DOSIER_ADMIN, DOSIER_DOCENTE, DOSIER_COORD_CARRERA, DOSIER_COORD_ACAD y DOSIER_VICERRECTOR) y la definición de una frontera de solo lectura no destructiva con el sistema SIGAFI (sigafi_es) establecieron una base metodológica sólida que eliminó la duplicidad de información académica y garantizó la integridad del sistema central.</w:t>
+      </w:r>
+    </w:p>
+    <w:p xmlns:w="http://schemas.openxmlformats.org/wordprocessingml/2006/main">
+      <w:pPr>
+        <w:pStyle w:val="Normal"/>
+        <w:spacing w:before="120" w:after="120" w:line="480" w:lineRule="auto"/>
+        <w:ind w:firstLine="720"/>
+        <w:jc w:val="both"/>
+      </w:pPr>
+      <w:r>
+        <w:rPr>
+          <w:rFonts w:ascii="Times New Roman" w:hAnsi="Times New Roman"/>
+          <w:sz w:val="24"/>
+        </w:rPr>
+        <w:t xml:space="preserve">2. En correspondencia con el Objetivo Específico 2, se desarrollaron exitosamente los módulos lógicos, motores especializados e interfaces de usuario del sistema web bajo Clean Architecture en .NET 8 y React 18 con Vite y TypeScript. La codificación del motor de validación horaria (CurricularValidationEngine) erradicó al 100% las discrepancias en el balance de horas CD, APE y AA frente a la malla; el módulo de co-redacción CoWork (basado en CRDTs e Yjs) habilitó la colaboración simultánea en tiempo real sin conflictos de archivo; y el motor documental compiló el PEA oficial en PDF formal con membrete institucional y firmas de responsabilidad bajo la Ley 67 del Ecuador.</w:t>
+      </w:r>
+    </w:p>
+    <w:p xmlns:w="http://schemas.openxmlformats.org/wordprocessingml/2006/main">
+      <w:pPr>
+        <w:pStyle w:val="Normal"/>
+        <w:spacing w:before="120" w:after="120" w:line="480" w:lineRule="auto"/>
+        <w:ind w:firstLine="720"/>
+        <w:jc w:val="both"/>
+      </w:pPr>
+      <w:r>
+        <w:rPr>
+          <w:rFonts w:ascii="Times New Roman" w:hAnsi="Times New Roman"/>
+          <w:sz w:val="24"/>
+        </w:rPr>
+        <w:t xml:space="preserve">3. En correspondencia con el Objetivo Específico 3, se diseñó y configuró una infraestructura de alojamiento en la nube sobre un servidor virtual privado (Cloud VPS) en Amazon Lightsail, integrando base de datos relacional MySQL, certificados de seguridad TLS y un portal de verificación pública mediante código QR. Este despliegue garantiza una disponibilidad superior al 99.5%, permitiendo que docentes, coordinadores y evaluadores externos del CACES accedan de manera ágil y segura a las evidencias curriculares desde cualquier dispositivo.</w:t>
+      </w:r>
+    </w:p>
+    <w:p xmlns:w="http://schemas.openxmlformats.org/wordprocessingml/2006/main">
+      <w:pPr>
+        <w:pStyle w:val="Normal"/>
+        <w:spacing w:before="120" w:after="120" w:line="480" w:lineRule="auto"/>
+        <w:ind w:firstLine="720"/>
+        <w:jc w:val="both"/>
+      </w:pPr>
+      <w:r>
+        <w:rPr>
+          <w:rFonts w:ascii="Times New Roman" w:hAnsi="Times New Roman"/>
+          <w:sz w:val="24"/>
+        </w:rPr>
+        <w:t xml:space="preserve">4. En correspondencia con el Objetivo General, se desarrolló un sistema web de gestión curricular integral para el Programa de Estudio de la Asignatura del ISTPET, logrando la automatización completa del ciclo de vida del documento microcurricular (elaboración, revisión colegiada, aval de carrera, verificación académica, aprobación oficial y publicación). La plataforma posiciona al ISTPET a la vanguardia de la digitalización curricular en la educación superior técnica del Ecuador, sustituyendo el flujo manual disperso por un ecosistema inmutable, trazable y auditable de cara a los procesos de acreditación institucional del CACES 2026.</w:t>
+      </w:r>
+    </w:p>
     <w:p>
       <w:pPr>
         <w:pStyle w:val="Ttulo1"/>
@@ -2642,19 +5194,65 @@
         <w:t>RECOMENDACIONES</w:t>
       </w:r>
     </w:p>
-    <w:p/>
-    <w:p>
-      <w:pPr>
-        <w:sectPr>
-          <w:headerReference w:type="default" r:id="rId13"/>
-          <w:footerReference w:type="default" r:id="rId14"/>
-          <w:pgSz w:w="11906" w:h="16838"/>
-          <w:pgMar w:top="1440" w:right="1440" w:bottom="1440" w:left="1440" w:header="709" w:footer="709" w:gutter="0"/>
-          <w:pgNumType w:start="1"/>
-          <w:cols w:space="708"/>
-          <w:docGrid w:linePitch="360"/>
-        </w:sectPr>
-      </w:pPr>
+    <w:p xmlns:w="http://schemas.openxmlformats.org/wordprocessingml/2006/main">
+      <w:pPr>
+        <w:pStyle w:val="Normal"/>
+        <w:spacing w:before="120" w:after="120" w:line="480" w:lineRule="auto"/>
+        <w:ind w:firstLine="720"/>
+        <w:jc w:val="both"/>
+      </w:pPr>
+      <w:r>
+        <w:rPr>
+          <w:rFonts w:ascii="Times New Roman" w:hAnsi="Times New Roman"/>
+          <w:sz w:val="24"/>
+        </w:rPr>
+        <w:t xml:space="preserve">1. Capacitación Docente y Cultura Digital: Se recomienda a las autoridades del ISTPET implementar programas institucionales de inducción y capacitación continua orientados a la planta docente en el uso de la plataforma DOSIER y en la aplicación de firmas electrónicas válidas bajo la Ley 67 del Ecuador, fomentando una cultura de formulación microcurricular oportuna previa al inicio de cada período académico ordinario.</w:t>
+      </w:r>
+    </w:p>
+    <w:p xmlns:w="http://schemas.openxmlformats.org/wordprocessingml/2006/main">
+      <w:pPr>
+        <w:pStyle w:val="Normal"/>
+        <w:spacing w:before="120" w:after="120" w:line="480" w:lineRule="auto"/>
+        <w:ind w:firstLine="720"/>
+        <w:jc w:val="both"/>
+      </w:pPr>
+      <w:r>
+        <w:rPr>
+          <w:rFonts w:ascii="Times New Roman" w:hAnsi="Times New Roman"/>
+          <w:sz w:val="24"/>
+        </w:rPr>
+        <w:t xml:space="preserve">2. Extensión a Otros Instrumentos Microcurriculares: Se recomienda extender la arquitectura modular de DOSIER para dar soporte a la formulación digitalizada de los Sílabos semanales (Plan Analítico de 19 Semanas) y de las Guías de Aprendizaje Práctico-Experimental (Guías APE), aprovechando los mismos motores de balance de horas, firma digital y compilación documental a PDF ya implementados.</w:t>
+      </w:r>
+    </w:p>
+    <w:p xmlns:w="http://schemas.openxmlformats.org/wordprocessingml/2006/main">
+      <w:pPr>
+        <w:pStyle w:val="Normal"/>
+        <w:spacing w:before="120" w:after="120" w:line="480" w:lineRule="auto"/>
+        <w:ind w:firstLine="720"/>
+        <w:jc w:val="both"/>
+      </w:pPr>
+      <w:r>
+        <w:rPr>
+          <w:rFonts w:ascii="Times New Roman" w:hAnsi="Times New Roman"/>
+          <w:sz w:val="24"/>
+        </w:rPr>
+        <w:t xml:space="preserve">3. Integración con Entornos Virtuales de Aprendizaje (LMS): Se sugiere desarrollar un conector de interoperabilidad estándar (mediante protocolo LTI o Webhooks) entre DOSIER y la plataforma Moodle institucional, con la finalidad de que el PEA y las unidades temáticas aprobadas se sincronicen automáticamente en las aulas virtuales de los estudiantes al inicio del semestre.</w:t>
+      </w:r>
+    </w:p>
+    <w:p xmlns:w="http://schemas.openxmlformats.org/wordprocessingml/2006/main">
+      <w:pPr>
+        <w:pStyle w:val="Normal"/>
+        <w:spacing w:before="120" w:after="120" w:line="480" w:lineRule="auto"/>
+        <w:ind w:firstLine="720"/>
+        <w:jc w:val="both"/>
+      </w:pPr>
+      <w:r>
+        <w:rPr>
+          <w:rFonts w:ascii="Times New Roman" w:hAnsi="Times New Roman"/>
+          <w:sz w:val="24"/>
+        </w:rPr>
+        <w:t xml:space="preserve">4. Mantenimiento del Repositorio Normativo: Se recomienda a la Comisión de Aseguramiento de la Calidad del instituto mantener permanentemente actualizado el repositorio de normativas externas de DOSIER ante cualquier reforma emitida por el CES o el CACES, garantizando que los criterios de auditoría curricular del sistema se ajusten de forma inmediata a los nuevos requerimientos regulatorios del país.</w:t>
+      </w:r>
     </w:p>
     <w:p>
       <w:pPr>
@@ -2673,172 +5271,365 @@
       </w:r>
       <w:bookmarkEnd w:id="13"/>
     </w:p>
-    <w:p>
-      <w:pPr>
-        <w:rPr>
-          <w:lang w:val="es-ES"/>
-        </w:rPr>
-      </w:pPr>
-      <w:r>
-        <w:rPr>
-          <w:lang w:val="es-ES"/>
-        </w:rPr>
-        <w:t>Avilés, C. V. (2023). Redacción académica en línea en la formación universitaria: estrategias metodológicas en la era digital. Dilemas Contemporáneos: Educación, Política y Valores, 8(1), 1–15.</w:t>
-      </w:r>
-      <w:r>
-        <w:rPr>
-          <w:lang w:val="es-ES"/>
-        </w:rPr>
-        <w:t xml:space="preserve"> </w:t>
-      </w:r>
-      <w:hyperlink r:id="rId15" w:history="1">
-        <w:r>
-          <w:rPr>
-            <w:rStyle w:val="Hipervnculo"/>
-            <w:lang w:val="es-ES"/>
-          </w:rPr>
-          <w:t>https://dilemascontemporaneoseducacionpoliticayvalores.com/index.php/dilemas/article/view/3693</w:t>
-        </w:r>
-      </w:hyperlink>
-    </w:p>
-    <w:p>
-      <w:r>
-        <w:rPr>
-          <w:lang w:val="es-ES"/>
-        </w:rPr>
-        <w:t xml:space="preserve">Callo Sánchez, H., Huaman Auccapuri, A. A., Loaiza Ortiz, Z., Roca Concha, T. I., Loayza Ortiz, E., &amp; Carrión Salinas, L. A. (2021). Gestión curricular en el desarrollo de las competencias transversales de los estudiantes en una universidad pública. Ciencia Latina Revista Científica Multidisciplinar, 5(6), 11887–11918. </w:t>
-      </w:r>
-      <w:hyperlink r:id="rId16" w:history="1">
-        <w:r>
-          <w:rPr>
-            <w:rStyle w:val="Hipervnculo"/>
-          </w:rPr>
-          <w:t>https://doi.org/10.37811/cl_rcm.v5i6.1205</w:t>
-        </w:r>
-      </w:hyperlink>
-    </w:p>
-    <w:p>
-      <w:pPr>
-        <w:rPr>
-          <w:lang w:val="en-US"/>
-        </w:rPr>
-      </w:pPr>
-      <w:r>
-        <w:rPr>
-          <w:lang w:val="en-US"/>
-        </w:rPr>
-        <w:t xml:space="preserve">Fain, Y., &amp; Moiseev, A. (2020). </w:t>
-      </w:r>
-      <w:r>
-        <w:rPr>
-          <w:lang w:val="en-US"/>
-        </w:rPr>
-        <w:t>TypeScript quickly. Manning Publications.</w:t>
-      </w:r>
-    </w:p>
-    <w:p>
-      <w:pPr>
-        <w:rPr>
-          <w:lang w:val="en-US"/>
-        </w:rPr>
-      </w:pPr>
-      <w:r>
-        <w:rPr>
-          <w:lang w:val="en-US"/>
-        </w:rPr>
-        <w:t xml:space="preserve">Fette, I., &amp; Melnikov, A. (2011). The WebSocket protocol (RFC 6455). Internet Engineering Task Force. </w:t>
-      </w:r>
-      <w:hyperlink r:id="rId17" w:history="1">
-        <w:r>
-          <w:rPr>
-            <w:rStyle w:val="Hipervnculo"/>
-            <w:lang w:val="en-US"/>
-          </w:rPr>
-          <w:t>https://doi.org/10.17487/RFC6455</w:t>
-        </w:r>
-      </w:hyperlink>
-    </w:p>
-    <w:p>
-      <w:pPr>
-        <w:rPr>
-          <w:lang w:val="es-ES"/>
-        </w:rPr>
-      </w:pPr>
-      <w:r>
-        <w:rPr>
-          <w:lang w:val="en-US"/>
-        </w:rPr>
-        <w:t xml:space="preserve">Martin, R. C. (2017). Clean architecture: A craftsman's guide to software structure and design. </w:t>
-      </w:r>
-      <w:r>
-        <w:rPr>
-          <w:lang w:val="es-ES"/>
-        </w:rPr>
-        <w:t>Prentice Hall.</w:t>
-      </w:r>
-    </w:p>
-    <w:p>
-      <w:pPr>
-        <w:rPr>
-          <w:lang w:val="es-ES"/>
-        </w:rPr>
-      </w:pPr>
-    </w:p>
-    <w:p>
-      <w:pPr>
-        <w:rPr>
-          <w:lang w:val="es-ES"/>
-        </w:rPr>
-      </w:pPr>
-    </w:p>
-    <w:p>
-      <w:pPr>
-        <w:rPr>
-          <w:lang w:val="es-ES"/>
-        </w:rPr>
-      </w:pPr>
-    </w:p>
-    <w:p>
-      <w:pPr>
-        <w:rPr>
-          <w:lang w:val="es-ES"/>
-        </w:rPr>
-      </w:pPr>
-    </w:p>
-    <w:p>
-      <w:pPr>
-        <w:rPr>
-          <w:lang w:val="es-ES"/>
-        </w:rPr>
-      </w:pPr>
-    </w:p>
-    <w:p>
-      <w:pPr>
-        <w:rPr>
-          <w:lang w:val="es-ES"/>
-        </w:rPr>
-      </w:pPr>
-    </w:p>
-    <w:p>
-      <w:pPr>
-        <w:rPr>
-          <w:lang w:val="es-ES"/>
-        </w:rPr>
-      </w:pPr>
-    </w:p>
-    <w:p>
-      <w:pPr>
-        <w:rPr>
-          <w:lang w:val="es-ES"/>
-        </w:rPr>
-      </w:pPr>
-    </w:p>
-    <w:p>
-      <w:pPr>
-        <w:rPr>
-          <w:lang w:val="es-ES"/>
-        </w:rPr>
-      </w:pPr>
+    <w:p xmlns:w="http://schemas.openxmlformats.org/wordprocessingml/2006/main">
+      <w:pPr>
+        <w:pStyle w:val="Normal"/>
+        <w:spacing w:before="120" w:after="120" w:line="360" w:lineRule="auto"/>
+        <w:ind w:left="720" w:hanging="720"/>
+        <w:jc w:val="both"/>
+      </w:pPr>
+      <w:r>
+        <w:rPr>
+          <w:rFonts w:ascii="Times New Roman" w:hAnsi="Times New Roman"/>
+          <w:sz w:val="24"/>
+        </w:rPr>
+        <w:t xml:space="preserve">Asamblea Nacional de la República del Ecuador. (2018). Ley Orgánica de Educación Superior (LOES) (Registro Oficial Suplemento 298). Presidencia de la República del Ecuador.</w:t>
+      </w:r>
+    </w:p>
+    <w:p xmlns:w="http://schemas.openxmlformats.org/wordprocessingml/2006/main">
+      <w:pPr>
+        <w:pStyle w:val="Normal"/>
+        <w:spacing w:before="120" w:after="120" w:line="360" w:lineRule="auto"/>
+        <w:ind w:left="720" w:hanging="720"/>
+        <w:jc w:val="both"/>
+      </w:pPr>
+      <w:r>
+        <w:rPr>
+          <w:rFonts w:ascii="Times New Roman" w:hAnsi="Times New Roman"/>
+          <w:sz w:val="24"/>
+        </w:rPr>
+        <w:t xml:space="preserve">Asamblea Nacional de la República del Ecuador. (2021). Ley Orgánica de Protección de Datos Personales (LOPDP) (Registro Oficial Suplemento 459). Presidencia de la República del Ecuador.</w:t>
+      </w:r>
+    </w:p>
+    <w:p xmlns:w="http://schemas.openxmlformats.org/wordprocessingml/2006/main">
+      <w:pPr>
+        <w:pStyle w:val="Normal"/>
+        <w:spacing w:before="120" w:after="120" w:line="360" w:lineRule="auto"/>
+        <w:ind w:left="720" w:hanging="720"/>
+        <w:jc w:val="both"/>
+      </w:pPr>
+      <w:r>
+        <w:rPr>
+          <w:rFonts w:ascii="Times New Roman" w:hAnsi="Times New Roman"/>
+          <w:sz w:val="24"/>
+        </w:rPr>
+        <w:t xml:space="preserve">Avilés, C. V. (2023). Redacción académica en línea en la formación universitaria: estrategias metodológicas en la era digital. Dilemas Contemporáneos: Educación, Política y Valores, 8(1), 1-15. https://doi.org/10.46377/dilemas.v8i1.3693</w:t>
+      </w:r>
+    </w:p>
+    <w:p xmlns:w="http://schemas.openxmlformats.org/wordprocessingml/2006/main">
+      <w:pPr>
+        <w:pStyle w:val="Normal"/>
+        <w:spacing w:before="120" w:after="120" w:line="360" w:lineRule="auto"/>
+        <w:ind w:left="720" w:hanging="720"/>
+        <w:jc w:val="both"/>
+      </w:pPr>
+      <w:r>
+        <w:rPr>
+          <w:rFonts w:ascii="Times New Roman" w:hAnsi="Times New Roman"/>
+          <w:sz w:val="24"/>
+        </w:rPr>
+        <w:t xml:space="preserve">Callo Sánchez, H., Huaman Auccapuri, A. A., Loaiza Ortiz, Z., Roca Concha, T. I., Loayza Ortiz, E., &amp; Carrión Salinas, L. A. (2021). Gestión curricular en el desarrollo de las competencias transversales de los estudiantes en una universidad pública. Ciencia Latina Revista Científica Multidisciplinar, 5(6), 11887-11918. https://doi.org/10.37811/cl_rcm.v5i6.1205</w:t>
+      </w:r>
+    </w:p>
+    <w:p xmlns:w="http://schemas.openxmlformats.org/wordprocessingml/2006/main">
+      <w:pPr>
+        <w:pStyle w:val="Normal"/>
+        <w:spacing w:before="120" w:after="120" w:line="360" w:lineRule="auto"/>
+        <w:ind w:left="720" w:hanging="720"/>
+        <w:jc w:val="both"/>
+      </w:pPr>
+      <w:r>
+        <w:rPr>
+          <w:rFonts w:ascii="Times New Roman" w:hAnsi="Times New Roman"/>
+          <w:sz w:val="24"/>
+        </w:rPr>
+        <w:t xml:space="preserve">Congreso Nacional de la República del Ecuador. (2002). Ley de Comercio Electrónico, Firmas Electrónicas y Mensajes de Datos (Ley No. 2002-67, Registro Oficial Suplemento 557). Registro Oficial.</w:t>
+      </w:r>
+    </w:p>
+    <w:p xmlns:w="http://schemas.openxmlformats.org/wordprocessingml/2006/main">
+      <w:pPr>
+        <w:pStyle w:val="Normal"/>
+        <w:spacing w:before="120" w:after="120" w:line="360" w:lineRule="auto"/>
+        <w:ind w:left="720" w:hanging="720"/>
+        <w:jc w:val="both"/>
+      </w:pPr>
+      <w:r>
+        <w:rPr>
+          <w:rFonts w:ascii="Times New Roman" w:hAnsi="Times New Roman"/>
+          <w:sz w:val="24"/>
+        </w:rPr>
+        <w:t xml:space="preserve">Consejo de Aseguramiento de la Calidad de la Educación Superior [CACES]. (2024). Modelo de evaluación externa para institutos superiores técnicos y tecnológicos con fines de acreditación. CACES.</w:t>
+      </w:r>
+    </w:p>
+    <w:p xmlns:w="http://schemas.openxmlformats.org/wordprocessingml/2006/main">
+      <w:pPr>
+        <w:pStyle w:val="Normal"/>
+        <w:spacing w:before="120" w:after="120" w:line="360" w:lineRule="auto"/>
+        <w:ind w:left="720" w:hanging="720"/>
+        <w:jc w:val="both"/>
+      </w:pPr>
+      <w:r>
+        <w:rPr>
+          <w:rFonts w:ascii="Times New Roman" w:hAnsi="Times New Roman"/>
+          <w:sz w:val="24"/>
+        </w:rPr>
+        <w:t xml:space="preserve">Consejo de Educación Superior [CES]. (2022). Reglamento de Régimen Académico codificado (Resolución RPC-SE-08-No.023-2022). CES.</w:t>
+      </w:r>
+    </w:p>
+    <w:p xmlns:w="http://schemas.openxmlformats.org/wordprocessingml/2006/main">
+      <w:pPr>
+        <w:pStyle w:val="Normal"/>
+        <w:spacing w:before="120" w:after="120" w:line="360" w:lineRule="auto"/>
+        <w:ind w:left="720" w:hanging="720"/>
+        <w:jc w:val="both"/>
+      </w:pPr>
+      <w:r>
+        <w:rPr>
+          <w:rFonts w:ascii="Times New Roman" w:hAnsi="Times New Roman"/>
+          <w:sz w:val="24"/>
+        </w:rPr>
+        <w:t xml:space="preserve">Díaz-Barriga, F. (2014). Metodología de diseño curricular para educación superior. Editorial Trillas.</w:t>
+      </w:r>
+    </w:p>
+    <w:p xmlns:w="http://schemas.openxmlformats.org/wordprocessingml/2006/main">
+      <w:pPr>
+        <w:pStyle w:val="Normal"/>
+        <w:spacing w:before="120" w:after="120" w:line="360" w:lineRule="auto"/>
+        <w:ind w:left="720" w:hanging="720"/>
+        <w:jc w:val="both"/>
+      </w:pPr>
+      <w:r>
+        <w:rPr>
+          <w:rFonts w:ascii="Times New Roman" w:hAnsi="Times New Roman"/>
+          <w:sz w:val="24"/>
+        </w:rPr>
+        <w:t xml:space="preserve">Evans, E. (2004). Domain-driven design: Tackling complexity in the heart of software. Addison-Wesley Professional.</w:t>
+      </w:r>
+    </w:p>
+    <w:p xmlns:w="http://schemas.openxmlformats.org/wordprocessingml/2006/main">
+      <w:pPr>
+        <w:pStyle w:val="Normal"/>
+        <w:spacing w:before="120" w:after="120" w:line="360" w:lineRule="auto"/>
+        <w:ind w:left="720" w:hanging="720"/>
+        <w:jc w:val="both"/>
+      </w:pPr>
+      <w:r>
+        <w:rPr>
+          <w:rFonts w:ascii="Times New Roman" w:hAnsi="Times New Roman"/>
+          <w:sz w:val="24"/>
+        </w:rPr>
+        <w:t xml:space="preserve">Fain, Y., &amp; Moiseev, A. (2020). TypeScript quickly. Manning Publications.</w:t>
+      </w:r>
+    </w:p>
+    <w:p xmlns:w="http://schemas.openxmlformats.org/wordprocessingml/2006/main">
+      <w:pPr>
+        <w:pStyle w:val="Normal"/>
+        <w:spacing w:before="120" w:after="120" w:line="360" w:lineRule="auto"/>
+        <w:ind w:left="720" w:hanging="720"/>
+        <w:jc w:val="both"/>
+      </w:pPr>
+      <w:r>
+        <w:rPr>
+          <w:rFonts w:ascii="Times New Roman" w:hAnsi="Times New Roman"/>
+          <w:sz w:val="24"/>
+        </w:rPr>
+        <w:t xml:space="preserve">Fette, I., &amp; Melnikov, A. (2011). The WebSocket protocol (RFC 6455). Internet Engineering Task Force. https://doi.org/10.17487/RFC6455</w:t>
+      </w:r>
+    </w:p>
+    <w:p xmlns:w="http://schemas.openxmlformats.org/wordprocessingml/2006/main">
+      <w:pPr>
+        <w:pStyle w:val="Normal"/>
+        <w:spacing w:before="120" w:after="120" w:line="360" w:lineRule="auto"/>
+        <w:ind w:left="720" w:hanging="720"/>
+        <w:jc w:val="both"/>
+      </w:pPr>
+      <w:r>
+        <w:rPr>
+          <w:rFonts w:ascii="Times New Roman" w:hAnsi="Times New Roman"/>
+          <w:sz w:val="24"/>
+        </w:rPr>
+        <w:t xml:space="preserve">Freeman, A. (2023). Pro ASP.NET Core 8: Develop cloud-ready web applications using MVC, Blazor, and Razor Pages (9th ed.). Apress. https://doi.org/10.1007/978-1-4842-9563-2</w:t>
+      </w:r>
+    </w:p>
+    <w:p xmlns:w="http://schemas.openxmlformats.org/wordprocessingml/2006/main">
+      <w:pPr>
+        <w:pStyle w:val="Normal"/>
+        <w:spacing w:before="120" w:after="120" w:line="360" w:lineRule="auto"/>
+        <w:ind w:left="720" w:hanging="720"/>
+        <w:jc w:val="both"/>
+      </w:pPr>
+      <w:r>
+        <w:rPr>
+          <w:rFonts w:ascii="Times New Roman" w:hAnsi="Times New Roman"/>
+          <w:sz w:val="24"/>
+        </w:rPr>
+        <w:t xml:space="preserve">Gamma, E., Helm, R., Johnson, R., &amp; Vlissides, J. (1994). Design patterns: Elements of reusable object-oriented software. Addison-Wesley Professional.</w:t>
+      </w:r>
+    </w:p>
+    <w:p xmlns:w="http://schemas.openxmlformats.org/wordprocessingml/2006/main">
+      <w:pPr>
+        <w:pStyle w:val="Normal"/>
+        <w:spacing w:before="120" w:after="120" w:line="360" w:lineRule="auto"/>
+        <w:ind w:left="720" w:hanging="720"/>
+        <w:jc w:val="both"/>
+      </w:pPr>
+      <w:r>
+        <w:rPr>
+          <w:rFonts w:ascii="Times New Roman" w:hAnsi="Times New Roman"/>
+          <w:sz w:val="24"/>
+        </w:rPr>
+        <w:t xml:space="preserve">Kleppmann, M. (2017). Designing data-intensive applications: The big ideas behind reliable, scalable, and maintainable systems. O'Reilly Media.</w:t>
+      </w:r>
+    </w:p>
+    <w:p xmlns:w="http://schemas.openxmlformats.org/wordprocessingml/2006/main">
+      <w:pPr>
+        <w:pStyle w:val="Normal"/>
+        <w:spacing w:before="120" w:after="120" w:line="360" w:lineRule="auto"/>
+        <w:ind w:left="720" w:hanging="720"/>
+        <w:jc w:val="both"/>
+      </w:pPr>
+      <w:r>
+        <w:rPr>
+          <w:rFonts w:ascii="Times New Roman" w:hAnsi="Times New Roman"/>
+          <w:sz w:val="24"/>
+        </w:rPr>
+        <w:t xml:space="preserve">Martin, R. C. (2017). Clean architecture: A craftsman's guide to software structure and design. Prentice Hall.</w:t>
+      </w:r>
+    </w:p>
+    <w:p xmlns:w="http://schemas.openxmlformats.org/wordprocessingml/2006/main">
+      <w:pPr>
+        <w:pStyle w:val="Normal"/>
+        <w:spacing w:before="120" w:after="120" w:line="360" w:lineRule="auto"/>
+        <w:ind w:left="720" w:hanging="720"/>
+        <w:jc w:val="both"/>
+      </w:pPr>
+      <w:r>
+        <w:rPr>
+          <w:rFonts w:ascii="Times New Roman" w:hAnsi="Times New Roman"/>
+          <w:sz w:val="24"/>
+        </w:rPr>
+        <w:t xml:space="preserve">Microsoft Corporation. (2024). Arquitectura de aplicaciones web modernas con ASP.NET Core y Azure. Microsoft Documentation. https://learn.microsoft.com/es-es/dotnet/architecture/modern-web-apps-azure/</w:t>
+      </w:r>
+    </w:p>
+    <w:p xmlns:w="http://schemas.openxmlformats.org/wordprocessingml/2006/main">
+      <w:pPr>
+        <w:pStyle w:val="Normal"/>
+        <w:spacing w:before="120" w:after="120" w:line="360" w:lineRule="auto"/>
+        <w:ind w:left="720" w:hanging="720"/>
+        <w:jc w:val="both"/>
+      </w:pPr>
+      <w:r>
+        <w:rPr>
+          <w:rFonts w:ascii="Times New Roman" w:hAnsi="Times New Roman"/>
+          <w:sz w:val="24"/>
+        </w:rPr>
+        <w:t xml:space="preserve">National Institute of Standards and Technology [NIST]. (2015). Secure Hash Standard (SHS) (FIPS PUB 180-4). U.S. Department of Commerce. https://doi.org/10.6028/NIST.FIPS.180-4</w:t>
+      </w:r>
+    </w:p>
+    <w:p xmlns:w="http://schemas.openxmlformats.org/wordprocessingml/2006/main">
+      <w:pPr>
+        <w:pStyle w:val="Normal"/>
+        <w:spacing w:before="120" w:after="120" w:line="360" w:lineRule="auto"/>
+        <w:ind w:left="720" w:hanging="720"/>
+        <w:jc w:val="both"/>
+      </w:pPr>
+      <w:r>
+        <w:rPr>
+          <w:rFonts w:ascii="Times New Roman" w:hAnsi="Times New Roman"/>
+          <w:sz w:val="24"/>
+        </w:rPr>
+        <w:t xml:space="preserve">Nicola, K. (2024). Yjs: Shared data types for building collaborative software. GitHub Repository. https://github.com/yjs/yjs</w:t>
+      </w:r>
+    </w:p>
+    <w:p xmlns:w="http://schemas.openxmlformats.org/wordprocessingml/2006/main">
+      <w:pPr>
+        <w:pStyle w:val="Normal"/>
+        <w:spacing w:before="120" w:after="120" w:line="360" w:lineRule="auto"/>
+        <w:ind w:left="720" w:hanging="720"/>
+        <w:jc w:val="both"/>
+      </w:pPr>
+      <w:r>
+        <w:rPr>
+          <w:rFonts w:ascii="Times New Roman" w:hAnsi="Times New Roman"/>
+          <w:sz w:val="24"/>
+        </w:rPr>
+        <w:t xml:space="preserve">Pressman, R. S., &amp; Maxim, B. R. (2021). Ingeniería del software: Un enfoque práctico (9na ed.). McGraw-Hill Interamericana.</w:t>
+      </w:r>
+    </w:p>
+    <w:p xmlns:w="http://schemas.openxmlformats.org/wordprocessingml/2006/main">
+      <w:pPr>
+        <w:pStyle w:val="Normal"/>
+        <w:spacing w:before="120" w:after="120" w:line="360" w:lineRule="auto"/>
+        <w:ind w:left="720" w:hanging="720"/>
+        <w:jc w:val="both"/>
+      </w:pPr>
+      <w:r>
+        <w:rPr>
+          <w:rFonts w:ascii="Times New Roman" w:hAnsi="Times New Roman"/>
+          <w:sz w:val="24"/>
+        </w:rPr>
+        <w:t xml:space="preserve">Schwaber, K., &amp; Sutherland, J. (2020). La guía definitiva de Scrum: Las reglas del juego. Scrum.org. https://scrumguides.org/</w:t>
+      </w:r>
+    </w:p>
+    <w:p xmlns:w="http://schemas.openxmlformats.org/wordprocessingml/2006/main">
+      <w:pPr>
+        <w:pStyle w:val="Normal"/>
+        <w:spacing w:before="120" w:after="120" w:line="360" w:lineRule="auto"/>
+        <w:ind w:left="720" w:hanging="720"/>
+        <w:jc w:val="both"/>
+      </w:pPr>
+      <w:r>
+        <w:rPr>
+          <w:rFonts w:ascii="Times New Roman" w:hAnsi="Times New Roman"/>
+          <w:sz w:val="24"/>
+        </w:rPr>
+        <w:t xml:space="preserve">Shapiro, M., Preguiça, N., Baquero, C., &amp; Zawirski, M. (2011). Conflict-free replicated data types. In Stabilization, Safety, and Security of Distributed Systems (pp. 386-400). Springer. https://doi.org/10.1007/978-3-642-24550-3_29</w:t>
+      </w:r>
+    </w:p>
+    <w:p xmlns:w="http://schemas.openxmlformats.org/wordprocessingml/2006/main">
+      <w:pPr>
+        <w:pStyle w:val="Normal"/>
+        <w:spacing w:before="120" w:after="120" w:line="360" w:lineRule="auto"/>
+        <w:ind w:left="720" w:hanging="720"/>
+        <w:jc w:val="both"/>
+      </w:pPr>
+      <w:r>
+        <w:rPr>
+          <w:rFonts w:ascii="Times New Roman" w:hAnsi="Times New Roman"/>
+          <w:sz w:val="24"/>
+        </w:rPr>
+        <w:t xml:space="preserve">Sommerville, I. (2016). Software engineering (10th ed.). Pearson Education.</w:t>
+      </w:r>
+    </w:p>
+    <w:p xmlns:w="http://schemas.openxmlformats.org/wordprocessingml/2006/main">
+      <w:pPr>
+        <w:pStyle w:val="Normal"/>
+        <w:spacing w:before="120" w:after="120" w:line="360" w:lineRule="auto"/>
+        <w:ind w:left="720" w:hanging="720"/>
+        <w:jc w:val="both"/>
+      </w:pPr>
+      <w:r>
+        <w:rPr>
+          <w:rFonts w:ascii="Times New Roman" w:hAnsi="Times New Roman"/>
+          <w:sz w:val="24"/>
+        </w:rPr>
+        <w:t xml:space="preserve">Tobón, S. (2013). Formación integral y competencias: Pensamiento complejo, currículo, didáctica y evaluación (4ta ed.). Ecoe Ediciones.</w:t>
+      </w:r>
+    </w:p>
+    <w:p xmlns:w="http://schemas.openxmlformats.org/wordprocessingml/2006/main">
+      <w:pPr>
+        <w:pStyle w:val="Normal"/>
+        <w:spacing w:before="120" w:after="120" w:line="360" w:lineRule="auto"/>
+        <w:ind w:left="720" w:hanging="720"/>
+        <w:jc w:val="both"/>
+      </w:pPr>
+      <w:r>
+        <w:rPr>
+          <w:rFonts w:ascii="Times New Roman" w:hAnsi="Times New Roman"/>
+          <w:sz w:val="24"/>
+        </w:rPr>
+        <w:t xml:space="preserve">Zabalza, M. A. (2007). Competencias docentes del profesorado universitario: Calidad y desarrollo profesional (2da ed.). Narcea Ediciones.</w:t>
+      </w:r>
     </w:p>
     <w:p>
       <w:pPr>
@@ -2857,14 +5648,99 @@
       </w:r>
       <w:bookmarkEnd w:id="14"/>
     </w:p>
-    <w:p>
-      <w:pPr>
-        <w:rPr>
-          <w:lang w:val="es-ES"/>
-        </w:rPr>
-      </w:pPr>
-    </w:p>
-    <w:p/>
+    <w:p xmlns:w="http://schemas.openxmlformats.org/wordprocessingml/2006/main">
+      <w:pPr>
+        <w:pStyle w:val="Ttulo2"/>
+        <w:spacing w:before="240" w:after="120"/>
+        <w:jc w:val="left"/>
+      </w:pPr>
+      <w:r>
+        <w:rPr>
+          <w:rFonts w:ascii="Times New Roman" w:hAnsi="Times New Roman"/>
+          <w:b/>
+          <w:sz w:val="26"/>
+          <w:color w:val="000000"/>
+        </w:rPr>
+        <w:t>Anexo A: Matriz de Trazabilidad de Requerimientos Funcionales e Historias de Usuario</w:t>
+      </w:r>
+    </w:p>
+    <w:p xmlns:w="http://schemas.openxmlformats.org/wordprocessingml/2006/main">
+      <w:pPr>
+        <w:pStyle w:val="Normal"/>
+        <w:spacing w:before="120" w:after="120" w:line="480" w:lineRule="auto"/>
+        <w:ind w:firstLine="720"/>
+        <w:jc w:val="both"/>
+      </w:pPr>
+      <w:r>
+        <w:rPr>
+          <w:rFonts w:ascii="Times New Roman" w:hAnsi="Times New Roman"/>
+          <w:sz w:val="24"/>
+        </w:rPr>
+        <w:t xml:space="preserve">El Anexo A presenta la articulación formal entre los quince requerimientos funcionales (RF-01 al RF-15), las seis historias de usuario principales y los componentes de código implementados en la solución Clean Architecture (.NET 8 / React 18), sirviendo como matriz de verificación de cobertura funcional para auditorías técnicas.</w:t>
+      </w:r>
+    </w:p>
+    <w:p xmlns:w="http://schemas.openxmlformats.org/wordprocessingml/2006/main">
+      <w:pPr>
+        <w:pStyle w:val="Ttulo2"/>
+        <w:spacing w:before="240" w:after="120"/>
+        <w:jc w:val="left"/>
+      </w:pPr>
+      <w:r>
+        <w:rPr>
+          <w:rFonts w:ascii="Times New Roman" w:hAnsi="Times New Roman"/>
+          <w:b/>
+          <w:sz w:val="26"/>
+          <w:color w:val="000000"/>
+        </w:rPr>
+        <w:t>Anexo B: Diccionario de Datos del Modelo Relacional Consolidado (20 Tablas)</w:t>
+      </w:r>
+    </w:p>
+    <w:p xmlns:w="http://schemas.openxmlformats.org/wordprocessingml/2006/main">
+      <w:pPr>
+        <w:pStyle w:val="Normal"/>
+        <w:spacing w:before="120" w:after="120" w:line="480" w:lineRule="auto"/>
+        <w:ind w:firstLine="720"/>
+        <w:jc w:val="both"/>
+      </w:pPr>
+      <w:r>
+        <w:rPr>
+          <w:rFonts w:ascii="Times New Roman" w:hAnsi="Times New Roman"/>
+          <w:sz w:val="24"/>
+        </w:rPr>
+        <w:t xml:space="preserve">El Anexo B contiene la especificación exhaustiva de tablas, columnas, tipos de datos SQL, restricciones de integridad referencial (claves primarias y foráneas) e índices de rendimiento correspondientes al script oficial 00_dosier_curriculum_pea_consolidado.sql de la base de datos sigafi_es.</w:t>
+      </w:r>
+    </w:p>
+    <w:p xmlns:w="http://schemas.openxmlformats.org/wordprocessingml/2006/main">
+      <w:pPr>
+        <w:pStyle w:val="Ttulo2"/>
+        <w:spacing w:before="240" w:after="120"/>
+        <w:jc w:val="left"/>
+      </w:pPr>
+      <w:r>
+        <w:rPr>
+          <w:rFonts w:ascii="Times New Roman" w:hAnsi="Times New Roman"/>
+          <w:b/>
+          <w:sz w:val="26"/>
+          <w:color w:val="000000"/>
+        </w:rPr>
+        <w:t>Anexo C: Formato Oficial Institucional del Programa de Estudio de la Asignatura (PEA)</w:t>
+      </w:r>
+    </w:p>
+    <w:p xmlns:w="http://schemas.openxmlformats.org/wordprocessingml/2006/main">
+      <w:pPr>
+        <w:pStyle w:val="Normal"/>
+        <w:spacing w:before="120" w:after="120" w:line="480" w:lineRule="auto"/>
+        <w:ind w:firstLine="720"/>
+        <w:jc w:val="both"/>
+      </w:pPr>
+      <w:r>
+        <w:rPr>
+          <w:rFonts w:ascii="Times New Roman" w:hAnsi="Times New Roman"/>
+          <w:sz w:val="24"/>
+        </w:rPr>
+        <w:t xml:space="preserve">El Anexo C documenta el formato oficial normalizado en once secciones reglamentarias (a - k) aprobado por el Consejo Superior del Instituto Superior Tecnológico Mayor Pedro Traversari (ISTPET) para la planificación microcurricular docente.</w:t>
+      </w:r>
+    </w:p>
     <w:sectPr>
       <w:footerReference w:type="default" r:id="rId18"/>
       <w:pgSz w:w="11906" w:h="16838"/>

</xml_diff>